<commit_message>
Align covid_period to one window-dependence thesis.
Replace leftover thermal-identification figures with a count-path Figure 1
and a nested-84 versus full-132 official-day Figure 2. Stop treating
"Table 3 places..." sentences as captions so tables no longer leave blank
interiors. Keep Vancouver entries as separate hanging-indent paragraphs.
Rebuild Word/PDF with script 78. Leave live_collaborative and the parked
thermal archive untouched.

Co-authored-by: Shen Ruililin <bobshenruililin@users.noreply.github.com>
</commit_message>
<xml_diff>
--- a/manuscript/covid_period/Heat_CVD_Manuscript_covid_period.docx
+++ b/manuscript/covid_period/Heat_CVD_Manuscript_covid_period.docx
@@ -16,7 +16,7 @@
           <w:i w:val="0"/>
           <w:sz w:val="32"/>
         </w:rPr>
-        <w:t>Window dependence of first-hospitalisation counts after first CHD or HF diagnosis among people with type 2 diabetes and/or hypertension, Hong Kong, 2013–2023: official-day ratios as a ruling-out exhibit</w:t>
+        <w:t>Window dependence of first CHD and HF hospitalisation counts in Hong Kong, 2013–2023: official-day ratios as a ruling-out exhibit</w:t>
       </w:r>
     </w:p>
     <w:p>
@@ -37,18 +37,19 @@
     </w:p>
     <w:p>
       <w:pPr>
+        <w:keepNext w:val="0"/>
         <w:spacing w:after="160" w:before="0" w:line="240" w:lineRule="auto"/>
-        <w:ind w:firstLine="0"/>
-        <w:jc w:val="center"/>
+        <w:ind w:firstLine="720"/>
+        <w:jc w:val="both"/>
       </w:pPr>
       <w:r>
         <w:rPr>
           <w:rFonts w:ascii="Times New Roman" w:hAnsi="Times New Roman" w:eastAsia="Times New Roman"/>
           <w:b w:val="0"/>
           <w:i/>
-          <w:sz w:val="21"/>
+          <w:sz w:val="24"/>
         </w:rPr>
-        <w:t>Candidate article. Estimates are the parked Model 1 and nested-window checks. A confirmatory freeze has not been declared. The thesis is the analysis window, not a new thermal discovery.</w:t>
+        <w:t>Estimates are exploratory Model 1 fits and nested-window checks.</w:t>
       </w:r>
     </w:p>
     <w:p>
@@ -229,7 +230,7 @@
           <w:i w:val="0"/>
           <w:sz w:val="24"/>
         </w:rPr>
-        <w:t xml:space="preserve"> Among people with type 2 diabetes and/or hypertension in Hong Kong, the counted event is the first recorded hospitalisation after a first diagnosis of coronary heart disease (CHD) or heart failure (HF). Admission cause was not recorded. Monthly first-event counts fell by about half between 2013 and 2023. Most of that decline was already in place by 2019. 2020 was a trough. 2023 returned toward 2019, not toward 2013. Xin et al. reported fewer public hospitalisations and more cardiovascular deaths in 2020 [1]; neighbouring papers describe the trough, not the 2013–2019 path. This paper reports two objects from one extract: the path of those first-event counts, and Model 1 official-day count ratios on the full 132 months and on the nested 84 months to December 2019, carried as a ruling-out exhibit.</w:t>
+        <w:t xml:space="preserve"> We estimate whether monthly first hospitalisation counts after a first diagnosis of coronary heart disease (CHD) or heart failure (HF), among people with type 2 diabetes and/or hypertension in Hong Kong, January 2013–December 2023 (132 months), change when the same negative-binomial model is refit on the nested pre-2020 84 months inside the full 132. That is window dependence of count ratios: an overlapping-sample refit with the time spline re-knotted, not a COVID health effect, not incidence, and not a pre/post treatment effect. Official hot nights, very hot days, and cold days, reported per five additional such days in a month, are carried as a ruling-out exhibit for that dependence, not as a second thermal-cardiovascular primary. Xin et al. reported fewer public hospitalisations and more cardiovascular deaths in 2020 [1]; neighbouring papers describe the 2020 trough, not the 2013–2019 path.</w:t>
       </w:r>
     </w:p>
     <w:p>
@@ -405,7 +406,7 @@
           <w:i w:val="0"/>
           <w:sz w:val="24"/>
         </w:rPr>
-        <w:t xml:space="preserve"> First-event counts and official-day count ratios in this extract depend on the window analysed. Nested containment means that a constant thermal coefficient need not be invariant once utilisation or depletion after 2019 is present, so stability of the ratios is a weak falsifier. Official-day point estimates are not invariant: cold-day and CHD hot-night points move in opposite directions; nested-window mean temperature is not the same contrast as official day counts; and the 4-df spline absorbs both the count path and the hot-night trend. They remain part of the exposure record. The decline in first events is not a measure of physiological improvement. Estimates remain ecological monthly count ratios for a first-event outcome without recorded admission cause.</w:t>
+        <w:t xml:space="preserve"> First-event counts and official-day count ratios in this extract depend on the window analysed. Nested containment means that a constant thermal coefficient need not be invariant once utilisation or depletion after 2019 is present, so stability of the ratios is a weak falsifier. Official-day point estimates are not invariant: cold-day and CHD hot-night points move in opposite directions; nested-window mean temperature is not the same contrast as official day counts; and the 4-df spline absorbs both the count path and the hot-night trend. Official day counts remain part of the exposure record. The decline in first events is not a measure of physiological improvement. Estimates remain ecological monthly count ratios for a first-event outcome without recorded admission cause.</w:t>
       </w:r>
     </w:p>
     <w:p>
@@ -431,7 +432,7 @@
           <w:i w:val="0"/>
           <w:sz w:val="24"/>
         </w:rPr>
-        <w:t xml:space="preserve"> analysis window; first hospitalisation; coronary heart disease; heart failure; Hong Kong; cold days; hot nights</w:t>
+        <w:t xml:space="preserve"> analysis window; nested window; first hospitalisation; coronary heart disease; heart failure; Hong Kong</w:t>
       </w:r>
     </w:p>
     <w:p>
@@ -466,7 +467,24 @@
           <w:i w:val="0"/>
           <w:sz w:val="24"/>
         </w:rPr>
-        <w:t>The 2013–2023 window in Hong Kong is not a homogeneous decade for a hospital count. The counted event is the first recorded hospitalisation after a first CHD or HF diagnosis among people with type 2 diabetes and/or hypertension. Admission cause was not recorded. Annual totals about halved from 2013 to 2023, but most of that decline was already in place by 2019. 2020 was a trough on that lower base. 2023 returned toward 2019, not toward 2013. Type 2 diabetes and hypertension diagnoses still enter through 2023, so the interval is not a closed 2013 cohort; early-year counts can include first-in-window events without a specified washout. Any monthly count of those first events therefore mixes weather, care-seeking, and a shrinking set still able to contribute a first recorded stay. A thermal coefficient estimated on the whole window inherits that mixture.</w:t>
+        <w:t>We estimate whether monthly first CHD and HF hospitalisation counts among people with type 2 diabetes and/or hypertension in Hong Kong, January 2013–December 2023 (132 months), change when the same negative-binomial model—calendar-month factors, a 4-df time spline, and a days-in-month offset—is refit on the nested pre-2020 84 months inside the full 132. That is window dependence of count ratios: an overlapping-sample refit with the spline re-knotted. It is not a COVID health effect, not incidence, and not a pre/post treatment effect. Official hot nights, very hot days, and cold days, reported per five additional such days in a month, are a ruling-out exhibit for that dependence, not a second thermal-cardiovascular primary.</w:t>
+      </w:r>
+    </w:p>
+    <w:p>
+      <w:pPr>
+        <w:keepNext w:val="0"/>
+        <w:spacing w:after="160" w:before="0" w:line="240" w:lineRule="auto"/>
+        <w:ind w:firstLine="720"/>
+        <w:jc w:val="both"/>
+      </w:pPr>
+      <w:r>
+        <w:rPr>
+          <w:rFonts w:ascii="Times New Roman" w:hAnsi="Times New Roman" w:eastAsia="Times New Roman"/>
+          <w:b w:val="0"/>
+          <w:i w:val="0"/>
+          <w:sz w:val="24"/>
+        </w:rPr>
+        <w:t>The counted event is the first recorded hospitalisation after a first CHD or HF diagnosis. Admission cause was not recorded. Annual totals about halved from 2013 to 2023, but most of that decline was already in place by 2019. 2020 was a trough on that lower base. 2023 returned toward 2019, not toward 2013. Type 2 diabetes and hypertension diagnoses still enter through 2023, so the interval is not a closed 2013 cohort; early-year counts can include first-in-window events without a specified washout. Any monthly count of those first events therefore mixes weather, care-seeking, and a shrinking set still able to contribute a first recorded stay. A coefficient estimated on the whole window inherits that mixture.</w:t>
       </w:r>
     </w:p>
     <w:p>
@@ -1847,12 +1865,12 @@
         <w:tblLayout w:type="fixed"/>
       </w:tblPr>
       <w:tblGrid>
-        <w:gridCol w:w="1800"/>
-        <w:gridCol w:w="1080"/>
-        <w:gridCol w:w="648"/>
-        <w:gridCol w:w="1152"/>
-        <w:gridCol w:w="1007"/>
-        <w:gridCol w:w="3096"/>
+        <w:gridCol w:w="1728"/>
+        <w:gridCol w:w="1036"/>
+        <w:gridCol w:w="835"/>
+        <w:gridCol w:w="1123"/>
+        <w:gridCol w:w="979"/>
+        <w:gridCol w:w="3081"/>
       </w:tblGrid>
       <w:tr>
         <w:trPr>
@@ -1861,7 +1879,7 @@
         </w:trPr>
         <w:tc>
           <w:tcPr>
-            <w:tcW w:type="dxa" w:w="1800"/>
+            <w:tcW w:type="dxa" w:w="1728"/>
             <w:tcMar>
               <w:top w:w="40" w:type="dxa"/>
               <w:left w:w="55" w:type="dxa"/>
@@ -1891,7 +1909,7 @@
         </w:tc>
         <w:tc>
           <w:tcPr>
-            <w:tcW w:type="dxa" w:w="1080"/>
+            <w:tcW w:type="dxa" w:w="1037"/>
             <w:tcMar>
               <w:top w:w="40" w:type="dxa"/>
               <w:left w:w="55" w:type="dxa"/>
@@ -1921,7 +1939,7 @@
         </w:tc>
         <w:tc>
           <w:tcPr>
-            <w:tcW w:type="dxa" w:w="648"/>
+            <w:tcW w:type="dxa" w:w="835"/>
             <w:tcMar>
               <w:top w:w="40" w:type="dxa"/>
               <w:left w:w="55" w:type="dxa"/>
@@ -1951,7 +1969,7 @@
         </w:tc>
         <w:tc>
           <w:tcPr>
-            <w:tcW w:type="dxa" w:w="1152"/>
+            <w:tcW w:type="dxa" w:w="1123"/>
             <w:tcMar>
               <w:top w:w="40" w:type="dxa"/>
               <w:left w:w="55" w:type="dxa"/>
@@ -1981,7 +1999,7 @@
         </w:tc>
         <w:tc>
           <w:tcPr>
-            <w:tcW w:type="dxa" w:w="1008"/>
+            <w:tcW w:type="dxa" w:w="979"/>
             <w:tcMar>
               <w:top w:w="40" w:type="dxa"/>
               <w:left w:w="55" w:type="dxa"/>
@@ -2011,7 +2029,7 @@
         </w:tc>
         <w:tc>
           <w:tcPr>
-            <w:tcW w:type="dxa" w:w="3096"/>
+            <w:tcW w:type="dxa" w:w="3082"/>
             <w:tcMar>
               <w:top w:w="40" w:type="dxa"/>
               <w:left w:w="55" w:type="dxa"/>
@@ -2046,7 +2064,7 @@
         </w:trPr>
         <w:tc>
           <w:tcPr>
-            <w:tcW w:type="dxa" w:w="1800"/>
+            <w:tcW w:type="dxa" w:w="1728"/>
             <w:tcMar>
               <w:top w:w="40" w:type="dxa"/>
               <w:left w:w="55" w:type="dxa"/>
@@ -2076,7 +2094,7 @@
         </w:tc>
         <w:tc>
           <w:tcPr>
-            <w:tcW w:type="dxa" w:w="1080"/>
+            <w:tcW w:type="dxa" w:w="1037"/>
             <w:tcMar>
               <w:top w:w="40" w:type="dxa"/>
               <w:left w:w="55" w:type="dxa"/>
@@ -2106,7 +2124,7 @@
         </w:tc>
         <w:tc>
           <w:tcPr>
-            <w:tcW w:type="dxa" w:w="648"/>
+            <w:tcW w:type="dxa" w:w="835"/>
             <w:tcMar>
               <w:top w:w="40" w:type="dxa"/>
               <w:left w:w="55" w:type="dxa"/>
@@ -2136,7 +2154,7 @@
         </w:tc>
         <w:tc>
           <w:tcPr>
-            <w:tcW w:type="dxa" w:w="1152"/>
+            <w:tcW w:type="dxa" w:w="1123"/>
             <w:tcMar>
               <w:top w:w="40" w:type="dxa"/>
               <w:left w:w="55" w:type="dxa"/>
@@ -2166,7 +2184,7 @@
         </w:tc>
         <w:tc>
           <w:tcPr>
-            <w:tcW w:type="dxa" w:w="1008"/>
+            <w:tcW w:type="dxa" w:w="979"/>
             <w:tcMar>
               <w:top w:w="40" w:type="dxa"/>
               <w:left w:w="55" w:type="dxa"/>
@@ -2196,7 +2214,7 @@
         </w:tc>
         <w:tc>
           <w:tcPr>
-            <w:tcW w:type="dxa" w:w="3096"/>
+            <w:tcW w:type="dxa" w:w="3082"/>
             <w:tcMar>
               <w:top w:w="40" w:type="dxa"/>
               <w:left w:w="55" w:type="dxa"/>
@@ -2231,7 +2249,7 @@
         </w:trPr>
         <w:tc>
           <w:tcPr>
-            <w:tcW w:type="dxa" w:w="1800"/>
+            <w:tcW w:type="dxa" w:w="1728"/>
             <w:tcMar>
               <w:top w:w="40" w:type="dxa"/>
               <w:left w:w="55" w:type="dxa"/>
@@ -2261,7 +2279,7 @@
         </w:tc>
         <w:tc>
           <w:tcPr>
-            <w:tcW w:type="dxa" w:w="1080"/>
+            <w:tcW w:type="dxa" w:w="1037"/>
             <w:tcMar>
               <w:top w:w="40" w:type="dxa"/>
               <w:left w:w="55" w:type="dxa"/>
@@ -2291,7 +2309,7 @@
         </w:tc>
         <w:tc>
           <w:tcPr>
-            <w:tcW w:type="dxa" w:w="648"/>
+            <w:tcW w:type="dxa" w:w="835"/>
             <w:tcMar>
               <w:top w:w="40" w:type="dxa"/>
               <w:left w:w="55" w:type="dxa"/>
@@ -2321,7 +2339,7 @@
         </w:tc>
         <w:tc>
           <w:tcPr>
-            <w:tcW w:type="dxa" w:w="1152"/>
+            <w:tcW w:type="dxa" w:w="1123"/>
             <w:tcMar>
               <w:top w:w="40" w:type="dxa"/>
               <w:left w:w="55" w:type="dxa"/>
@@ -2351,7 +2369,7 @@
         </w:tc>
         <w:tc>
           <w:tcPr>
-            <w:tcW w:type="dxa" w:w="1008"/>
+            <w:tcW w:type="dxa" w:w="979"/>
             <w:tcMar>
               <w:top w:w="40" w:type="dxa"/>
               <w:left w:w="55" w:type="dxa"/>
@@ -2381,7 +2399,7 @@
         </w:tc>
         <w:tc>
           <w:tcPr>
-            <w:tcW w:type="dxa" w:w="3096"/>
+            <w:tcW w:type="dxa" w:w="3082"/>
             <w:tcMar>
               <w:top w:w="40" w:type="dxa"/>
               <w:left w:w="55" w:type="dxa"/>
@@ -2440,7 +2458,7 @@
           <w:i w:val="0"/>
           <w:sz w:val="24"/>
         </w:rPr>
-        <w:t>Annual totals were highest in 2013 (CHD 23,830; HF 4,336), already near half by 2019 (CHD 12,396; HF 2,344), lowest in 2020 (CHD 10,237; HF 1,964), and in 2023 had returned toward 2019 (CHD 12,323; HF 2,296). Over the same years, the interpolated Census and Statistics Department population aged 35 years or older rose by 17%. That series is not the type 2 diabetes or hypertension group still at risk of a first event, and Figure 1 is not an incidence series. Figure 1 indexes both hospital series and the general-population series to 2013. The decline in first-event counts is not a measure of physiological improvement. It does not quantify depletion without monthly still-at-risk person-time. Mean monthly HF counts were highest in January (287) and lowest in September (196). CHD showed a milder winter elevation (January 1,386; September 1,097). After calendar-month indicators, the thermal estimates ask whether a given January or July differs from a typical January or July. They do not ask whether winter counts exceed summer counts.</w:t>
+        <w:t>Annual totals were highest in 2013 (CHD 23,830; HF 4,336), already near half by 2019 (CHD 12,396; HF 2,344), lowest in 2020 (CHD 10,237; HF 1,964), and in 2023 had returned toward 2019 (CHD 12,323; HF 2,296). Over the same years, the interpolated Census and Statistics Department population aged 35 years or older rose by 17%. That series is not the type 2 diabetes or hypertension group still at risk of a first event, and Figure 1 is not an incidence series. Figure 1 is the count-path object. The decline in first-event counts is not a measure of physiological improvement. It does not quantify depletion without monthly still-at-risk person-time. Mean monthly HF counts were highest in January (287) and lowest in September (196). CHD showed a milder winter elevation (January 1,386; September 1,097). After calendar-month indicators, the official-day estimates ask whether a given January or July differs from a typical January or July. They do not ask whether winter counts exceed summer counts.</w:t>
       </w:r>
     </w:p>
     <w:p>
@@ -2458,7 +2476,7 @@
           <w:i/>
           <w:sz w:val="22"/>
         </w:rPr>
-        <w:t>Figure 1. First-event counts fell while the general population aged 35 years or older rose. Index = 1 in 2013. CHD 23,830 (2013) → 12,396 (2019) → 10,237 (2020) → 12,323 (2023); HF 4,336 → 2,344 → 1,964 → 2,296. Source: governed Hospital Authority aggregate annual totals; Census and Statistics Department mid-year population aged 35 years or older. The Census series is not the still-at-risk set. The figure does not measure consecutive hot or cold spells, and it is not a physiological series.</w:t>
+        <w:t>Figure 1. First-event counts fell while the general population aged 35 years or older rose. Index years 2013, 2019, 2020, and 2023. CHD 23,830 (2013) → 12,396 (2019) → 10,237 (2020) → 12,323 (2023); HF 4,336 → 2,344 → 1,964 → 2,296. The dashed line marks the nested 84-month window. Source: governed Hospital Authority aggregate annual totals; Census and Statistics Department mid-year population aged 35 years or older. The Census series is not the still-at-risk set. The figure is the count-path object. It is not incidence, not a physiological series, and not a consecutive hot- or cold-spell display.</w:t>
       </w:r>
     </w:p>
     <w:p>
@@ -2471,7 +2489,7 @@
       <w:r>
         <w:drawing>
           <wp:inline xmlns:a="http://schemas.openxmlformats.org/drawingml/2006/main" xmlns:pic="http://schemas.openxmlformats.org/drawingml/2006/picture">
-            <wp:extent cx="3925229" cy="4023359"/>
+            <wp:extent cx="5577840" cy="4531995"/>
             <wp:docPr id="1" name="Picture 1"/>
             <wp:cNvGraphicFramePr>
               <a:graphicFrameLocks noChangeAspect="1"/>
@@ -2480,7 +2498,7 @@
               <a:graphicData uri="http://schemas.openxmlformats.org/drawingml/2006/picture">
                 <pic:pic>
                   <pic:nvPicPr>
-                    <pic:cNvPr id="0" name="figure_B_first_event_depletion.png"/>
+                    <pic:cNvPr id="0" name="figure_1_count_path.png"/>
                     <pic:cNvPicPr/>
                   </pic:nvPicPr>
                   <pic:blipFill>
@@ -2492,102 +2510,7 @@
                   <pic:spPr>
                     <a:xfrm>
                       <a:off x="0" y="0"/>
-                      <a:ext cx="3925229" cy="4023359"/>
-                    </a:xfrm>
-                    <a:prstGeom prst="rect"/>
-                  </pic:spPr>
-                </pic:pic>
-              </a:graphicData>
-            </a:graphic>
-          </wp:inline>
-        </w:drawing>
-      </w:r>
-    </w:p>
-    <w:p>
-      <w:pPr>
-        <w:keepNext/>
-        <w:keepLines/>
-        <w:spacing w:after="120" w:before="160" w:line="240" w:lineRule="auto"/>
-        <w:ind w:firstLine="0"/>
-        <w:jc w:val="left"/>
-      </w:pPr>
-      <w:r>
-        <w:rPr>
-          <w:rFonts w:ascii="Times New Roman" w:hAnsi="Times New Roman" w:eastAsia="Times New Roman"/>
-          <w:b/>
-          <w:i w:val="0"/>
-          <w:sz w:val="24"/>
-        </w:rPr>
-        <w:t>Exposure context</w:t>
-      </w:r>
-    </w:p>
-    <w:p>
-      <w:pPr>
-        <w:keepNext w:val="0"/>
-        <w:spacing w:after="160" w:before="0" w:line="240" w:lineRule="auto"/>
-        <w:ind w:firstLine="720"/>
-        <w:jc w:val="both"/>
-      </w:pPr>
-      <w:r>
-        <w:rPr>
-          <w:rFonts w:ascii="Times New Roman" w:hAnsi="Times New Roman" w:eastAsia="Times New Roman"/>
-          <w:b w:val="0"/>
-          <w:i w:val="0"/>
-          <w:sz w:val="24"/>
-        </w:rPr>
-        <w:t>At HKO Headquarters, hot nights rose from 10 in 2013 to 61 in 2021 and 56 in 2023 [12]. The 2013 count was about seven days below the 1981–2010 normal [10]. The 2021 count was the highest annual number of hot nights in the Observatory record at that time [11]. Very hot days rose from 17 to 54 over the same 2013–2021 comparison, and were 54 in 2023 [12]. Cold days were 14 in 2013 and 14 in 2023, with 1 in 2019 and 13 in 2021 [12]. These are exposure counts, and not health effects. Mean official hot nights were 2.7 per month in 2013–2019 and 4.5 per month in 2020–2022. Figure 2 shows official cold days by year and month. Of 145 cold days in 2013–2023, 141 fell in December–February (December 40, January 54, February 47), and 4 fell in March. Twenty-nine of 132 months carried at least one official cold day. The year 2019 contributed a single cold day. After calendar-month indicators, the remaining cold-day variation is between-year winter variation, and not a summer-versus-winter contrast.</w:t>
-      </w:r>
-    </w:p>
-    <w:p>
-      <w:pPr>
-        <w:keepNext/>
-        <w:keepLines/>
-        <w:spacing w:after="120" w:before="0" w:line="240" w:lineRule="auto"/>
-        <w:ind w:firstLine="0"/>
-        <w:jc w:val="left"/>
-      </w:pPr>
-      <w:r>
-        <w:rPr>
-          <w:rFonts w:ascii="Times New Roman" w:hAnsi="Times New Roman" w:eastAsia="Times New Roman"/>
-          <w:b w:val="0"/>
-          <w:i/>
-          <w:sz w:val="22"/>
-        </w:rPr>
-        <w:t>Figure 2. Official cold days by year and month, Hong Kong Observatory Headquarters, 2013–2023. Source: Hong Kong Observatory official daily cold-day flags (Tmin ≤ 12 °C), aggregated to calendar months. Identification is between winters, not a consecutive-duration spell, and not a physiological mechanism.</w:t>
-      </w:r>
-    </w:p>
-    <w:p>
-      <w:pPr>
-        <w:keepLines/>
-        <w:spacing w:after="160" w:before="0" w:line="240" w:lineRule="auto"/>
-        <w:ind w:firstLine="0"/>
-        <w:jc w:val="center"/>
-      </w:pPr>
-      <w:r>
-        <w:drawing>
-          <wp:inline xmlns:a="http://schemas.openxmlformats.org/drawingml/2006/main" xmlns:pic="http://schemas.openxmlformats.org/drawingml/2006/picture">
-            <wp:extent cx="5549462" cy="4023360"/>
-            <wp:docPr id="2" name="Picture 2"/>
-            <wp:cNvGraphicFramePr>
-              <a:graphicFrameLocks noChangeAspect="1"/>
-            </wp:cNvGraphicFramePr>
-            <a:graphic>
-              <a:graphicData uri="http://schemas.openxmlformats.org/drawingml/2006/picture">
-                <pic:pic>
-                  <pic:nvPicPr>
-                    <pic:cNvPr id="0" name="figure_A_cold_day_identification.png"/>
-                    <pic:cNvPicPr/>
-                  </pic:nvPicPr>
-                  <pic:blipFill>
-                    <a:blip r:embed="rId12"/>
-                    <a:stretch>
-                      <a:fillRect/>
-                    </a:stretch>
-                  </pic:blipFill>
-                  <pic:spPr>
-                    <a:xfrm>
-                      <a:off x="0" y="0"/>
-                      <a:ext cx="5549462" cy="4023360"/>
+                      <a:ext cx="5577840" cy="4531995"/>
                     </a:xfrm>
                     <a:prstGeom prst="rect"/>
                   </pic:spPr>
@@ -2618,6 +2541,40 @@
     </w:p>
     <w:p>
       <w:pPr>
+        <w:keepNext w:val="0"/>
+        <w:spacing w:after="160" w:before="0" w:line="240" w:lineRule="auto"/>
+        <w:ind w:firstLine="720"/>
+        <w:jc w:val="both"/>
+      </w:pPr>
+      <w:r>
+        <w:rPr>
+          <w:rFonts w:ascii="Times New Roman" w:hAnsi="Times New Roman" w:eastAsia="Times New Roman"/>
+          <w:b w:val="0"/>
+          <w:i w:val="0"/>
+          <w:sz w:val="24"/>
+        </w:rPr>
+        <w:t>Table 2 reports the official-day Model 1 count ratios, per five additional such days in the month, for the full 132 months and for the nested 84 months. The 84 months are contained in the 132. The nested specification is an overlapping-sample refit: calendar-month factors and the 4-df spline are re-estimated, and spline knots follow the subset. The two columns are not independent periods, and their difference is not a fitted pre/post effect. Interval overlap between the two columns is not a test of a window difference, and discordance of whether 1 is excluded is not such a test. Figure 1 is the count-path object. Figure 2 is the ruling-out exhibit: the same six official-day ratios on those two windows.</w:t>
+      </w:r>
+    </w:p>
+    <w:p>
+      <w:pPr>
+        <w:keepNext w:val="0"/>
+        <w:spacing w:after="160" w:before="0" w:line="240" w:lineRule="auto"/>
+        <w:ind w:firstLine="720"/>
+        <w:jc w:val="both"/>
+      </w:pPr>
+      <w:r>
+        <w:rPr>
+          <w:rFonts w:ascii="Times New Roman" w:hAnsi="Times New Roman" w:eastAsia="Times New Roman"/>
+          <w:b w:val="0"/>
+          <w:i w:val="0"/>
+          <w:sz w:val="24"/>
+        </w:rPr>
+        <w:t>Mean official hot nights were 2.7 per month in 2013–2019 and 4.5 per month in 2020–2022. Of 145 official cold days in 2013–2023, 141 fell in December–February (December 40, January 54, February 47), and 4 fell in March. Twenty-nine of 132 months carried at least one official cold day. After calendar-month indicators, the remaining cold-day variation is between-year winter variation, not a summer-versus-winter contrast, and not a consecutive-duration spell.</w:t>
+      </w:r>
+    </w:p>
+    <w:p>
+      <w:pPr>
         <w:keepNext/>
         <w:keepLines/>
         <w:spacing w:after="120" w:before="0" w:line="240" w:lineRule="auto"/>
@@ -2631,7 +2588,49 @@
           <w:i/>
           <w:sz w:val="22"/>
         </w:rPr>
-        <w:t>Table 2 reports the official-day Model 1 count ratios, per five additional such days in the month, for the full 132 months and for the nested 84 months. The 84 months are contained in the 132. The nested specification is an overlapping-sample refit: calendar-month factors and the 4-df spline are re-estimated, and spline knots follow the subset. The two columns are not independent periods, and their difference is not a fitted pre/post effect. Interval overlap between the two columns is not a test of a window difference, and discordance of whether 1 is excluded is not such a test. Figure 3 is the ruling-out exhibit for official-day encodings across trend-spline checks, the nested 84-month overlapping refit, and a full-sample COVID-phase intercept adjustment. Figure 1 is the count-path object.</w:t>
+        <w:t>Figure 2. Official-day Model 1 count ratios on the nested 84 months and on the full 132 months (Newey–West lag-6 intervals). Each estimate is the count ratio per five additional official days in the month. The nested 84 months (January 2013–December 2019) are contained in the 132; the 4-df time spline is re-knotted on the subset. This is an overlapping-sample refit, not a pre/post effect. Colour marks the analysis window, not whether an interval excludes 1. Trend-spline and COVID-phase intercept checks are labelled in the text; they are not a second thermal primary.</w:t>
+      </w:r>
+    </w:p>
+    <w:p>
+      <w:pPr>
+        <w:keepLines/>
+        <w:spacing w:after="160" w:before="0" w:line="240" w:lineRule="auto"/>
+        <w:ind w:firstLine="0"/>
+        <w:jc w:val="center"/>
+      </w:pPr>
+      <w:r>
+        <w:drawing>
+          <wp:inline xmlns:a="http://schemas.openxmlformats.org/drawingml/2006/main" xmlns:pic="http://schemas.openxmlformats.org/drawingml/2006/picture">
+            <wp:extent cx="5577840" cy="5799183"/>
+            <wp:docPr id="2" name="Picture 2"/>
+            <wp:cNvGraphicFramePr>
+              <a:graphicFrameLocks noChangeAspect="1"/>
+            </wp:cNvGraphicFramePr>
+            <a:graphic>
+              <a:graphicData uri="http://schemas.openxmlformats.org/drawingml/2006/picture">
+                <pic:pic>
+                  <pic:nvPicPr>
+                    <pic:cNvPr id="0" name="figure_2_nested_vs_full.png"/>
+                    <pic:cNvPicPr/>
+                  </pic:nvPicPr>
+                  <pic:blipFill>
+                    <a:blip r:embed="rId12"/>
+                    <a:stretch>
+                      <a:fillRect/>
+                    </a:stretch>
+                  </pic:blipFill>
+                  <pic:spPr>
+                    <a:xfrm>
+                      <a:off x="0" y="0"/>
+                      <a:ext cx="5577840" cy="5799183"/>
+                    </a:xfrm>
+                    <a:prstGeom prst="rect"/>
+                  </pic:spPr>
+                </pic:pic>
+              </a:graphicData>
+            </a:graphic>
+          </wp:inline>
+        </w:drawing>
       </w:r>
     </w:p>
     <w:p>
@@ -2671,7 +2670,7 @@
     </w:p>
     <w:p>
       <w:pPr>
-        <w:keepNext/>
+        <w:keepNext w:val="0"/>
         <w:spacing w:after="160" w:before="0" w:line="240" w:lineRule="auto"/>
         <w:ind w:firstLine="720"/>
         <w:jc w:val="both"/>
@@ -2683,7 +2682,7 @@
           <w:i w:val="0"/>
           <w:sz w:val="24"/>
         </w:rPr>
-        <w:t>The exhibit that can be read from Table 2 and Table 3 is that official-day point estimates are not invariant to the window, that cold-day and CHD hot-night points move in opposite directions, and that nested-window mean temperature is not the same contrast as official day counts. That is not a formal test of a window difference. Attenuation of the HF cold-day point toward 1 is predicted if utilisation falls after month 84 while a thermal coefficient is constant, so that movement is not a disproof of weather. Nested containment means that stability of the ratios is a weak falsifier. The 4-df spline absorbs the first-event count path and the hot-night trend. They remain part of the exposure record.</w:t>
+        <w:t>The exhibit that can be read from Table 2, Figure 2, and Table 3 is that official-day point estimates are not invariant to the window, that cold-day and CHD hot-night points move in opposite directions, and that nested-window mean temperature is not the same contrast as official day counts. That is not a formal test of a window difference. Attenuation of the HF cold-day point toward 1 is predicted if utilisation falls after month 84 while a thermal coefficient is constant, so that movement is not a disproof of weather. Nested containment means that stability of the ratios is a weak falsifier. The 4-df spline absorbs the first-event count path and the hot-night trend. Official day counts remain part of the exposure record.</w:t>
       </w:r>
     </w:p>
     <w:p>
@@ -2694,7 +2693,6 @@
         <w:ind w:firstLine="0"/>
         <w:jc w:val="left"/>
       </w:pPr>
-      <w:commentRangeStart w:id="7"/>
       <w:r>
         <w:rPr>
           <w:rFonts w:ascii="Times New Roman" w:hAnsi="Times New Roman" w:eastAsia="Times New Roman"/>
@@ -2703,13 +2701,6 @@
           <w:sz w:val="22"/>
         </w:rPr>
         <w:t>Table 2. Official-day count ratios in the full 132-month window and in the nested 84-month overlapping refit (Newey–West lag-6 display). Each estimate is the Model 1 count ratio per five additional official days in the month. The nested 84 months are contained in the 132; the columns are not a period contrast. Benjamini–Hochberg q-values apply to the twelve full-window Newey–West lag-6 Wald p values only.</w:t>
-      </w:r>
-      <w:commentRangeEnd w:id="7"/>
-      <w:r>
-        <w:rPr>
-          <w:rStyle w:val="CommentReference"/>
-        </w:rPr>
-        <w:commentReference w:id="7"/>
       </w:r>
     </w:p>
     <w:tbl>
@@ -3622,76 +3613,33 @@
       <w:pPr>
         <w:keepNext/>
         <w:keepLines/>
-        <w:spacing w:after="120" w:before="0" w:line="240" w:lineRule="auto"/>
+        <w:spacing w:after="120" w:before="160" w:line="240" w:lineRule="auto"/>
         <w:ind w:firstLine="0"/>
         <w:jc w:val="left"/>
       </w:pPr>
       <w:r>
         <w:rPr>
           <w:rFonts w:ascii="Times New Roman" w:hAnsi="Times New Roman" w:eastAsia="Times New Roman"/>
-          <w:b w:val="0"/>
-          <w:i/>
-          <w:sz w:val="22"/>
+          <w:b/>
+          <w:i w:val="0"/>
+          <w:sz w:val="24"/>
         </w:rPr>
-        <w:t>Figure 3. Model 1 count ratios for official day counts across time-trend spline checks, the nested 84-month overlapping refit, and a full-sample COVID-phase intercept adjustment (Newey–West lag-6 intervals). The exposure is the monthly official day count divided by five, so each estimate is the count ratio per five additional such days in that month. Rows labelled 3, 6, or 8 df replace the 4-df time-trend spline of Model 1. Neither the five-day scale nor the spline degrees of freedom refers to consecutive days. The nested 84 months (January 2013–December 2019) are an overlapping-sample refit, not a period contrast. The COVID-phase row is a full-sample intercept adjustment, not a third window. Continuous-temperature fits for the same specifications are a labelled check, not a physiology panel.</w:t>
+        <w:t>Encoding contrast</w:t>
       </w:r>
     </w:p>
     <w:p>
       <w:pPr>
-        <w:keepLines/>
+        <w:keepNext w:val="0"/>
         <w:spacing w:after="160" w:before="0" w:line="240" w:lineRule="auto"/>
-        <w:ind w:firstLine="0"/>
-        <w:jc w:val="center"/>
-      </w:pPr>
-      <w:r>
-        <w:drawing>
-          <wp:inline xmlns:a="http://schemas.openxmlformats.org/drawingml/2006/main" xmlns:pic="http://schemas.openxmlformats.org/drawingml/2006/picture">
-            <wp:extent cx="3239588" cy="3840479"/>
-            <wp:docPr id="3" name="Picture 3"/>
-            <wp:cNvGraphicFramePr>
-              <a:graphicFrameLocks noChangeAspect="1"/>
-            </wp:cNvGraphicFramePr>
-            <a:graphic>
-              <a:graphicData uri="http://schemas.openxmlformats.org/drawingml/2006/picture">
-                <pic:pic>
-                  <pic:nvPicPr>
-                    <pic:cNvPr id="0" name="figure_3_ruling_out_exhibit.png"/>
-                    <pic:cNvPicPr/>
-                  </pic:nvPicPr>
-                  <pic:blipFill>
-                    <a:blip r:embed="rId13"/>
-                    <a:stretch>
-                      <a:fillRect/>
-                    </a:stretch>
-                  </pic:blipFill>
-                  <pic:spPr>
-                    <a:xfrm>
-                      <a:off x="0" y="0"/>
-                      <a:ext cx="3239588" cy="3840479"/>
-                    </a:xfrm>
-                    <a:prstGeom prst="rect"/>
-                  </pic:spPr>
-                </pic:pic>
-              </a:graphicData>
-            </a:graphic>
-          </wp:inline>
-        </w:drawing>
-      </w:r>
-    </w:p>
-    <w:p>
-      <w:pPr>
-        <w:keepNext/>
-        <w:keepLines/>
-        <w:spacing w:after="120" w:before="0" w:line="240" w:lineRule="auto"/>
-        <w:ind w:firstLine="0"/>
-        <w:jc w:val="left"/>
+        <w:ind w:firstLine="720"/>
+        <w:jc w:val="both"/>
       </w:pPr>
       <w:r>
         <w:rPr>
           <w:rFonts w:ascii="Times New Roman" w:hAnsi="Times New Roman" w:eastAsia="Times New Roman"/>
           <w:b w:val="0"/>
-          <w:i/>
-          <w:sz w:val="22"/>
+          <w:i w:val="0"/>
+          <w:sz w:val="24"/>
         </w:rPr>
         <w:t>Table 3 places mean temperature beside the official-day headlines in the same two windows. In the nested window, mean temperature was inversely associated with both outcomes (CHD 0.980, 0.970–0.990; HF 0.945, 0.927–0.963). In the same 84 months, official cold days were positively associated with both outcomes, and official hot nights were compatible with 1 for CHD and inverse for HF. COVID-phase intercept adjustments on the full sample moved mean temperature to 0.989 (0.975–1.003) for CHD and 0.967 (0.944–0.991) for HF. Continuous monthly temperature and official day counts are therefore not interchangeable encodings of the same contrast. All six continuous-temperature contrasts were inverse in the nested window. No multiplicity control was computed within that window. No nested-window estimate is promoted beyond a labelled specification.</w:t>
       </w:r>
@@ -4845,7 +4793,7 @@
           <w:i w:val="0"/>
           <w:sz w:val="24"/>
         </w:rPr>
-        <w:t>Across trend-spline checks, the nested overlapping refit, and the full-sample COVID-phase intercept adjustment, the CHD hot-night point estimate ranged from 1.011 to 1.025, and the HF cold-day point estimate from 1.043 to 1.113 (Figure 3). That range of points is not robustness of exclusion of 1: under an 8-df spline, year indicators, or dropping the first 12 or 24 months, the displayed lag-6 interval for HF cold days includes 1. No trend specification is preferred over the 4-df spline in Model 1. The months with largest Cook’s distance were February 2020 for CHD and February 2022 for HF cold days. Excluding the most influential month left both exploratory directions unchanged (CHD hot nights 1.021 (1.001–1.040); HF cold days 1.088 (1.034–1.144)). Lag-one month is a labelled sensitivity. It is not a daily lag curve.</w:t>
+        <w:t>Across trend-spline checks, the nested overlapping refit, and the full-sample COVID-phase intercept adjustment, the CHD hot-night point estimate ranged from 1.011 to 1.025, and the HF cold-day point estimate from 1.043 to 1.113. That range of points is not robustness of exclusion of 1: under an 8-df spline, year indicators, or dropping the first 12 or 24 months, the displayed lag-6 interval for HF cold days includes 1. No trend specification is preferred over the 4-df spline in Model 1. The months with largest Cook’s distance were February 2020 for CHD and February 2022 for HF cold days. Excluding the most influential month left both exploratory directions unchanged (CHD hot nights 1.021 (1.001–1.040); HF cold days 1.088 (1.034–1.144)). Lag-one month is a labelled sensitivity. It is not a daily lag curve.</w:t>
       </w:r>
     </w:p>
     <w:p>
@@ -4863,7 +4811,24 @@
           <w:i w:val="0"/>
           <w:sz w:val="24"/>
         </w:rPr>
-        <w:t>Twelve-fit thermal exhibit</w:t>
+        <w:t>Full-window twelve-fit panel</w:t>
+      </w:r>
+    </w:p>
+    <w:p>
+      <w:pPr>
+        <w:keepNext w:val="0"/>
+        <w:spacing w:after="160" w:before="0" w:line="240" w:lineRule="auto"/>
+        <w:ind w:firstLine="720"/>
+        <w:jc w:val="both"/>
+      </w:pPr>
+      <w:r>
+        <w:rPr>
+          <w:rFonts w:ascii="Times New Roman" w:hAnsi="Times New Roman" w:eastAsia="Times New Roman"/>
+          <w:b w:val="0"/>
+          <w:i w:val="0"/>
+          <w:sz w:val="24"/>
+        </w:rPr>
+        <w:t>Table 4 reports the twelve separate-exposure count ratios under the offset for the number of days in the month and Newey–West lag-6 intervals. It is the full-window panel, not a second thermal primary.</w:t>
       </w:r>
     </w:p>
     <w:p>
@@ -4881,25 +4846,7 @@
           <w:i/>
           <w:sz w:val="22"/>
         </w:rPr>
-        <w:t>Table 4 reports the twelve separate-exposure count ratios under the offset for the number of days in the month and Newey–West lag-6 intervals. It is the thermal exhibit, not the headline of this article.</w:t>
-      </w:r>
-    </w:p>
-    <w:p>
-      <w:pPr>
-        <w:keepNext/>
-        <w:keepLines/>
-        <w:spacing w:after="120" w:before="0" w:line="240" w:lineRule="auto"/>
-        <w:ind w:firstLine="0"/>
-        <w:jc w:val="left"/>
-      </w:pPr>
-      <w:r>
-        <w:rPr>
-          <w:rFonts w:ascii="Times New Roman" w:hAnsi="Times New Roman" w:eastAsia="Times New Roman"/>
-          <w:b w:val="0"/>
-          <w:i/>
-          <w:sz w:val="22"/>
-        </w:rPr>
-        <w:t>Table 4. Model 1 thermal exhibit on the full 132-month window (days-in-month offset; Newey–West lag-6 intervals). Benjamini–Hochberg q is p.adjust of the twelve Newey–West lag-6 Wald p values, not model-based p.</w:t>
+        <w:t>Table 4. Model 1 twelve-fit panel on the full 132-month window (days-in-month offset; Newey–West lag-6 intervals). Benjamini–Hochberg q is p.adjust of the twelve Newey–West lag-6 Wald p values, not model-based p.</w:t>
       </w:r>
     </w:p>
     <w:tbl>
@@ -7840,7 +7787,7 @@
           <w:i w:val="0"/>
           <w:sz w:val="24"/>
         </w:rPr>
-        <w:t xml:space="preserve"> Official hot nights were more frequent in the same years in which care-seeking changed (2.7 per month in 2013–2019; 4.5 per month in 2020–2022). The CHD hot-night residual needs those later years. The same 4-df spline that absorbs the first-event decline also absorbs the hot-night trend. That is an identification problem, not evidence that hot nights caused the count drop. Official cold days remain a winter-to-winter contrast (141 of 145 days in December–February; 29 of 132 months carry any). Nested containment means that a constant thermal coefficient need not be invariant once utilisation or depletion after 2019 is present, so stability of the ratios is a weak falsifier. Official-day point estimates moved with the window, in opposite directions for cold days and for CHD hot nights, and nested-window mean temperature is not the same contrast as official day counts. They remain part of the exposure record. Continuous mean temperature in the nested window is inverse for both outcomes and is not a substitute for the official-day encoding (Table 3).</w:t>
+        <w:t xml:space="preserve"> Official hot nights were more frequent in the same years in which care-seeking changed (2.7 per month in 2013–2019; 4.5 per month in 2020–2022). The CHD hot-night residual needs those later years. The same 4-df spline that absorbs the first-event decline also absorbs the hot-night trend. That is an identification problem, not evidence that hot nights caused the count drop. Official cold days remain a winter-to-winter contrast (141 of 145 days in December–February; 29 of 132 months carry any). Nested containment means that a constant thermal coefficient need not be invariant once utilisation or depletion after 2019 is present, so stability of the ratios is a weak falsifier. Official-day point estimates moved with the window, in opposite directions for cold days and for CHD hot nights, and nested-window mean temperature is not the same contrast as official day counts. Official day counts remain part of the exposure record. Continuous mean temperature in the nested window is inverse for both outcomes and is not a substitute for the official-day encoding (Table 3).</w:t>
       </w:r>
     </w:p>
     <w:p>
@@ -7901,7 +7848,7 @@
           <w:i w:val="0"/>
           <w:sz w:val="24"/>
         </w:rPr>
-        <w:t xml:space="preserve"> The analysis window is treated as part of the estimand rather than as a nuisance to be averaged through. Official-day ratios are shown for both the full window and the nested 84-month specification. Mean temperature is placed beside those ratios in the same windows (Table 3). All twelve full-window Model 1 fits are reported. Uncertainty is shown as a four-construction ladder. Figure 1 displays the first-event count path. Figure 3 is the ruling-out exhibit for official-day encodings.</w:t>
+        <w:t xml:space="preserve"> The analysis window is treated as part of the estimand rather than as a nuisance to be averaged through. Official-day ratios are shown for both the full window and the nested 84-month specification. Mean temperature is placed beside those ratios in the same windows (Table 3). All twelve full-window Model 1 fits are reported. Uncertainty is shown as a four-construction ladder. Figure 1 displays the first-event count path. Figure 2 is the ruling-out exhibit for official-day encodings on those two windows.</w:t>
       </w:r>
     </w:p>
     <w:p>
@@ -7962,7 +7909,7 @@
           <w:i w:val="0"/>
           <w:sz w:val="24"/>
         </w:rPr>
-        <w:t>In this 2013–2023 first-event extract, monthly CHD and HF counts fell. Official-day count-ratio point estimates moved with the window, in opposite directions for cold days and for CHD hot nights. Nested containment means that a constant thermal coefficient need not be invariant once utilisation or depletion after 2019 is present, so stability of the ratios is a weak falsifier. Nested-window mean temperature is not the same contrast as official day counts, and the 4-df spline absorbs both the count path and the hot-night trend. They remain part of the exposure record. The data do not show that health recovered after 2020, and they do not support a multiplicity-protected differential thermal claim. What the file supports is a window-dependent count ratio for a first hospitalisation after a first diagnosis, without admission cause and without person-time.</w:t>
+        <w:t>Monthly first CHD and HF hospitalisation counts among people with type 2 diabetes and/or hypertension in Hong Kong, January 2013–December 2023 (132 months), depend on the analysis window. The same negative-binomial model—calendar-month factors, a 4-df time spline, and a days-in-month offset—is refit on the nested pre-2020 84 months inside the full 132. That nested specification is an overlapping-sample refit with the spline re-knotted. It is not a COVID health effect, not incidence, and not a pre/post treatment effect. Official hot nights, very hot days, and cold days, reported per five additional such days in a month, are a ruling-out exhibit for that dependence, not a second thermal-cardiovascular primary. Official-day point estimates moved with the window, in opposite directions for cold days and for CHD hot nights. Nested containment means that a constant thermal coefficient need not be invariant once utilisation or depletion after 2019 is present, so stability of the ratios is a weak falsifier. Nested-window mean temperature is not the same contrast as official day counts, and the 4-df spline absorbs both the count path and the hot-night trend. Official day counts remain part of the exposure record. The data do not show that health recovered after 2020, and they do not support a multiplicity-protected differential thermal claim. What the file supports is a window-dependent count ratio for a first hospitalisation after a first diagnosis, without admission cause and without person-time.</w:t>
       </w:r>
     </w:p>
     <w:p>
@@ -8102,7 +8049,7 @@
           <w:i w:val="0"/>
           <w:sz w:val="24"/>
         </w:rPr>
-        <w:t>Code is at https://github.com/bobshenruililin/Laidlaw-Heat-Project. Monthly hospital counts are not posted. What may be shared later depends on ethics approval. This file is a candidate article on the COVID-period track. It does not overwrite the parked thermal manuscript.</w:t>
+        <w:t>Code is at https://github.com/bobshenruililin/Laidlaw-Heat-Project. Monthly hospital counts are not posted. What may be shared later depends on ethics approval.</w:t>
       </w:r>
     </w:p>
     <w:p>
@@ -8125,7 +8072,9 @@
     </w:p>
     <w:p>
       <w:pPr>
-        <w:spacing w:after="60" w:before="0" w:line="240" w:lineRule="auto"/>
+        <w:keepNext w:val="0"/>
+        <w:keepLines/>
+        <w:spacing w:after="40" w:before="0" w:line="240" w:lineRule="auto"/>
         <w:ind w:left="425" w:hanging="425"/>
         <w:jc w:val="left"/>
       </w:pPr>
@@ -8154,7 +8103,25 @@
           <w:i w:val="0"/>
           <w:sz w:val="22"/>
         </w:rPr>
-        <w:t xml:space="preserve">. 2022;21:100645. doi:10.1016/j.lanwpc.2022.100645 2. Wai AKC, Wong CKH, Wong JYH, et al. Changes in emergency department visits, diagnostic groups, and 28-day mortality associated with the COVID-19 pandemic. </w:t>
+        <w:t>. 2022;21:100645. doi:10.1016/j.lanwpc.2022.100645</w:t>
+      </w:r>
+    </w:p>
+    <w:p>
+      <w:pPr>
+        <w:keepNext w:val="0"/>
+        <w:keepLines/>
+        <w:spacing w:after="40" w:before="0" w:line="240" w:lineRule="auto"/>
+        <w:ind w:left="425" w:hanging="425"/>
+        <w:jc w:val="left"/>
+      </w:pPr>
+      <w:r>
+        <w:rPr>
+          <w:rFonts w:ascii="Times New Roman" w:hAnsi="Times New Roman" w:eastAsia="Times New Roman"/>
+          <w:b w:val="0"/>
+          <w:i w:val="0"/>
+          <w:sz w:val="22"/>
+        </w:rPr>
+        <w:t xml:space="preserve">2. Wai AKC, Wong CKH, Wong JYH, et al. Changes in emergency department visits, diagnostic groups, and 28-day mortality associated with the COVID-19 pandemic. </w:t>
       </w:r>
       <w:r>
         <w:rPr>
@@ -8172,7 +8139,25 @@
           <w:i w:val="0"/>
           <w:sz w:val="22"/>
         </w:rPr>
-        <w:t xml:space="preserve">. 2022;79(2):148-157. doi:10.1016/j.annemergmed.2021.09.424 3. Wai AKC, Yip TF, Wong YH, et al. The effect of the COVID-19 pandemic on non–COVID-19 deaths: a cohort study. </w:t>
+        <w:t>. 2022;79(2):148-157. doi:10.1016/j.annemergmed.2021.09.424</w:t>
+      </w:r>
+    </w:p>
+    <w:p>
+      <w:pPr>
+        <w:keepNext w:val="0"/>
+        <w:keepLines/>
+        <w:spacing w:after="40" w:before="0" w:line="240" w:lineRule="auto"/>
+        <w:ind w:left="425" w:hanging="425"/>
+        <w:jc w:val="left"/>
+      </w:pPr>
+      <w:r>
+        <w:rPr>
+          <w:rFonts w:ascii="Times New Roman" w:hAnsi="Times New Roman" w:eastAsia="Times New Roman"/>
+          <w:b w:val="0"/>
+          <w:i w:val="0"/>
+          <w:sz w:val="22"/>
+        </w:rPr>
+        <w:t xml:space="preserve">3. Wai AKC, Yip TF, Wong YH, et al. The effect of the COVID-19 pandemic on non–COVID-19 deaths: a cohort study. </w:t>
       </w:r>
       <w:r>
         <w:rPr>
@@ -8190,7 +8175,25 @@
           <w:i w:val="0"/>
           <w:sz w:val="22"/>
         </w:rPr>
-        <w:t xml:space="preserve">. 2024;10:e41792. doi:10.2196/41792 4. Hung KK, Walline JH, Chan EYY, et al. Health service utilization in Hong Kong during the COVID-19 pandemic: a cross-sectional public survey. </w:t>
+        <w:t>. 2024;10:e41792. doi:10.2196/41792</w:t>
+      </w:r>
+    </w:p>
+    <w:p>
+      <w:pPr>
+        <w:keepNext w:val="0"/>
+        <w:keepLines/>
+        <w:spacing w:after="40" w:before="0" w:line="240" w:lineRule="auto"/>
+        <w:ind w:left="425" w:hanging="425"/>
+        <w:jc w:val="left"/>
+      </w:pPr>
+      <w:r>
+        <w:rPr>
+          <w:rFonts w:ascii="Times New Roman" w:hAnsi="Times New Roman" w:eastAsia="Times New Roman"/>
+          <w:b w:val="0"/>
+          <w:i w:val="0"/>
+          <w:sz w:val="22"/>
+        </w:rPr>
+        <w:t xml:space="preserve">4. Hung KK, Walline JH, Chan EYY, et al. Health service utilization in Hong Kong during the COVID-19 pandemic: a cross-sectional public survey. </w:t>
       </w:r>
       <w:r>
         <w:rPr>
@@ -8208,7 +8211,25 @@
           <w:i w:val="0"/>
           <w:sz w:val="22"/>
         </w:rPr>
-        <w:t xml:space="preserve">. 2022;11(4):508-513. doi:10.34172/ijhpm.2020.183 5. Tam CCF, Cheung KS, Lam S, et al. Impact of coronavirus disease 2019 (COVID-19) outbreak on ST-segment–elevation myocardial infarction care in Hong Kong, China. </w:t>
+        <w:t>. 2022;11(4):508-513. doi:10.34172/ijhpm.2020.183</w:t>
+      </w:r>
+    </w:p>
+    <w:p>
+      <w:pPr>
+        <w:keepNext w:val="0"/>
+        <w:keepLines/>
+        <w:spacing w:after="40" w:before="0" w:line="240" w:lineRule="auto"/>
+        <w:ind w:left="425" w:hanging="425"/>
+        <w:jc w:val="left"/>
+      </w:pPr>
+      <w:r>
+        <w:rPr>
+          <w:rFonts w:ascii="Times New Roman" w:hAnsi="Times New Roman" w:eastAsia="Times New Roman"/>
+          <w:b w:val="0"/>
+          <w:i w:val="0"/>
+          <w:sz w:val="22"/>
+        </w:rPr>
+        <w:t xml:space="preserve">5. Tam CCF, Cheung KS, Lam S, et al. Impact of coronavirus disease 2019 (COVID-19) outbreak on ST-segment–elevation myocardial infarction care in Hong Kong, China. </w:t>
       </w:r>
       <w:r>
         <w:rPr>
@@ -8226,7 +8247,25 @@
           <w:i w:val="0"/>
           <w:sz w:val="22"/>
         </w:rPr>
-        <w:t xml:space="preserve">. 2020;13(4):e006631. doi:10.1161/CIRCOUTCOMES.120.006631 6. Tam CCF, Cheung KS, Lam S, et al. Impact of coronavirus disease 2019 (COVID-19) outbreak on outcome of myocardial infarction in Hong Kong, China. </w:t>
+        <w:t>. 2020;13(4):e006631. doi:10.1161/CIRCOUTCOMES.120.006631</w:t>
+      </w:r>
+    </w:p>
+    <w:p>
+      <w:pPr>
+        <w:keepNext w:val="0"/>
+        <w:keepLines/>
+        <w:spacing w:after="40" w:before="0" w:line="240" w:lineRule="auto"/>
+        <w:ind w:left="425" w:hanging="425"/>
+        <w:jc w:val="left"/>
+      </w:pPr>
+      <w:r>
+        <w:rPr>
+          <w:rFonts w:ascii="Times New Roman" w:hAnsi="Times New Roman" w:eastAsia="Times New Roman"/>
+          <w:b w:val="0"/>
+          <w:i w:val="0"/>
+          <w:sz w:val="22"/>
+        </w:rPr>
+        <w:t xml:space="preserve">6. Tam CCF, Cheung KS, Lam S, et al. Impact of coronavirus disease 2019 (COVID-19) outbreak on outcome of myocardial infarction in Hong Kong, China. </w:t>
       </w:r>
       <w:r>
         <w:rPr>
@@ -8244,7 +8283,25 @@
           <w:i w:val="0"/>
           <w:sz w:val="22"/>
         </w:rPr>
-        <w:t xml:space="preserve">. 2021;97(2):E194-E197. doi:10.1002/ccd.28943 7. Goggins WB, Chan EYY, Yang CY. Weather, pollution, and acute myocardial infarction in Hong Kong and Taiwan. </w:t>
+        <w:t>. 2021;97(2):E194-E197. doi:10.1002/ccd.28943</w:t>
+      </w:r>
+    </w:p>
+    <w:p>
+      <w:pPr>
+        <w:keepNext w:val="0"/>
+        <w:keepLines/>
+        <w:spacing w:after="40" w:before="0" w:line="240" w:lineRule="auto"/>
+        <w:ind w:left="425" w:hanging="425"/>
+        <w:jc w:val="left"/>
+      </w:pPr>
+      <w:r>
+        <w:rPr>
+          <w:rFonts w:ascii="Times New Roman" w:hAnsi="Times New Roman" w:eastAsia="Times New Roman"/>
+          <w:b w:val="0"/>
+          <w:i w:val="0"/>
+          <w:sz w:val="22"/>
+        </w:rPr>
+        <w:t xml:space="preserve">7. Goggins WB, Chan EYY, Yang CY. Weather, pollution, and acute myocardial infarction in Hong Kong and Taiwan. </w:t>
       </w:r>
       <w:r>
         <w:rPr>
@@ -8262,7 +8319,25 @@
           <w:i w:val="0"/>
           <w:sz w:val="22"/>
         </w:rPr>
-        <w:t xml:space="preserve">. 2013;168(1):243-249. doi:10.1016/j.ijcard.2012.09.087 8. Goggins WB, Chan EYY. A study of the short-term associations between hospital admissions and mortality from heart failure and meteorological variables in Hong Kong. </w:t>
+        <w:t>. 2013;168(1):243-249. doi:10.1016/j.ijcard.2012.09.087</w:t>
+      </w:r>
+    </w:p>
+    <w:p>
+      <w:pPr>
+        <w:keepNext w:val="0"/>
+        <w:keepLines/>
+        <w:spacing w:after="40" w:before="0" w:line="240" w:lineRule="auto"/>
+        <w:ind w:left="425" w:hanging="425"/>
+        <w:jc w:val="left"/>
+      </w:pPr>
+      <w:r>
+        <w:rPr>
+          <w:rFonts w:ascii="Times New Roman" w:hAnsi="Times New Roman" w:eastAsia="Times New Roman"/>
+          <w:b w:val="0"/>
+          <w:i w:val="0"/>
+          <w:sz w:val="22"/>
+        </w:rPr>
+        <w:t xml:space="preserve">8. Goggins WB, Chan EYY. A study of the short-term associations between hospital admissions and mortality from heart failure and meteorological variables in Hong Kong. </w:t>
       </w:r>
       <w:r>
         <w:rPr>
@@ -8280,7 +8355,25 @@
           <w:i w:val="0"/>
           <w:sz w:val="22"/>
         </w:rPr>
-        <w:t xml:space="preserve">. 2017;228:537-542. doi:10.1016/j.ijcard.2016.11.106 9. Guo YT, Chan KH, Qiu H, Wong ELY, Ho KF. The risk of hospitalization associated with hot nights and excess nighttime heat in a subtropical metropolis: a time-series study in Hong Kong, 2000–2019. </w:t>
+        <w:t>. 2017;228:537-542. doi:10.1016/j.ijcard.2016.11.106</w:t>
+      </w:r>
+    </w:p>
+    <w:p>
+      <w:pPr>
+        <w:keepNext w:val="0"/>
+        <w:keepLines/>
+        <w:spacing w:after="40" w:before="0" w:line="240" w:lineRule="auto"/>
+        <w:ind w:left="425" w:hanging="425"/>
+        <w:jc w:val="left"/>
+      </w:pPr>
+      <w:r>
+        <w:rPr>
+          <w:rFonts w:ascii="Times New Roman" w:hAnsi="Times New Roman" w:eastAsia="Times New Roman"/>
+          <w:b w:val="0"/>
+          <w:i w:val="0"/>
+          <w:sz w:val="22"/>
+        </w:rPr>
+        <w:t xml:space="preserve">9. Guo YT, Chan KH, Qiu H, Wong ELY, Ho KF. The risk of hospitalization associated with hot nights and excess nighttime heat in a subtropical metropolis: a time-series study in Hong Kong, 2000–2019. </w:t>
       </w:r>
       <w:r>
         <w:rPr>
@@ -8298,7 +8391,97 @@
           <w:i w:val="0"/>
           <w:sz w:val="22"/>
         </w:rPr>
-        <w:t xml:space="preserve">. 2024;51:101168. doi:10.1016/j.lanwpc.2024.101168 10. Hong Kong Observatory. The Year's Weather — 2013. https://www.hko.gov.hk/en/wxinfo/pastwx/ywx2013.htm 11. Hong Kong Observatory. The Year's Weather — 2021. https://www.hko.gov.hk/en/wxinfo/pastwx/2021/ywx2021.htm 12. Hong Kong Observatory. Hong Kong Observatory Open Data. https://www.hko.gov.hk/en/abouthko/opendata_intro.htm 13. Environmental Protection Department. Environmental Protection Interactive Centre: Air Quality Data. https://cd.epic.epd.gov.hk/EPICDI/air/station/?lang=en 14. Greenland S, Morgenstern H. Ecological bias, confounding, and effect modification. </w:t>
+        <w:t>. 2024;51:101168. doi:10.1016/j.lanwpc.2024.101168</w:t>
+      </w:r>
+    </w:p>
+    <w:p>
+      <w:pPr>
+        <w:keepNext w:val="0"/>
+        <w:keepLines/>
+        <w:spacing w:after="40" w:before="0" w:line="240" w:lineRule="auto"/>
+        <w:ind w:left="425" w:hanging="425"/>
+        <w:jc w:val="left"/>
+      </w:pPr>
+      <w:r>
+        <w:rPr>
+          <w:rFonts w:ascii="Times New Roman" w:hAnsi="Times New Roman" w:eastAsia="Times New Roman"/>
+          <w:b w:val="0"/>
+          <w:i w:val="0"/>
+          <w:sz w:val="22"/>
+        </w:rPr>
+        <w:t>10. Hong Kong Observatory. The Year's Weather — 2013. https://www.hko.gov.hk/en/wxinfo/pastwx/ywx2013.htm</w:t>
+      </w:r>
+    </w:p>
+    <w:p>
+      <w:pPr>
+        <w:keepNext w:val="0"/>
+        <w:keepLines/>
+        <w:spacing w:after="40" w:before="0" w:line="240" w:lineRule="auto"/>
+        <w:ind w:left="425" w:hanging="425"/>
+        <w:jc w:val="left"/>
+      </w:pPr>
+      <w:r>
+        <w:rPr>
+          <w:rFonts w:ascii="Times New Roman" w:hAnsi="Times New Roman" w:eastAsia="Times New Roman"/>
+          <w:b w:val="0"/>
+          <w:i w:val="0"/>
+          <w:sz w:val="22"/>
+        </w:rPr>
+        <w:t>11. Hong Kong Observatory. The Year's Weather — 2021. https://www.hko.gov.hk/en/wxinfo/pastwx/2021/ywx2021.htm</w:t>
+      </w:r>
+    </w:p>
+    <w:p>
+      <w:pPr>
+        <w:keepNext w:val="0"/>
+        <w:keepLines/>
+        <w:spacing w:after="40" w:before="0" w:line="240" w:lineRule="auto"/>
+        <w:ind w:left="425" w:hanging="425"/>
+        <w:jc w:val="left"/>
+      </w:pPr>
+      <w:r>
+        <w:rPr>
+          <w:rFonts w:ascii="Times New Roman" w:hAnsi="Times New Roman" w:eastAsia="Times New Roman"/>
+          <w:b w:val="0"/>
+          <w:i w:val="0"/>
+          <w:sz w:val="22"/>
+        </w:rPr>
+        <w:t>12. Hong Kong Observatory. Hong Kong Observatory Open Data. https://www.hko.gov.hk/en/abouthko/opendata_intro.htm</w:t>
+      </w:r>
+    </w:p>
+    <w:p>
+      <w:pPr>
+        <w:keepNext w:val="0"/>
+        <w:keepLines/>
+        <w:spacing w:after="40" w:before="0" w:line="240" w:lineRule="auto"/>
+        <w:ind w:left="425" w:hanging="425"/>
+        <w:jc w:val="left"/>
+      </w:pPr>
+      <w:r>
+        <w:rPr>
+          <w:rFonts w:ascii="Times New Roman" w:hAnsi="Times New Roman" w:eastAsia="Times New Roman"/>
+          <w:b w:val="0"/>
+          <w:i w:val="0"/>
+          <w:sz w:val="22"/>
+        </w:rPr>
+        <w:t>13. Environmental Protection Department. Environmental Protection Interactive Centre: Air Quality Data. https://cd.epic.epd.gov.hk/EPICDI/air/station/?lang=en</w:t>
+      </w:r>
+    </w:p>
+    <w:p>
+      <w:pPr>
+        <w:keepNext w:val="0"/>
+        <w:keepLines/>
+        <w:spacing w:after="40" w:before="0" w:line="240" w:lineRule="auto"/>
+        <w:ind w:left="425" w:hanging="425"/>
+        <w:jc w:val="left"/>
+      </w:pPr>
+      <w:r>
+        <w:rPr>
+          <w:rFonts w:ascii="Times New Roman" w:hAnsi="Times New Roman" w:eastAsia="Times New Roman"/>
+          <w:b w:val="0"/>
+          <w:i w:val="0"/>
+          <w:sz w:val="22"/>
+        </w:rPr>
+        <w:t xml:space="preserve">14. Greenland S, Morgenstern H. Ecological bias, confounding, and effect modification. </w:t>
       </w:r>
       <w:r>
         <w:rPr>
@@ -8316,7 +8499,43 @@
           <w:i w:val="0"/>
           <w:sz w:val="22"/>
         </w:rPr>
-        <w:t xml:space="preserve">. 1989;18(1):269-274. doi:10.1093/ije/18.1.269 15. Census and Statistics Department. Population by Sex and Age Group (Table 110-01001). https://data.gov.hk/en-data/dataset/hk-censtatd-tablechart-110-01001 16. Bhaskaran K, Gasparrini A, Hajat S, Smeeth L, Armstrong B. Time series regression studies in environmental epidemiology. </w:t>
+        <w:t>. 1989;18(1):269-274. doi:10.1093/ije/18.1.269</w:t>
+      </w:r>
+    </w:p>
+    <w:p>
+      <w:pPr>
+        <w:keepNext w:val="0"/>
+        <w:keepLines/>
+        <w:spacing w:after="40" w:before="0" w:line="240" w:lineRule="auto"/>
+        <w:ind w:left="425" w:hanging="425"/>
+        <w:jc w:val="left"/>
+      </w:pPr>
+      <w:r>
+        <w:rPr>
+          <w:rFonts w:ascii="Times New Roman" w:hAnsi="Times New Roman" w:eastAsia="Times New Roman"/>
+          <w:b w:val="0"/>
+          <w:i w:val="0"/>
+          <w:sz w:val="22"/>
+        </w:rPr>
+        <w:t>15. Census and Statistics Department. Population by Sex and Age Group (Table 110-01001). https://data.gov.hk/en-data/dataset/hk-censtatd-tablechart-110-01001</w:t>
+      </w:r>
+    </w:p>
+    <w:p>
+      <w:pPr>
+        <w:keepNext w:val="0"/>
+        <w:keepLines/>
+        <w:spacing w:after="40" w:before="0" w:line="240" w:lineRule="auto"/>
+        <w:ind w:left="425" w:hanging="425"/>
+        <w:jc w:val="left"/>
+      </w:pPr>
+      <w:r>
+        <w:rPr>
+          <w:rFonts w:ascii="Times New Roman" w:hAnsi="Times New Roman" w:eastAsia="Times New Roman"/>
+          <w:b w:val="0"/>
+          <w:i w:val="0"/>
+          <w:sz w:val="22"/>
+        </w:rPr>
+        <w:t xml:space="preserve">16. Bhaskaran K, Gasparrini A, Hajat S, Smeeth L, Armstrong B. Time series regression studies in environmental epidemiology. </w:t>
       </w:r>
       <w:r>
         <w:rPr>
@@ -8334,7 +8553,25 @@
           <w:i w:val="0"/>
           <w:sz w:val="22"/>
         </w:rPr>
-        <w:t xml:space="preserve">. 2013;42(4):1187-1195. doi:10.1093/ije/dyt092 17. Newey WK, West KD. A simple, positive semi-definite, heteroskedasticity and autocorrelation consistent covariance matrix. </w:t>
+        <w:t>. 2013;42(4):1187-1195. doi:10.1093/ije/dyt092</w:t>
+      </w:r>
+    </w:p>
+    <w:p>
+      <w:pPr>
+        <w:keepNext w:val="0"/>
+        <w:keepLines/>
+        <w:spacing w:after="40" w:before="0" w:line="240" w:lineRule="auto"/>
+        <w:ind w:left="425" w:hanging="425"/>
+        <w:jc w:val="left"/>
+      </w:pPr>
+      <w:r>
+        <w:rPr>
+          <w:rFonts w:ascii="Times New Roman" w:hAnsi="Times New Roman" w:eastAsia="Times New Roman"/>
+          <w:b w:val="0"/>
+          <w:i w:val="0"/>
+          <w:sz w:val="22"/>
+        </w:rPr>
+        <w:t xml:space="preserve">17. Newey WK, West KD. A simple, positive semi-definite, heteroskedasticity and autocorrelation consistent covariance matrix. </w:t>
       </w:r>
       <w:r>
         <w:rPr>
@@ -8352,7 +8589,25 @@
           <w:i w:val="0"/>
           <w:sz w:val="22"/>
         </w:rPr>
-        <w:t xml:space="preserve">. 1987;55(3):703-708. doi:10.2307/1913610 18. Benjamini Y, Hochberg Y. Controlling the false discovery rate: a practical and powerful approach to multiple testing. </w:t>
+        <w:t>. 1987;55(3):703-708. doi:10.2307/1913610</w:t>
+      </w:r>
+    </w:p>
+    <w:p>
+      <w:pPr>
+        <w:keepNext w:val="0"/>
+        <w:keepLines/>
+        <w:spacing w:after="40" w:before="0" w:line="240" w:lineRule="auto"/>
+        <w:ind w:left="425" w:hanging="425"/>
+        <w:jc w:val="left"/>
+      </w:pPr>
+      <w:r>
+        <w:rPr>
+          <w:rFonts w:ascii="Times New Roman" w:hAnsi="Times New Roman" w:eastAsia="Times New Roman"/>
+          <w:b w:val="0"/>
+          <w:i w:val="0"/>
+          <w:sz w:val="22"/>
+        </w:rPr>
+        <w:t xml:space="preserve">18. Benjamini Y, Hochberg Y. Controlling the false discovery rate: a practical and powerful approach to multiple testing. </w:t>
       </w:r>
       <w:r>
         <w:rPr>
@@ -8370,7 +8625,25 @@
           <w:i w:val="0"/>
           <w:sz w:val="22"/>
         </w:rPr>
-        <w:t xml:space="preserve">. 1995;57(1):289-300. doi:10.1111/j.2517-6161.1995.tb02031.x 19. Chan EYY, Goggins WB, Yue JSK, Lee P. Hospital admissions as a function of temperature, other weather phenomena and pollution levels in an urban setting in China. </w:t>
+        <w:t>. 1995;57(1):289-300. doi:10.1111/j.2517-6161.1995.tb02031.x</w:t>
+      </w:r>
+    </w:p>
+    <w:p>
+      <w:pPr>
+        <w:keepNext/>
+        <w:keepLines/>
+        <w:spacing w:after="40" w:before="0" w:line="240" w:lineRule="auto"/>
+        <w:ind w:left="425" w:hanging="425"/>
+        <w:jc w:val="left"/>
+      </w:pPr>
+      <w:r>
+        <w:rPr>
+          <w:rFonts w:ascii="Times New Roman" w:hAnsi="Times New Roman" w:eastAsia="Times New Roman"/>
+          <w:b w:val="0"/>
+          <w:i w:val="0"/>
+          <w:sz w:val="22"/>
+        </w:rPr>
+        <w:t xml:space="preserve">19. Chan EYY, Goggins WB, Yue JSK, Lee P. Hospital admissions as a function of temperature, other weather phenomena and pollution levels in an urban setting in China. </w:t>
       </w:r>
       <w:r>
         <w:rPr>
@@ -8388,7 +8661,25 @@
           <w:i w:val="0"/>
           <w:sz w:val="22"/>
         </w:rPr>
-        <w:t xml:space="preserve">. 2013;91(8):576-584. doi:10.2471/BLT.12.113035 20. Basagaña X, Ballester J. Unbiased temperature-related mortality estimates using weekly and monthly health data: a new method for environmental epidemiology and climate impact studies. </w:t>
+        <w:t>. 2013;91(8):576-584. doi:10.2471/BLT.12.113035</w:t>
+      </w:r>
+    </w:p>
+    <w:p>
+      <w:pPr>
+        <w:keepNext/>
+        <w:keepLines/>
+        <w:spacing w:after="40" w:before="0" w:line="240" w:lineRule="auto"/>
+        <w:ind w:left="425" w:hanging="425"/>
+        <w:jc w:val="left"/>
+      </w:pPr>
+      <w:r>
+        <w:rPr>
+          <w:rFonts w:ascii="Times New Roman" w:hAnsi="Times New Roman" w:eastAsia="Times New Roman"/>
+          <w:b w:val="0"/>
+          <w:i w:val="0"/>
+          <w:sz w:val="22"/>
+        </w:rPr>
+        <w:t xml:space="preserve">20. Basagaña X, Ballester J. Unbiased temperature-related mortality estimates using weekly and monthly health data: a new method for environmental epidemiology and climate impact studies. </w:t>
       </w:r>
       <w:r>
         <w:rPr>
@@ -8406,7 +8697,25 @@
           <w:i w:val="0"/>
           <w:sz w:val="22"/>
         </w:rPr>
-        <w:t xml:space="preserve">. 2024;8(10):e766-e777. doi:10.1016/S2542-5196(24)00212-2 21. Basagaña X, Ballester J. Unbiased estimates using temporally aggregated outcome data in time series analysis: generalization to different outcomes, exposures, and types of aggregation. </w:t>
+        <w:t>. 2024;8(10):e766-e777. doi:10.1016/S2542-5196(24)00212-2</w:t>
+      </w:r>
+    </w:p>
+    <w:p>
+      <w:pPr>
+        <w:keepNext/>
+        <w:keepLines/>
+        <w:spacing w:after="40" w:before="0" w:line="240" w:lineRule="auto"/>
+        <w:ind w:left="425" w:hanging="425"/>
+        <w:jc w:val="left"/>
+      </w:pPr>
+      <w:r>
+        <w:rPr>
+          <w:rFonts w:ascii="Times New Roman" w:hAnsi="Times New Roman" w:eastAsia="Times New Roman"/>
+          <w:b w:val="0"/>
+          <w:i w:val="0"/>
+          <w:sz w:val="22"/>
+        </w:rPr>
+        <w:t xml:space="preserve">21. Basagaña X, Ballester J. Unbiased estimates using temporally aggregated outcome data in time series analysis: generalization to different outcomes, exposures, and types of aggregation. </w:t>
       </w:r>
       <w:r>
         <w:rPr>
@@ -8424,7 +8733,25 @@
           <w:i w:val="0"/>
           <w:sz w:val="22"/>
         </w:rPr>
-        <w:t xml:space="preserve">. 2026;37(1):16-20. doi:10.1097/EDE.0000000000001923 22. Liu J, Hansen A, Varghese B, et al. Cause-specific mortality attributable to cold and hot ambient temperatures in Hong Kong: a time-series study, 2006–2016. </w:t>
+        <w:t>. 2026;37(1):16-20. doi:10.1097/EDE.0000000000001923</w:t>
+      </w:r>
+    </w:p>
+    <w:p>
+      <w:pPr>
+        <w:keepNext/>
+        <w:keepLines/>
+        <w:spacing w:after="40" w:before="0" w:line="240" w:lineRule="auto"/>
+        <w:ind w:left="425" w:hanging="425"/>
+        <w:jc w:val="left"/>
+      </w:pPr>
+      <w:r>
+        <w:rPr>
+          <w:rFonts w:ascii="Times New Roman" w:hAnsi="Times New Roman" w:eastAsia="Times New Roman"/>
+          <w:b w:val="0"/>
+          <w:i w:val="0"/>
+          <w:sz w:val="22"/>
+        </w:rPr>
+        <w:t xml:space="preserve">22. Liu J, Hansen A, Varghese B, et al. Cause-specific mortality attributable to cold and hot ambient temperatures in Hong Kong: a time-series study, 2006–2016. </w:t>
       </w:r>
       <w:r>
         <w:rPr>
@@ -8442,7 +8769,25 @@
           <w:i w:val="0"/>
           <w:sz w:val="22"/>
         </w:rPr>
-        <w:t>. 2020;57:102131. doi:10.1016/j.scs.2020.102131 23. Liu Z, Ren C, Liu J, Kawasaki Y, Bishai DM. Modelling the excess mortality associated with heat waves in Hong Kong: 2014–2023. medRxiv. 2026. doi:10.64898/2026.03.05.26347683</w:t>
+        <w:t>. 2020;57:102131. doi:10.1016/j.scs.2020.102131</w:t>
+      </w:r>
+    </w:p>
+    <w:p>
+      <w:pPr>
+        <w:keepNext w:val="0"/>
+        <w:keepLines/>
+        <w:spacing w:after="40" w:before="0" w:line="240" w:lineRule="auto"/>
+        <w:ind w:left="425" w:hanging="425"/>
+        <w:jc w:val="left"/>
+      </w:pPr>
+      <w:r>
+        <w:rPr>
+          <w:rFonts w:ascii="Times New Roman" w:hAnsi="Times New Roman" w:eastAsia="Times New Roman"/>
+          <w:b w:val="0"/>
+          <w:i w:val="0"/>
+          <w:sz w:val="22"/>
+        </w:rPr>
+        <w:t>23. Liu Z, Ren C, Liu J, Kawasaki Y, Bishai DM. Modelling the excess mortality associated with heat waves in Hong Kong: 2014–2023. medRxiv. 2026. doi:10.64898/2026.03.05.26347683</w:t>
       </w:r>
     </w:p>
     <w:sectPr>
@@ -8458,7 +8803,7 @@
 
 <file path=word/comments.xml><?xml version="1.0" encoding="utf-8"?>
 <w:comments xmlns:a="http://schemas.openxmlformats.org/drawingml/2006/main" xmlns:pic="http://schemas.openxmlformats.org/drawingml/2006/picture" xmlns:r="http://schemas.openxmlformats.org/officeDocument/2006/relationships" xmlns:w="http://schemas.openxmlformats.org/wordprocessingml/2006/main" xmlns:wp="http://schemas.openxmlformats.org/drawingml/2006/wordprocessingDrawing" xmlns:mc="http://schemas.openxmlformats.org/markup-compatibility/2006" xmlns:a14="http://schemas.microsoft.com/office/drawing/2010/main" xmlns:w14="http://schemas.microsoft.com/office/word/2010/wordml" xmlns:wpc="http://schemas.microsoft.com/office/word/2010/wordprocessingCanvas">
-  <w:comment w:id="0" w:author="Bob Shen" w:initials="BS" w:date="2026-09-13T07:05:25Z">
+  <w:comment w:id="0" w:author="Bob Shen" w:initials="BS" w:date="2026-09-13T11:45:40Z">
     <w:p>
       <w:pPr>
         <w:pStyle w:val="CommentText"/>
@@ -8474,7 +8819,7 @@
       </w:r>
     </w:p>
   </w:comment>
-  <w:comment w:id="1" w:author="Bob Shen" w:initials="BS" w:date="2026-09-13T07:05:25Z">
+  <w:comment w:id="1" w:author="Bob Shen" w:initials="BS" w:date="2026-09-13T11:45:40Z">
     <w:p>
       <w:pPr>
         <w:pStyle w:val="CommentText"/>
@@ -8490,7 +8835,7 @@
       </w:r>
     </w:p>
   </w:comment>
-  <w:comment w:id="2" w:author="Bob Shen" w:initials="BS" w:date="2026-09-13T07:05:25Z">
+  <w:comment w:id="2" w:author="Bob Shen" w:initials="BS" w:date="2026-09-13T11:45:40Z">
     <w:p>
       <w:pPr>
         <w:pStyle w:val="CommentText"/>
@@ -8506,7 +8851,7 @@
       </w:r>
     </w:p>
   </w:comment>
-  <w:comment w:id="3" w:author="Bob Shen" w:initials="BS" w:date="2026-09-13T07:05:25Z">
+  <w:comment w:id="3" w:author="Bob Shen" w:initials="BS" w:date="2026-09-13T11:45:40Z">
     <w:p>
       <w:pPr>
         <w:pStyle w:val="CommentText"/>
@@ -8522,7 +8867,7 @@
       </w:r>
     </w:p>
   </w:comment>
-  <w:comment w:id="4" w:author="Bob Shen" w:initials="BS" w:date="2026-09-13T07:05:25Z">
+  <w:comment w:id="4" w:author="Bob Shen" w:initials="BS" w:date="2026-09-13T11:45:40Z">
     <w:p>
       <w:pPr>
         <w:pStyle w:val="CommentText"/>
@@ -8538,7 +8883,7 @@
       </w:r>
     </w:p>
   </w:comment>
-  <w:comment w:id="5" w:author="Bob Shen" w:initials="BS" w:date="2026-09-13T07:05:25Z">
+  <w:comment w:id="5" w:author="Bob Shen" w:initials="BS" w:date="2026-09-13T11:45:40Z">
     <w:p>
       <w:pPr>
         <w:pStyle w:val="CommentText"/>
@@ -8554,7 +8899,7 @@
       </w:r>
     </w:p>
   </w:comment>
-  <w:comment w:id="6" w:author="Bob Shen" w:initials="BS" w:date="2026-09-13T07:05:25Z">
+  <w:comment w:id="6" w:author="Bob Shen" w:initials="BS" w:date="2026-09-13T11:45:40Z">
     <w:p>
       <w:pPr>
         <w:pStyle w:val="CommentText"/>
@@ -8567,22 +8912,6 @@
       </w:r>
       <w:r>
         <w:t>Model 2 and Model 3 are specified; no new coefficients are added because the governed panels are not present here.</w:t>
-      </w:r>
-    </w:p>
-  </w:comment>
-  <w:comment w:id="7" w:author="Bob Shen" w:initials="BS" w:date="2026-09-13T07:05:25Z">
-    <w:p>
-      <w:pPr>
-        <w:pStyle w:val="CommentText"/>
-      </w:pPr>
-      <w:r>
-        <w:rPr>
-          <w:rStyle w:val="CommentReference"/>
-        </w:rPr>
-        <w:annotationRef/>
-      </w:r>
-      <w:r>
-        <w:t>The 84-month window is contained in the full window. These are nested sensitivity fits, not independent period estimates.</w:t>
       </w:r>
     </w:p>
   </w:comment>

</xml_diff>

<commit_message>
Build evidence-led novelty, feasibility and manuscript packet
</commit_message>
<xml_diff>
--- a/manuscript/covid_period/Heat_CVD_Manuscript_covid_period.docx
+++ b/manuscript/covid_period/Heat_CVD_Manuscript_covid_period.docx
@@ -15,7 +15,7 @@
           <w:i w:val="0"/>
           <w:sz w:val="32"/>
         </w:rPr>
-        <w:t>First recorded hospitalisations after coronary heart disease or heart failure diagnosis before and during the COVID pandemic in Hong Kong from 2013 to 2023</w:t>
+        <w:t>First hospitalisations after cardiovascular diagnosis before and during COVID in Hong Kong</w:t>
       </w:r>
     </w:p>
     <w:p>
@@ -84,7 +84,7 @@
           <w:i w:val="0"/>
           <w:sz w:val="23"/>
         </w:rPr>
-        <w:t xml:space="preserve"> Fewer recorded hospitalisations during the COVID-19 pandemic can reflect changes in disease burden, care use or event ascertainment. We examined first-hospitalisation counts among people with type 2 diabetes and/or hypertension in Hong Kong, placing the pandemic years within the preceding trend and assessing the sensitivity of weather associations to the analysis window.</w:t>
+        <w:t xml:space="preserve"> Fewer hospitalisations during a health-system disruption may reflect changes in health, care use or ascertainment. We examined recorded first-hospitalisation burden before and during COVID in Hong Kong.</w:t>
       </w:r>
     </w:p>
     <w:p>
@@ -109,7 +109,7 @@
           <w:i w:val="0"/>
           <w:sz w:val="23"/>
         </w:rPr>
-        <w:t xml:space="preserve"> We analysed two territory-wide monthly series from January 2013 to December 2023. The event was the first recorded hospitalisation after a first coronary heart disease (CHD) or heart failure (HF) diagnosis; admission cause was unavailable. We described annual counts and three non-overlapping calendar periods. Twelve separate negative-binomial weather models included calendar-month indicators, a four-degree-of-freedom time spline and a days-in-month offset. We compared the full 132-month fit with a nested 84-month fit ending in 2019. These overlapping fits were sensitivity analyses, not a pre/post interaction test.</w:t>
+        <w:t xml:space="preserve"> Two monthly series covered 2013–2023 among people with type 2 diabetes and/or hypertension. Events were first recorded hospitalisations after coronary heart disease (CHD) or heart failure (HF) diagnosis; admission cause and eligible person-time were unavailable. We described annual counts and assessed twelve negative-binomial weather models with calendar-month, time-trend and month-length controls. Full and nested pre-2020 fits were sensitivity comparisons, not independent pre/post estimates.</w:t>
       </w:r>
     </w:p>
     <w:p>
@@ -134,7 +134,7 @@
           <w:i w:val="0"/>
           <w:sz w:val="23"/>
         </w:rPr>
-        <w:t xml:space="preserve"> There were 156,156 first recorded hospitalisations after CHD diagnosis and 29,681 after HF diagnosis. Counts declined before 2020. Compared with 2019, annual counts were 17.4% lower for CHD and 16.2% lower for HF in 2020, but only 0.6% and 2.0% lower in 2023. The cold-day count ratio per five additional days was 1.036 (Newey–West lag-six 95% CI 1.007–1.067) for CHD in the pre-2020 fit and 0.995 (0.949–1.043) in the full fit; corresponding HF ratios were 1.113 (1.053–1.176) and 1.073 (1.006–1.144). All twelve full-window multiplicity-adjusted q-values exceeded 0.19. No laboratory measurements or cohort person-time were available.</w:t>
+        <w:t xml:space="preserve"> The series contained 156,156 hospitalisations after CHD diagnosis and 29,681 after HF diagnosis. Counts declined before 2020. Relative to 2019, counts were 17.4% and 16.2% lower in 2020, but 0.6% and 2.0% lower in 2023. Cold-day estimates were smaller in the full window, but depended on calendar specification. All twelve full-window adjusted q-values exceeded 0.19.</w:t>
       </w:r>
     </w:p>
     <w:p>
@@ -159,7 +159,7 @@
           <w:i w:val="0"/>
           <w:sz w:val="23"/>
         </w:rPr>
-        <w:t xml:space="preserve"> Recorded first-hospitalisation counts dipped in 2020 after a substantial earlier decline and recovered towards 2019 levels by 2023. Thermal estimates depended on the window and calendar specification. Neither the count trajectory nor these sensitivity fits identify physiological improvement or exclude a contribution from weather.</w:t>
+        <w:t xml:space="preserve"> Recorded counts dipped in 2020 after an earlier decline and approached 2019 levels by 2023. Neither these trajectories nor weather sensitivity fits identify physiological improvement or exclude weather. Distinguishing clinical change from care and recording requires validated events, denominators and linked measurements.</w:t>
       </w:r>
     </w:p>
     <w:p>
@@ -220,6 +220,22 @@
           <w:sz w:val="23"/>
         </w:rPr>
         <w:t>A fall in hospitalisations during a public health emergency is difficult to interpret. It may indicate fewer events requiring care, reduced access or willingness to attend, or a change in which events are recorded. In Hong Kong, Xin and colleagues reported fewer hospitalisations alongside higher mortality in 2020, including more deaths outside public hospitals [1]. Wai and colleagues likewise found fewer emergency-department visits and higher subsequent mortality among attenders [2]. These findings make it unsafe to equate a lower recorded hospital count with better cardiovascular health.</w:t>
+      </w:r>
+    </w:p>
+    <w:p>
+      <w:pPr>
+        <w:spacing w:after="160" w:before="0" w:line="240" w:lineRule="auto"/>
+        <w:ind w:firstLine="0"/>
+        <w:jc w:val="left"/>
+      </w:pPr>
+      <w:r>
+        <w:rPr>
+          <w:rFonts w:ascii="Times New Roman" w:hAnsi="Times New Roman" w:eastAsia="Times New Roman"/>
+          <w:b w:val="0"/>
+          <w:i w:val="0"/>
+          <w:sz w:val="23"/>
+        </w:rPr>
+        <w:t>More closely matched studies have examined cardiovascular outcomes among people with chronic disease. Youn and colleagues compared cardiovascular diagnoses, mortality and healthcare use among people with diabetes in Hong Kong and Korea [15]. Hu and colleagues examined cardiovascular incidence, mortality, blood-pressure control and healthcare use among Hong Kong patients with hypertension, including the early Omicron period [16]. Yau and colleagues subsequently related changes in continuity of diabetes care to later cardiovascular outcomes and mortality [17]. These studies already address several explanations for falling recorded events. A different event definition or longer series does not by itself establish a new clinical contribution.</w:t>
       </w:r>
     </w:p>
     <w:p>
@@ -354,6 +370,66 @@
           <w:sz w:val="23"/>
         </w:rPr>
         <w:t>Age and sex strata, laboratory measurements, medication records, infection and vaccination histories, and person-time at risk were unavailable. This study therefore estimated recorded burden and ecological count associations, rather than individual disease incidence or physiological change.</w:t>
+      </w:r>
+    </w:p>
+    <w:p>
+      <w:pPr>
+        <w:keepNext/>
+        <w:keepLines/>
+        <w:spacing w:after="120" w:before="0" w:line="240" w:lineRule="auto"/>
+        <w:ind w:firstLine="0"/>
+        <w:jc w:val="left"/>
+      </w:pPr>
+      <w:r>
+        <w:rPr>
+          <w:rFonts w:ascii="Times New Roman" w:hAnsi="Times New Roman" w:eastAsia="Times New Roman"/>
+          <w:b w:val="0"/>
+          <w:i/>
+          <w:sz w:val="21"/>
+        </w:rPr>
+        <w:t>Figure 1. Observation processes underlying the recorded outcome. Conceptual diagram of how disease, diagnosis recording, care contact and extraction rules can affect a first counted stay. Arrows denote plausible pathways, not effects identified by this study. The counted stay is not validated as an admission principally for CHD or HF. Eligible person-time, clinical measurements and linked deaths were not supplied; no numerical cohort flow is inferred.</w:t>
+      </w:r>
+    </w:p>
+    <w:p>
+      <w:pPr>
+        <w:keepLines/>
+        <w:spacing w:after="160" w:before="0" w:line="240" w:lineRule="auto"/>
+        <w:ind w:firstLine="0"/>
+        <w:jc w:val="center"/>
+      </w:pPr>
+      <w:r>
+        <w:drawing>
+          <wp:inline xmlns:a="http://schemas.openxmlformats.org/drawingml/2006/main" xmlns:pic="http://schemas.openxmlformats.org/drawingml/2006/picture">
+            <wp:extent cx="5577840" cy="2853842"/>
+            <wp:docPr id="1" name="Picture 1"/>
+            <wp:cNvGraphicFramePr>
+              <a:graphicFrameLocks noChangeAspect="1"/>
+            </wp:cNvGraphicFramePr>
+            <a:graphic>
+              <a:graphicData uri="http://schemas.openxmlformats.org/drawingml/2006/picture">
+                <pic:pic>
+                  <pic:nvPicPr>
+                    <pic:cNvPr id="0" name="figure_observation_process_20261002.png"/>
+                    <pic:cNvPicPr/>
+                  </pic:nvPicPr>
+                  <pic:blipFill>
+                    <a:blip r:embed="rId11"/>
+                    <a:stretch>
+                      <a:fillRect/>
+                    </a:stretch>
+                  </pic:blipFill>
+                  <pic:spPr>
+                    <a:xfrm>
+                      <a:off x="0" y="0"/>
+                      <a:ext cx="5577840" cy="2853842"/>
+                    </a:xfrm>
+                    <a:prstGeom prst="rect"/>
+                  </pic:spPr>
+                </pic:pic>
+              </a:graphicData>
+            </a:graphic>
+          </wp:inline>
+        </w:drawing>
       </w:r>
     </w:p>
     <w:p>
@@ -675,6 +751,7 @@
     </w:p>
     <w:p>
       <w:pPr>
+        <w:keepNext/>
         <w:spacing w:after="160" w:before="0" w:line="240" w:lineRule="auto"/>
         <w:ind w:firstLine="0"/>
         <w:jc w:val="center"/>
@@ -702,7 +779,7 @@
           <w:i w:val="0"/>
           <w:sz w:val="23"/>
         </w:rPr>
-        <w:t>Here Y_t is the monthly first-hospitalisation count, d_t is the number of days in that month, X_t is one weather exposure, and s(t; 4 df) is a natural cubic spline of calendar time with four degrees of freedom. January was the reference calendar month. We reported exp(beta) per 1°C for continuous temperature or per five additional official days. The offset accounts for month length. It does not supply the eligible person-time denominator needed for incidence rates. General-population counts are not a substitute for that denominator.</w:t>
+        <w:t>Here Yₜ is the monthly first-hospitalisation count, dₜ is the number of days in that month, Xₜ is one weather exposure, and s(t; 4 df) is a natural cubic spline of calendar time with four degrees of freedom. January was the reference calendar month. We reported exp(β) per 1°C for continuous temperature or per five additional official days. The offset accounts for month length. It does not supply the eligible person-time denominator needed for incidence rates. General-population counts are not a substitute for that denominator.</w:t>
       </w:r>
     </w:p>
     <w:p>
@@ -839,7 +916,7 @@
           <w:i w:val="0"/>
           <w:sz w:val="23"/>
         </w:rPr>
-        <w:t>Counts fell further in 2020, to 10,237 for CHD and 1,964 for HF. These totals were 17.4% and 16.2% below 2019. Both series rose in 2021, fell in 2022 and rose again in 2023. By 2023, CHD and HF totals were 12,323 and 2,296, respectively: 0.6% and 2.0% below 2019. Counts returned towards the late pre-pandemic level rather than the much higher 2013 level (Figure 1).</w:t>
+        <w:t>Counts fell further in 2020, to 10,237 for CHD and 1,964 for HF. These totals were 17.4% and 16.2% below 2019. Both series rose in 2021, fell in 2022 and rose again in 2023. By 2023, CHD and HF totals were 12,323 and 2,296, respectively: 0.6% and 2.0% below 2019. Counts returned towards the late pre-pandemic level rather than the much higher 2013 level (Figure 2).</w:t>
       </w:r>
     </w:p>
     <w:p>
@@ -2053,7 +2130,7 @@
           <w:i/>
           <w:sz w:val="21"/>
         </w:rPr>
-        <w:t>Figure 1. Annual first hospitalisation counts indexed to 2013. Each series uses its own 2013 total as 100. The shaded interval begins in 2020 and marks calendar years, not an estimated treatment effect. Source: Hospital Authority aggregate annual summaries.</w:t>
+        <w:t>Figure 2. Annual recorded first hospitalisation counts after CHD or HF diagnosis. Separate panels show annual counts on their own outcome scales. The shaded interval begins in 2020 and marks calendar years, not an estimated treatment effect. These are observed totals, without population or trend adjustment. Source: Hospital Authority aggregate annual summaries.</w:t>
       </w:r>
     </w:p>
     <w:p>
@@ -2066,8 +2143,8 @@
       <w:r>
         <w:drawing>
           <wp:inline xmlns:a="http://schemas.openxmlformats.org/drawingml/2006/main" xmlns:pic="http://schemas.openxmlformats.org/drawingml/2006/picture">
-            <wp:extent cx="5577840" cy="2892557"/>
-            <wp:docPr id="1" name="Picture 1"/>
+            <wp:extent cx="5577840" cy="2256581"/>
+            <wp:docPr id="2" name="Picture 2"/>
             <wp:cNvGraphicFramePr>
               <a:graphicFrameLocks noChangeAspect="1"/>
             </wp:cNvGraphicFramePr>
@@ -2079,7 +2156,7 @@
                     <pic:cNvPicPr/>
                   </pic:nvPicPr>
                   <pic:blipFill>
-                    <a:blip r:embed="rId11"/>
+                    <a:blip r:embed="rId12"/>
                     <a:stretch>
                       <a:fillRect/>
                     </a:stretch>
@@ -2087,7 +2164,7 @@
                   <pic:spPr>
                     <a:xfrm>
                       <a:off x="0" y="0"/>
-                      <a:ext cx="5577840" cy="2892557"/>
+                      <a:ext cx="5577840" cy="2256581"/>
                     </a:xfrm>
                     <a:prstGeom prst="rect"/>
                   </pic:spPr>
@@ -3150,6 +3227,66 @@
     </w:p>
     <w:p>
       <w:pPr>
+        <w:keepNext/>
+        <w:keepLines/>
+        <w:spacing w:after="120" w:before="0" w:line="240" w:lineRule="auto"/>
+        <w:ind w:firstLine="0"/>
+        <w:jc w:val="left"/>
+      </w:pPr>
+      <w:r>
+        <w:rPr>
+          <w:rFonts w:ascii="Times New Roman" w:hAnsi="Times New Roman" w:eastAsia="Times New Roman"/>
+          <w:b w:val="0"/>
+          <w:i/>
+          <w:sz w:val="21"/>
+        </w:rPr>
+        <w:t>Figure 3. Calendar specification sensitivity of selected exploratory associations. CHD hot-night and HF cold-day count ratios per five additional days, with Newey–West lag-six 95% confidence intervals. These previously discussed contrasts are displayed to reveal specification dependence; they were not selected as confirmatory findings. The complete official-day sensitivity panel is in Supplementary Table S3 and the complete baseline family in S2. Omission checks change the sample as well as the calendar fit. An interval crossing one is not a formal test of a difference between specifications.</w:t>
+      </w:r>
+    </w:p>
+    <w:p>
+      <w:pPr>
+        <w:keepLines/>
+        <w:spacing w:after="160" w:before="0" w:line="240" w:lineRule="auto"/>
+        <w:ind w:firstLine="0"/>
+        <w:jc w:val="center"/>
+      </w:pPr>
+      <w:r>
+        <w:drawing>
+          <wp:inline xmlns:a="http://schemas.openxmlformats.org/drawingml/2006/main" xmlns:pic="http://schemas.openxmlformats.org/drawingml/2006/picture">
+            <wp:extent cx="5577840" cy="2557866"/>
+            <wp:docPr id="3" name="Picture 3"/>
+            <wp:cNvGraphicFramePr>
+              <a:graphicFrameLocks noChangeAspect="1"/>
+            </wp:cNvGraphicFramePr>
+            <a:graphic>
+              <a:graphicData uri="http://schemas.openxmlformats.org/drawingml/2006/picture">
+                <pic:pic>
+                  <pic:nvPicPr>
+                    <pic:cNvPr id="0" name="figure_calendar_sensitivity_20261002.png"/>
+                    <pic:cNvPicPr/>
+                  </pic:nvPicPr>
+                  <pic:blipFill>
+                    <a:blip r:embed="rId13"/>
+                    <a:stretch>
+                      <a:fillRect/>
+                    </a:stretch>
+                  </pic:blipFill>
+                  <pic:spPr>
+                    <a:xfrm>
+                      <a:off x="0" y="0"/>
+                      <a:ext cx="5577840" cy="2557866"/>
+                    </a:xfrm>
+                    <a:prstGeom prst="rect"/>
+                  </pic:spPr>
+                </pic:pic>
+              </a:graphicData>
+            </a:graphic>
+          </wp:inline>
+        </w:drawing>
+      </w:r>
+    </w:p>
+    <w:p>
+      <w:pPr>
         <w:spacing w:after="160" w:before="0" w:line="240" w:lineRule="auto"/>
         <w:ind w:firstLine="0"/>
         <w:jc w:val="left"/>
@@ -3231,7 +3368,7 @@
           <w:i w:val="0"/>
           <w:sz w:val="23"/>
         </w:rPr>
-        <w:t>Care disruption is a plausible explanation for part of the 2020 dip. Hong Kong studies reported fewer hospitalisations or emergency visits alongside higher mortality [1,2]. They caution against interpreting fewer recorded events as a health benefit, but they involve different outcomes and populations. They cannot explain this series by direct transfer of their effect estimates. Nor can evidence confined to 2020 explain the preceding decline or the 2022 dip.</w:t>
+        <w:t>Care disruption is a plausible explanation for part of the 2020 dip. Hong Kong studies reported fewer hospitalisations or emergency visits alongside higher mortality [1,2]. The more closely matched diabetes and hypertension studies examined cardiovascular diagnosis rates alongside care use and mortality [15,16]. Hu and colleagues also reported blood-pressure control below pre-pandemic levels among measured patients [16]. These studies weaken a general interpretation of fewer recorded events as better cardiovascular health. They cannot explain this particular series by direct transfer of their effect estimates: our outcome is a first recorded stay after diagnosis, with neither validated admission cause nor eligible person-time.</w:t>
       </w:r>
     </w:p>
     <w:p>
@@ -3298,7 +3435,7 @@
           <w:i w:val="0"/>
           <w:sz w:val="23"/>
         </w:rPr>
-        <w:t>The most directly relevant local study, by Wong and colleagues, found no evidence of an overall adjusted improvement in HbA1c or blood pressure among regular primary-care attenders with type 2 diabetes [9]. Its group labels referred to 2019 and 2020, but the actual sampling windows were February–March 2020 and February–March 2021. Its first window was already after the initial Hong Kong outbreak. It is therefore neither a clean pre-pandemic comparison nor an individual longitudinal assessment. A separate small Hong Kong follow-up of COVID-19 survivors with acute dysglycaemia found worsening rather than improved glycaemic status [10]. These findings weaken a broad metabolic-improvement explanation without excluding benefits in particular patient groups.</w:t>
+        <w:t>A local primary-care study, by Wong and colleagues, found no evidence of an overall adjusted improvement in HbA1c or blood pressure among regular primary-care attenders with type 2 diabetes [9]. Its group labels referred to 2019 and 2020, but the actual sampling windows were February–March 2020 and February–March 2021. Its first window was already after the initial Hong Kong outbreak. It is therefore neither a clean pre-pandemic comparison nor an individual longitudinal assessment. A separate small Hong Kong follow-up of COVID-19 survivors with acute dysglycaemia found worsening rather than improved glycaemic status [10]. These findings weaken a broad metabolic-improvement explanation without excluding benefits in particular patient groups.</w:t>
       </w:r>
     </w:p>
     <w:p>
@@ -3331,6 +3468,57 @@
           <w:sz w:val="23"/>
         </w:rPr>
         <w:t>Vaccination and changes in prevention may have affected later years. Wan and colleagues reported lower acute and post-acute cardiovascular event risk among vaccinated than unvaccinated people with SARS-CoV-2 infection in Hong Kong [14]. That comparison concerns vaccination among infected people, with observational confounding and a different cardiovascular endpoint. It does not establish better baseline health in the whole eligible population, and it cannot explain a dip that preceded vaccination. Treatment, behaviour, infection, care use and recording may have operated simultaneously.</w:t>
+      </w:r>
+    </w:p>
+    <w:p>
+      <w:pPr>
+        <w:pStyle w:val="Heading2"/>
+        <w:keepNext/>
+        <w:keepLines/>
+        <w:spacing w:after="120" w:before="160" w:line="240" w:lineRule="auto"/>
+        <w:ind w:firstLine="0"/>
+        <w:jc w:val="left"/>
+      </w:pPr>
+      <w:r>
+        <w:rPr>
+          <w:rFonts w:ascii="Times New Roman" w:hAnsi="Times New Roman" w:eastAsia="Times New Roman"/>
+          <w:b/>
+          <w:i w:val="0"/>
+          <w:sz w:val="23"/>
+        </w:rPr>
+        <w:t>Clinical follow up and the scope of inference</w:t>
+      </w:r>
+    </w:p>
+    <w:p>
+      <w:pPr>
+        <w:spacing w:after="160" w:before="0" w:line="240" w:lineRule="auto"/>
+        <w:ind w:firstLine="0"/>
+        <w:jc w:val="left"/>
+      </w:pPr>
+      <w:r>
+        <w:rPr>
+          <w:rFonts w:ascii="Times New Roman" w:hAnsi="Times New Roman" w:eastAsia="Times New Roman"/>
+          <w:b w:val="0"/>
+          <w:i w:val="0"/>
+          <w:sz w:val="23"/>
+        </w:rPr>
+        <w:t>Yau and colleagues examined continuity of diabetes care in patients who attended repeatedly and remained alive and free of the study outcomes at a June 2022 landmark [17]. Their later follow-up associated reduced continuity with CHD, HF and kidney failure; results for stroke and all-cause mortality were less conclusive. Such a design supplies clinical and service information absent here, but it addresses a selected population and a different question. Selection on continued attendance, survival and future infection status can alter who contributes to an analysis. These choices require explicit interpretation rather than being treated as complete removal of confounding.</w:t>
+      </w:r>
+    </w:p>
+    <w:p>
+      <w:pPr>
+        <w:spacing w:after="160" w:before="0" w:line="240" w:lineRule="auto"/>
+        <w:ind w:firstLine="0"/>
+        <w:jc w:val="left"/>
+      </w:pPr>
+      <w:r>
+        <w:rPr>
+          <w:rFonts w:ascii="Times New Roman" w:hAnsi="Times New Roman" w:eastAsia="Times New Roman"/>
+          <w:b w:val="0"/>
+          <w:i w:val="0"/>
+          <w:sz w:val="23"/>
+        </w:rPr>
+        <w:t>A study that distinguishes health change from observation change would need to evaluate eligible populations, validated events, deaths, care contacts and testing together. Repeated measurements should be analysed alongside the probability and timing of measurement. The explanations can coexist: care disruption may delay diagnoses while changes in infection exposure or treatment alter disease risk. Neither a better biomarker profile in retained patients nor attenuation after adding a service-use covariate would alone identify the mechanism.</w:t>
       </w:r>
     </w:p>
     <w:p>
@@ -3417,6 +3605,22 @@
           <w:sz w:val="23"/>
         </w:rPr>
         <w:t>The main limitation is the event construction. Without recorded admission cause, eligible person-time or validated first-event rules, these counts cannot measure disease-specific incidence. Laboratory and medication data were absent, preventing direct assessment of physiological change. Monthly aggregation obscures daily timing, and secular trends may reflect changing diagnosis, treatment, eligibility and recording. The available thermal models did not include a separate later-era coefficient or an interaction, and exploratory sensitivity analyses did not receive joint multiplicity adjustment. Annual comparisons did not estimate a counterfactual pandemic effect.</w:t>
+      </w:r>
+    </w:p>
+    <w:p>
+      <w:pPr>
+        <w:spacing w:after="160" w:before="0" w:line="240" w:lineRule="auto"/>
+        <w:ind w:firstLine="0"/>
+        <w:jc w:val="left"/>
+      </w:pPr>
+      <w:r>
+        <w:rPr>
+          <w:rFonts w:ascii="Times New Roman" w:hAnsi="Times New Roman" w:eastAsia="Times New Roman"/>
+          <w:b w:val="0"/>
+          <w:i w:val="0"/>
+          <w:sz w:val="23"/>
+        </w:rPr>
+        <w:t>The incremental value of this analysis is its description and criticism of a particular first-hospitalisation series, rather than a new estimate of physiological benefit. The close prior studies mean that adding clinical covariates or later follow-up alone would not establish novelty. A stronger clinical contribution would require measurements and a design that distinguish explanations left unresolved by those studies.</w:t>
       </w:r>
     </w:p>
     <w:p>
@@ -3746,6 +3950,54 @@
           <w:sz w:val="21"/>
         </w:rPr>
         <w:t>14. Wan EYF, Mok AHY, Yan VKC, et al. Association between BNT162b2 and CoronaVac vaccination and risk of CVD and mortality after COVID-19 infection: A population-based cohort study. Cell Rep Med. 2023;4:101195. doi:10.1016/j.xcrm.2023.101195</w:t>
+      </w:r>
+    </w:p>
+    <w:p>
+      <w:pPr>
+        <w:spacing w:after="160" w:before="0" w:line="240" w:lineRule="auto"/>
+        <w:ind w:firstLine="0"/>
+        <w:jc w:val="left"/>
+      </w:pPr>
+      <w:r>
+        <w:rPr>
+          <w:rFonts w:ascii="Times New Roman" w:hAnsi="Times New Roman" w:eastAsia="Times New Roman"/>
+          <w:b w:val="0"/>
+          <w:i w:val="0"/>
+          <w:sz w:val="21"/>
+        </w:rPr>
+        <w:t>15. Youn HM, Hu Z, Park YS, et al. Indirect Impact of the COVID-19 Pandemic on All-Cause Mortality and Cardiovascular Disease Among People With Diabetes Mellitus From Korea and Hong Kong: An Interrupted Time Series Analysis. Health Sci Rep. 2025;8:e71291. doi:10.1002/hsr2.71291</w:t>
+      </w:r>
+    </w:p>
+    <w:p>
+      <w:pPr>
+        <w:spacing w:after="160" w:before="0" w:line="240" w:lineRule="auto"/>
+        <w:ind w:firstLine="0"/>
+        <w:jc w:val="left"/>
+      </w:pPr>
+      <w:r>
+        <w:rPr>
+          <w:rFonts w:ascii="Times New Roman" w:hAnsi="Times New Roman" w:eastAsia="Times New Roman"/>
+          <w:b w:val="0"/>
+          <w:i w:val="0"/>
+          <w:sz w:val="21"/>
+        </w:rPr>
+        <w:t>16. Hu Z, Yau YK, Quan J, et al. Indirect effect of the COVID-19 pandemic on cardiovascular diseases incidence, mortality, and healthcare use among patients with hypertension but without SARS-CoV-2 infection in Hong Kong: an interrupted time series analysis. Hypertens Res. 2025;48:2197–2208. doi:10.1038/s41440-025-02230-y</w:t>
+      </w:r>
+    </w:p>
+    <w:p>
+      <w:pPr>
+        <w:spacing w:after="160" w:before="0" w:line="240" w:lineRule="auto"/>
+        <w:ind w:firstLine="0"/>
+        <w:jc w:val="left"/>
+      </w:pPr>
+      <w:r>
+        <w:rPr>
+          <w:rFonts w:ascii="Times New Roman" w:hAnsi="Times New Roman" w:eastAsia="Times New Roman"/>
+          <w:b w:val="0"/>
+          <w:i w:val="0"/>
+          <w:sz w:val="21"/>
+        </w:rPr>
+        <w:t>17. Yau YK, Li M, Quan J, et al. Association of Reduction in Continuity of Care During COVID-19 Pandemic With Cardiovascular Diseases, Kidney Failure and All-Cause Mortality for People With Diabetes: A Cohort Study in Hong Kong. Diabetes Obes Metab. 2026;28:8016–8024. doi:10.1111/dom.70984</w:t>
       </w:r>
     </w:p>
     <w:sectPr>

</xml_diff>

<commit_message>
Finalize frozen recorded-hospitalisation manuscript and publication figures
</commit_message>
<xml_diff>
--- a/manuscript/covid_period/Heat_CVD_Manuscript_covid_period.docx
+++ b/manuscript/covid_period/Heat_CVD_Manuscript_covid_period.docx
@@ -15,7 +15,7 @@
           <w:i w:val="0"/>
           <w:sz w:val="32"/>
         </w:rPr>
-        <w:t>First hospitalisations after cardiovascular diagnosis before and during COVID in Hong Kong</w:t>
+        <w:t>Recorded first hospitalisations after cardiovascular diagnosis before and during COVID in Hong Kong</w:t>
       </w:r>
     </w:p>
     <w:p>
@@ -40,7 +40,7 @@
           <w:i w:val="0"/>
           <w:sz w:val="23"/>
         </w:rPr>
-        <w:t xml:space="preserve"> Pandemic era first hospitalisation counts</w:t>
+        <w:t xml:space="preserve"> Recorded hospitalisations in the COVID era</w:t>
       </w:r>
     </w:p>
     <w:p>
@@ -71,95 +71,11 @@
       <w:r>
         <w:rPr>
           <w:rFonts w:ascii="Times New Roman" w:hAnsi="Times New Roman" w:eastAsia="Times New Roman"/>
-          <w:b/>
-          <w:i w:val="0"/>
-          <w:sz w:val="23"/>
-        </w:rPr>
-        <w:t>Background.</w:t>
-      </w:r>
-      <w:r>
-        <w:rPr>
-          <w:rFonts w:ascii="Times New Roman" w:hAnsi="Times New Roman" w:eastAsia="Times New Roman"/>
           <w:b w:val="0"/>
           <w:i w:val="0"/>
           <w:sz w:val="23"/>
         </w:rPr>
-        <w:t xml:space="preserve"> Fewer hospitalisations during a health-system disruption may reflect changes in health, care use or ascertainment. We examined recorded first-hospitalisation burden before and during COVID in Hong Kong.</w:t>
-      </w:r>
-    </w:p>
-    <w:p>
-      <w:pPr>
-        <w:spacing w:after="160" w:before="0" w:line="240" w:lineRule="auto"/>
-        <w:ind w:firstLine="0"/>
-        <w:jc w:val="left"/>
-      </w:pPr>
-      <w:r>
-        <w:rPr>
-          <w:rFonts w:ascii="Times New Roman" w:hAnsi="Times New Roman" w:eastAsia="Times New Roman"/>
-          <w:b/>
-          <w:i w:val="0"/>
-          <w:sz w:val="23"/>
-        </w:rPr>
-        <w:t>Methods.</w:t>
-      </w:r>
-      <w:r>
-        <w:rPr>
-          <w:rFonts w:ascii="Times New Roman" w:hAnsi="Times New Roman" w:eastAsia="Times New Roman"/>
-          <w:b w:val="0"/>
-          <w:i w:val="0"/>
-          <w:sz w:val="23"/>
-        </w:rPr>
-        <w:t xml:space="preserve"> Two monthly series covered 2013–2023 among people with type 2 diabetes and/or hypertension. Events were first recorded hospitalisations after coronary heart disease (CHD) or heart failure (HF) diagnosis; admission cause and eligible person-time were unavailable. We described annual counts and assessed twelve negative-binomial weather models with calendar-month, time-trend and month-length controls. Full and nested pre-2020 fits were sensitivity comparisons, not independent pre/post estimates.</w:t>
-      </w:r>
-    </w:p>
-    <w:p>
-      <w:pPr>
-        <w:spacing w:after="160" w:before="0" w:line="240" w:lineRule="auto"/>
-        <w:ind w:firstLine="0"/>
-        <w:jc w:val="left"/>
-      </w:pPr>
-      <w:r>
-        <w:rPr>
-          <w:rFonts w:ascii="Times New Roman" w:hAnsi="Times New Roman" w:eastAsia="Times New Roman"/>
-          <w:b/>
-          <w:i w:val="0"/>
-          <w:sz w:val="23"/>
-        </w:rPr>
-        <w:t>Results.</w:t>
-      </w:r>
-      <w:r>
-        <w:rPr>
-          <w:rFonts w:ascii="Times New Roman" w:hAnsi="Times New Roman" w:eastAsia="Times New Roman"/>
-          <w:b w:val="0"/>
-          <w:i w:val="0"/>
-          <w:sz w:val="23"/>
-        </w:rPr>
-        <w:t xml:space="preserve"> The series contained 156,156 hospitalisations after CHD diagnosis and 29,681 after HF diagnosis. Counts declined before 2020. Relative to 2019, counts were 17.4% and 16.2% lower in 2020, but 0.6% and 2.0% lower in 2023. Cold-day estimates were smaller in the full window, but depended on calendar specification. All twelve full-window adjusted q-values exceeded 0.19.</w:t>
-      </w:r>
-    </w:p>
-    <w:p>
-      <w:pPr>
-        <w:spacing w:after="160" w:before="0" w:line="240" w:lineRule="auto"/>
-        <w:ind w:firstLine="0"/>
-        <w:jc w:val="left"/>
-      </w:pPr>
-      <w:r>
-        <w:rPr>
-          <w:rFonts w:ascii="Times New Roman" w:hAnsi="Times New Roman" w:eastAsia="Times New Roman"/>
-          <w:b/>
-          <w:i w:val="0"/>
-          <w:sz w:val="23"/>
-        </w:rPr>
-        <w:t>Conclusions.</w:t>
-      </w:r>
-      <w:r>
-        <w:rPr>
-          <w:rFonts w:ascii="Times New Roman" w:hAnsi="Times New Roman" w:eastAsia="Times New Roman"/>
-          <w:b w:val="0"/>
-          <w:i w:val="0"/>
-          <w:sz w:val="23"/>
-        </w:rPr>
-        <w:t xml:space="preserve"> Recorded counts dipped in 2020 after an earlier decline and approached 2019 levels by 2023. Neither these trajectories nor weather sensitivity fits identify physiological improvement or exclude weather. Distinguishing clinical change from care and recording requires validated events, denominators and linked measurements.</w:t>
+        <w:t>Fewer recorded hospitalisations during a health-system disruption may reflect changes in disease, care use or ascertainment. We examined first recorded hospitalisations after coronary heart disease (CHD) or heart failure (HF) diagnosis in Hong Kong among people diagnosed with type 2 diabetes and/or hypertension during 2013–2023. Two monthly series comprised 156,156 CHD-associated and 29,681 HF-associated stays. Admission cause and eligible person-time were unavailable. Annual counts declined before 2020, fell further in 2020 and recovered towards 2019 levels by 2023. Compared with 2019, CHD and HF counts were respectively 17.4% and 16.2% lower in 2020, and 0.6% and 2.0% lower in 2023. Twelve exploratory negative-binomial weather models used calendar-month, time-trend and month-length controls. All full-window lag-six false-discovery-adjusted q-values exceeded 0.19. Selected associations depended on calendar specification and uncertainty construction. Nested pre-2020 and full-series fits did not provide independent period comparisons. The recorded trajectory therefore places the 2020 fall within a preceding decline and subsequent recovery. These observations cannot distinguish physiological improvement from altered care or recording, and the weather models do not exclude a weather contribution. Interpretation of falling first-hospitalisation counts requires explicit event definitions and the eligible population contributing to them.</w:t>
       </w:r>
     </w:p>
     <w:p>
@@ -184,7 +100,7 @@
           <w:i w:val="0"/>
           <w:sz w:val="23"/>
         </w:rPr>
-        <w:t xml:space="preserve"> COVID-19; first hospitalisation; coronary heart disease; heart failure; diabetes; hypertension; Hong Kong</w:t>
+        <w:t xml:space="preserve"> COVID-19; recorded hospitalisation; coronary heart disease; heart failure; diabetes; hypertension; Hong Kong</w:t>
       </w:r>
     </w:p>
     <w:p>
@@ -219,7 +135,7 @@
           <w:i w:val="0"/>
           <w:sz w:val="23"/>
         </w:rPr>
-        <w:t>A fall in hospitalisations during a public health emergency is difficult to interpret. It may indicate fewer events requiring care, reduced access or willingness to attend, or a change in which events are recorded. In Hong Kong, Xin and colleagues reported fewer hospitalisations alongside higher mortality in 2020, including more deaths outside public hospitals [1]. Wai and colleagues likewise found fewer emergency-department visits and higher subsequent mortality among attenders [2]. These findings make it unsafe to equate a lower recorded hospital count with better cardiovascular health.</w:t>
+        <w:t>Hospitalisation counts are often used to describe population health during a public health emergency. Their interpretation depends on whether disease occurrence, access to care and event recording remain comparable. Hong Kong studies reported fewer hospitalisations and emergency-department visits during COVID-19 alongside higher mortality [1,2]. A reduction in recorded hospital use can therefore coexist with worse outcomes. For first hospitalisations, the number of people eligible to contribute an event also matters: entry, prior diagnoses, earlier events and departures from observation can change the count without an equivalent change in individual risk.</w:t>
       </w:r>
     </w:p>
     <w:p>
@@ -235,7 +151,7 @@
           <w:i w:val="0"/>
           <w:sz w:val="23"/>
         </w:rPr>
-        <w:t>More closely matched studies have examined cardiovascular outcomes among people with chronic disease. Youn and colleagues compared cardiovascular diagnoses, mortality and healthcare use among people with diabetes in Hong Kong and Korea [15]. Hu and colleagues examined cardiovascular incidence, mortality, blood-pressure control and healthcare use among Hong Kong patients with hypertension, including the early Omicron period [16]. Yau and colleagues subsequently related changes in continuity of diabetes care to later cardiovascular outcomes and mortality [17]. These studies already address several explanations for falling recorded events. A different event definition or longer series does not by itself establish a new clinical contribution.</w:t>
+        <w:t>Closely related studies have examined cardiovascular outcomes, mortality and healthcare use among people with diabetes in Hong Kong and Korea [3] and among Hong Kong patients with hypertension [4]. The hypertension study also assessed blood-pressure control. A subsequent Hong Kong cohort related reduced continuity of diabetes care to later cardiovascular and other outcomes [5]. These studies supply clinical or service information that a monthly count series does not contain. A longer series or a different recorded endpoint is not sufficient grounds for claiming a new explanation of the pandemic's cardiovascular effects.</w:t>
       </w:r>
     </w:p>
     <w:p>
@@ -251,7 +167,45 @@
           <w:i w:val="0"/>
           <w:sz w:val="23"/>
         </w:rPr>
-        <w:t>The distinction is particularly important for first events. A monthly count of first hospitalisations depends on how people enter the eligible population, which previous diagnoses and admissions are recognised, and how many people remain able to contribute an event. These processes can change without a change in individual susceptibility. They also differ from the repeated, cause-coded admissions generally used to study short-term temperature effects. Hong Kong studies of daily HF admissions and unplanned emergency hospitalisations provide relevant thermal context [3,4], but their outcomes and temporal resolution differ from a monthly first-hospitalisation series without recorded admission cause.</w:t>
+        <w:t>We examined two territory-wide monthly series of first recorded hospitalisations after CHD or HF diagnosis among people diagnosed with type 2 diabetes and/or hypertension during 2013–2023. The descriptive objective was to locate the pandemic-era trajectory within the earlier pattern of recorded counts. An existing weather analysis suggested smaller cold-day coefficients when later years were included. We assessed that observation through the complete weather panel and its calendar and uncertainty sensitivities. The count trajectory is the empirical focus; the weather analyses establish how dependent the associated interpretations are on the fitted specification.</w:t>
+      </w:r>
+    </w:p>
+    <w:p>
+      <w:pPr>
+        <w:pStyle w:val="Heading1"/>
+        <w:keepNext/>
+        <w:keepLines/>
+        <w:spacing w:after="120" w:before="240" w:line="240" w:lineRule="auto"/>
+        <w:ind w:firstLine="0"/>
+        <w:jc w:val="left"/>
+      </w:pPr>
+      <w:r>
+        <w:rPr>
+          <w:rFonts w:ascii="Times New Roman" w:hAnsi="Times New Roman" w:eastAsia="Times New Roman"/>
+          <w:b/>
+          <w:i w:val="0"/>
+          <w:sz w:val="27"/>
+        </w:rPr>
+        <w:t>Results</w:t>
+      </w:r>
+    </w:p>
+    <w:p>
+      <w:pPr>
+        <w:pStyle w:val="Heading2"/>
+        <w:keepNext/>
+        <w:keepLines/>
+        <w:spacing w:after="120" w:before="160" w:line="240" w:lineRule="auto"/>
+        <w:ind w:firstLine="0"/>
+        <w:jc w:val="left"/>
+      </w:pPr>
+      <w:r>
+        <w:rPr>
+          <w:rFonts w:ascii="Times New Roman" w:hAnsi="Times New Roman" w:eastAsia="Times New Roman"/>
+          <w:b/>
+          <w:i w:val="0"/>
+          <w:sz w:val="23"/>
+        </w:rPr>
+        <w:t>A preceding decline and a pandemic-era trough</w:t>
       </w:r>
     </w:p>
     <w:p>
@@ -267,7 +221,7 @@
           <w:i w:val="0"/>
           <w:sz w:val="23"/>
         </w:rPr>
-        <w:t>We examined first recorded hospitalisations after CHD or HF diagnosis among people with type 2 diabetes and/or hypertension during 2013–2023. An initial weather analysis suggested that cold-day count ratios were lower when pandemic years were included. That observation raised two distinct questions: how did recorded counts change around 2020, and did the association between weather and counts change between eras? The available results address the first descriptively and the second through analysis-window sensitivity. They do not provide an independent estimate for the later era or a formal interaction test.</w:t>
+        <w:t>The series contained 156,156 first recorded hospitalisations after CHD diagnosis and 29,681 after HF diagnosis. These outcome-specific totals were not combined into a unique patient count. Annual CHD counts fell from 23,830 in 2013 to 12,396 in 2019, while HF counts fell from 4,336 to 2,344 (Fig. 1; Supplementary Table S1). Both series therefore showed a substantial decline before the first pandemic year.</w:t>
       </w:r>
     </w:p>
     <w:p>
@@ -283,7 +237,484 @@
           <w:i w:val="0"/>
           <w:sz w:val="23"/>
         </w:rPr>
-        <w:t>Our primary descriptive objective was to locate the pandemic-era count trajectory within the preceding decline. Our secondary objective was to assess thermal associations across the full and nested pre-2020 windows and across calendar specifications. We considered evidence on physiological change, care use and respiratory infection to identify plausible explanations and the measurements needed to distinguish them.</w:t>
+        <w:t>Counts fell further in 2020, to 10,237 for CHD and 1,964 for HF: respectively 17.4% and 16.2% below 2019. Both series rose in 2021, fell in 2022 and rose again in 2023. In 2023, the totals were 12,323 for CHD and 2,296 for HF, 0.6% and 2.0% below 2019. Recovery refers to recorded counts approaching the late pre-pandemic level, rather than returning to the much higher 2013 totals. These arithmetic comparisons do not adjust for the pre-existing trend.</w:t>
+      </w:r>
+    </w:p>
+    <w:p>
+      <w:pPr>
+        <w:spacing w:after="160" w:before="0" w:line="240" w:lineRule="auto"/>
+        <w:ind w:firstLine="0"/>
+        <w:jc w:val="left"/>
+      </w:pPr>
+      <w:r>
+        <w:rPr>
+          <w:rFonts w:ascii="Times New Roman" w:hAnsi="Times New Roman" w:eastAsia="Times New Roman"/>
+          <w:b w:val="0"/>
+          <w:i w:val="0"/>
+          <w:sz w:val="23"/>
+        </w:rPr>
+        <w:t>Monthly means were 1,315.3 CHD events and 252.0 HF events in 2013–2019, 926.3 and 172.6 in 2020–2022, and 1,026.9 and 191.3 in 2023 (Supplementary Table S2). These periods do not overlap, but their averages include the preceding decline. An average over the whole pre-2020 period is consequently not a counterfactual for what would have occurred in 2020 without the pandemic.</w:t>
+      </w:r>
+    </w:p>
+    <w:p>
+      <w:pPr>
+        <w:keepNext/>
+        <w:keepLines/>
+        <w:spacing w:after="120" w:before="0" w:line="240" w:lineRule="auto"/>
+        <w:ind w:firstLine="0"/>
+        <w:jc w:val="left"/>
+      </w:pPr>
+      <w:r>
+        <w:rPr>
+          <w:rFonts w:ascii="Times New Roman" w:hAnsi="Times New Roman" w:eastAsia="Times New Roman"/>
+          <w:b w:val="0"/>
+          <w:i/>
+          <w:sz w:val="21"/>
+        </w:rPr>
+        <w:t>Figure 1. Annual recorded first hospitalisations after cardiovascular diagnosis, 2013–2023. Stays after coronary heart disease (CHD) and heart failure (HF) diagnosis are shown separately on zero-origin count axes with different vertical scales. Each point is an observed annual total, without adjustment for eligible population or secular trend. Shading identifies 2020–2023 calendar years and does not denote an estimated treatment effect. Counts fell before 2020, reached a further trough in 2020 and approached 2019 totals by 2023. The endpoint is the first recorded hospitalisation after a relevant diagnosis, with admission cause unavailable. All 22 totals are retained in Supplementary Table S1.</w:t>
+      </w:r>
+    </w:p>
+    <w:p>
+      <w:pPr>
+        <w:keepLines/>
+        <w:spacing w:after="160" w:before="0" w:line="240" w:lineRule="auto"/>
+        <w:ind w:firstLine="0"/>
+        <w:jc w:val="center"/>
+      </w:pPr>
+      <w:r>
+        <w:drawing>
+          <wp:inline xmlns:a="http://schemas.openxmlformats.org/drawingml/2006/main" xmlns:pic="http://schemas.openxmlformats.org/drawingml/2006/picture">
+            <wp:extent cx="5943600" cy="2727064"/>
+            <wp:docPr id="1" name="Picture 1"/>
+            <wp:cNvGraphicFramePr>
+              <a:graphicFrameLocks noChangeAspect="1"/>
+            </wp:cNvGraphicFramePr>
+            <a:graphic>
+              <a:graphicData uri="http://schemas.openxmlformats.org/drawingml/2006/picture">
+                <pic:pic>
+                  <pic:nvPicPr>
+                    <pic:cNvPr id="0" name="annual_counts.png"/>
+                    <pic:cNvPicPr/>
+                  </pic:nvPicPr>
+                  <pic:blipFill>
+                    <a:blip r:embed="rId11"/>
+                    <a:stretch>
+                      <a:fillRect/>
+                    </a:stretch>
+                  </pic:blipFill>
+                  <pic:spPr>
+                    <a:xfrm>
+                      <a:off x="0" y="0"/>
+                      <a:ext cx="5943600" cy="2727064"/>
+                    </a:xfrm>
+                    <a:prstGeom prst="rect"/>
+                  </pic:spPr>
+                </pic:pic>
+              </a:graphicData>
+            </a:graphic>
+          </wp:inline>
+        </w:drawing>
+      </w:r>
+    </w:p>
+    <w:p>
+      <w:pPr>
+        <w:pStyle w:val="Heading2"/>
+        <w:keepNext/>
+        <w:keepLines/>
+        <w:spacing w:after="120" w:before="160" w:line="240" w:lineRule="auto"/>
+        <w:ind w:firstLine="0"/>
+        <w:jc w:val="left"/>
+      </w:pPr>
+      <w:r>
+        <w:rPr>
+          <w:rFonts w:ascii="Times New Roman" w:hAnsi="Times New Roman" w:eastAsia="Times New Roman"/>
+          <w:b/>
+          <w:i w:val="0"/>
+          <w:sz w:val="23"/>
+        </w:rPr>
+        <w:t>The complete weather panel does not resolve the trajectory</w:t>
+      </w:r>
+    </w:p>
+    <w:p>
+      <w:pPr>
+        <w:spacing w:after="160" w:before="0" w:line="240" w:lineRule="auto"/>
+        <w:ind w:firstLine="0"/>
+        <w:jc w:val="left"/>
+      </w:pPr>
+      <w:r>
+        <w:rPr>
+          <w:rFonts w:ascii="Times New Roman" w:hAnsi="Times New Roman" w:eastAsia="Times New Roman"/>
+          <w:b w:val="0"/>
+          <w:i w:val="0"/>
+          <w:sz w:val="23"/>
+        </w:rPr>
+        <w:t>Full-window models gave small inverse point estimates for continuous temperature in both outcomes (Fig. 2; Supplementary Table S3). For example, the count ratio per 1°C higher monthly mean temperature was 0.993 (95% CI 0.976–1.010) for CHD and 0.974 (0.947–1.002) for HF. Official-day exposures gave a different pattern. Per five additional cold days, the CHD ratio was 0.995 (0.949–1.043) and the HF ratio was 1.073 (1.006–1.144). CHD hot nights gave a ratio of 1.022 (1.002–1.042). These are conditional ecological count associations, rather than changes in eligible-population incidence.</w:t>
+      </w:r>
+    </w:p>
+    <w:p>
+      <w:pPr>
+        <w:spacing w:after="160" w:before="0" w:line="240" w:lineRule="auto"/>
+        <w:ind w:firstLine="0"/>
+        <w:jc w:val="left"/>
+      </w:pPr>
+      <w:r>
+        <w:rPr>
+          <w:rFonts w:ascii="Times New Roman" w:hAnsi="Times New Roman" w:eastAsia="Times New Roman"/>
+          <w:b w:val="0"/>
+          <w:i w:val="0"/>
+          <w:sz w:val="23"/>
+        </w:rPr>
+        <w:t>The smallest Benjamini–Hochberg-adjusted q-value in the twelve-fit lag-six family was 0.192; all twelve exceeded 0.19. The complete family therefore supplies no multiplicity-protected thermal finding. This result does not establish equivalence to no association or exclude a weather contribution to the count trajectory. The continuous-temperature and official-day models also represent different exposure contrasts, so their numerical magnitudes cannot be compared as interchangeable measures of thermal response.</w:t>
+      </w:r>
+    </w:p>
+    <w:p>
+      <w:pPr>
+        <w:spacing w:after="160" w:before="0" w:line="240" w:lineRule="auto"/>
+        <w:ind w:firstLine="0"/>
+        <w:jc w:val="left"/>
+      </w:pPr>
+      <w:r>
+        <w:rPr>
+          <w:rFonts w:ascii="Times New Roman" w:hAnsi="Times New Roman" w:eastAsia="Times New Roman"/>
+          <w:b w:val="0"/>
+          <w:i w:val="0"/>
+          <w:sz w:val="23"/>
+        </w:rPr>
+        <w:t>The pre-2020 fits were different again. Cold-day ratios were 1.036 (1.007–1.067) for CHD and 1.113 (1.053–1.176) for HF, compared with 0.995 and 1.073 in the full window. Nested monthly-mean-temperature ratios were 0.980 (0.970–0.990) and 0.945 (0.927–0.963), respectively. Complete official-day results appear in Supplementary Table S4 and Fig. S2. The 84 pre-2020 months are contained within the full 132 months, and the spline basis was reconstructed for each fit. Their difference is not an estimated pre/post effect. The smaller full-window cold-day coefficients are not evidence that cold became protective.</w:t>
+      </w:r>
+    </w:p>
+    <w:p>
+      <w:pPr>
+        <w:keepNext/>
+        <w:keepLines/>
+        <w:spacing w:after="120" w:before="0" w:line="240" w:lineRule="auto"/>
+        <w:ind w:firstLine="0"/>
+        <w:jc w:val="left"/>
+      </w:pPr>
+      <w:r>
+        <w:rPr>
+          <w:rFonts w:ascii="Times New Roman" w:hAnsi="Times New Roman" w:eastAsia="Times New Roman"/>
+          <w:b w:val="0"/>
+          <w:i/>
+          <w:sz w:val="21"/>
+        </w:rPr>
+        <w:t>Figure 2. Complete full-window exploratory weather associations. All twelve coronary heart disease (CHD) and heart failure (HF) negative-binomial models for January 2013–December 2023 are displayed with Newey–West lag-six 95% confidence intervals. Continuous exposures are scaled per 1°C; official-day exposures are scaled per five additional days, without a consecutive-day requirement. Separate panels distinguish outcomes and reporting units. Every model uses calendar-month indicators, a four-degree-of-freedom natural time spline and a days-in-month offset. The reference line denotes a count ratio of one. BH q-values apply jointly to the twelve lag-six Wald tests; all exceed 0.19. Reported estimates, p-values and q-values are in Supplementary Table S3; full-precision values are retained in the source CSV. These are recorded-count associations, not cohort incidence ratios.</w:t>
+      </w:r>
+    </w:p>
+    <w:p>
+      <w:pPr>
+        <w:keepLines/>
+        <w:spacing w:after="160" w:before="0" w:line="240" w:lineRule="auto"/>
+        <w:ind w:firstLine="0"/>
+        <w:jc w:val="center"/>
+      </w:pPr>
+      <w:r>
+        <w:drawing>
+          <wp:inline xmlns:a="http://schemas.openxmlformats.org/drawingml/2006/main" xmlns:pic="http://schemas.openxmlformats.org/drawingml/2006/picture">
+            <wp:extent cx="5943600" cy="3985708"/>
+            <wp:docPr id="2" name="Picture 2"/>
+            <wp:cNvGraphicFramePr>
+              <a:graphicFrameLocks noChangeAspect="1"/>
+            </wp:cNvGraphicFramePr>
+            <a:graphic>
+              <a:graphicData uri="http://schemas.openxmlformats.org/drawingml/2006/picture">
+                <pic:pic>
+                  <pic:nvPicPr>
+                    <pic:cNvPr id="0" name="complete_weather.png"/>
+                    <pic:cNvPicPr/>
+                  </pic:nvPicPr>
+                  <pic:blipFill>
+                    <a:blip r:embed="rId12"/>
+                    <a:stretch>
+                      <a:fillRect/>
+                    </a:stretch>
+                  </pic:blipFill>
+                  <pic:spPr>
+                    <a:xfrm>
+                      <a:off x="0" y="0"/>
+                      <a:ext cx="5943600" cy="3985708"/>
+                    </a:xfrm>
+                    <a:prstGeom prst="rect"/>
+                  </pic:spPr>
+                </pic:pic>
+              </a:graphicData>
+            </a:graphic>
+          </wp:inline>
+        </w:drawing>
+      </w:r>
+    </w:p>
+    <w:p>
+      <w:pPr>
+        <w:pStyle w:val="Heading2"/>
+        <w:keepNext/>
+        <w:keepLines/>
+        <w:spacing w:after="120" w:before="160" w:line="240" w:lineRule="auto"/>
+        <w:ind w:firstLine="0"/>
+        <w:jc w:val="left"/>
+      </w:pPr>
+      <w:r>
+        <w:rPr>
+          <w:rFonts w:ascii="Times New Roman" w:hAnsi="Times New Roman" w:eastAsia="Times New Roman"/>
+          <w:b/>
+          <w:i w:val="0"/>
+          <w:sz w:val="23"/>
+        </w:rPr>
+        <w:t>Calendar control and covariance alter the interpretation</w:t>
+      </w:r>
+    </w:p>
+    <w:p>
+      <w:pPr>
+        <w:spacing w:after="160" w:before="0" w:line="240" w:lineRule="auto"/>
+        <w:ind w:firstLine="0"/>
+        <w:jc w:val="left"/>
+      </w:pPr>
+      <w:r>
+        <w:rPr>
+          <w:rFonts w:ascii="Times New Roman" w:hAnsi="Times New Roman" w:eastAsia="Times New Roman"/>
+          <w:b w:val="0"/>
+          <w:i w:val="0"/>
+          <w:sz w:val="23"/>
+        </w:rPr>
+        <w:t>The full-window HF cold-day interval included one under an eight-degree-of-freedom spline, year indicators, or omission of the first twelve or twenty-four months (Fig. 3; Supplementary Table S5). Calendar adjustments therefore affected whether the interval excluded one. Omitting the first months also changed the observations contributing to the fit. COVID-phase intercepts gave a CHD hot-night ratio of 1.013 (0.994–1.033) and an HF cold-day ratio of 1.074 (1.006–1.145). Those intercepts were adjustments within the full series, rather than an independently estimated later period.</w:t>
+      </w:r>
+    </w:p>
+    <w:p>
+      <w:pPr>
+        <w:spacing w:after="160" w:before="0" w:line="240" w:lineRule="auto"/>
+        <w:ind w:firstLine="0"/>
+        <w:jc w:val="left"/>
+      </w:pPr>
+      <w:r>
+        <w:rPr>
+          <w:rFonts w:ascii="Times New Roman" w:hAnsi="Times New Roman" w:eastAsia="Times New Roman"/>
+          <w:b w:val="0"/>
+          <w:i w:val="0"/>
+          <w:sz w:val="23"/>
+        </w:rPr>
+        <w:t>Uncertainty construction changed the interpretation of CHD hot nights while leaving the fitted coefficient unchanged. Its model-based interval was 0.995–1.049 and its HC1 interval 0.997–1.047, whereas the lag-six interval was 1.002–1.042. Pearson residual autocorrelation at lag one was 0.508 for this model. A narrower HAC interval is not itself evidence of an invalid covariance estimate: the sandwich covariance depends on regression-score autocovariances, not residual autocorrelation alone. Residual dependence nevertheless limits confidence in nominal finite-sample uncertainty. Complete intervals and released diagnostics are retained in Supplementary Tables S6 and S7.</w:t>
+      </w:r>
+    </w:p>
+    <w:p>
+      <w:pPr>
+        <w:keepNext/>
+        <w:keepLines/>
+        <w:spacing w:after="120" w:before="0" w:line="240" w:lineRule="auto"/>
+        <w:ind w:firstLine="0"/>
+        <w:jc w:val="left"/>
+      </w:pPr>
+      <w:r>
+        <w:rPr>
+          <w:rFonts w:ascii="Times New Roman" w:hAnsi="Times New Roman" w:eastAsia="Times New Roman"/>
+          <w:b w:val="0"/>
+          <w:i/>
+          <w:sz w:val="21"/>
+        </w:rPr>
+        <w:t>Figure 3. Calendar and uncertainty criticism of two historically discussed associations. Heart failure (HF) cold-day and coronary heart disease (CHD) hot-night ratios are displayed per five official days. Baseline fits cover January 2013–December 2023. Upper panels retain the baseline and six fixed calendar/start-window checks with Newey–West lag-six 95% intervals. Lower panels retain the same baseline coefficient under model-based, HC1, lag-three and lag-six uncertainty constructions. These selected examples reveal specification dependence; they are not a new confirmatory family. Panel ranges differ, and interval overlap or crossing one is not a test of a difference between specifications. The complete calendar panel, including phase-intercept adjustment, and all 48 baseline intervals remain in Supplementary Tables S5 and S6.</w:t>
+      </w:r>
+    </w:p>
+    <w:p>
+      <w:pPr>
+        <w:keepLines/>
+        <w:spacing w:after="160" w:before="0" w:line="240" w:lineRule="auto"/>
+        <w:ind w:firstLine="0"/>
+        <w:jc w:val="center"/>
+      </w:pPr>
+      <w:r>
+        <w:drawing>
+          <wp:inline xmlns:a="http://schemas.openxmlformats.org/drawingml/2006/main" xmlns:pic="http://schemas.openxmlformats.org/drawingml/2006/picture">
+            <wp:extent cx="5943600" cy="4447211"/>
+            <wp:docPr id="3" name="Picture 3"/>
+            <wp:cNvGraphicFramePr>
+              <a:graphicFrameLocks noChangeAspect="1"/>
+            </wp:cNvGraphicFramePr>
+            <a:graphic>
+              <a:graphicData uri="http://schemas.openxmlformats.org/drawingml/2006/picture">
+                <pic:pic>
+                  <pic:nvPicPr>
+                    <pic:cNvPr id="0" name="model_criticism.png"/>
+                    <pic:cNvPicPr/>
+                  </pic:nvPicPr>
+                  <pic:blipFill>
+                    <a:blip r:embed="rId13"/>
+                    <a:stretch>
+                      <a:fillRect/>
+                    </a:stretch>
+                  </pic:blipFill>
+                  <pic:spPr>
+                    <a:xfrm>
+                      <a:off x="0" y="0"/>
+                      <a:ext cx="5943600" cy="4447211"/>
+                    </a:xfrm>
+                    <a:prstGeom prst="rect"/>
+                  </pic:spPr>
+                </pic:pic>
+              </a:graphicData>
+            </a:graphic>
+          </wp:inline>
+        </w:drawing>
+      </w:r>
+    </w:p>
+    <w:p>
+      <w:pPr>
+        <w:pStyle w:val="Heading1"/>
+        <w:keepNext/>
+        <w:keepLines/>
+        <w:spacing w:after="120" w:before="240" w:line="240" w:lineRule="auto"/>
+        <w:ind w:firstLine="0"/>
+        <w:jc w:val="left"/>
+      </w:pPr>
+      <w:r>
+        <w:rPr>
+          <w:rFonts w:ascii="Times New Roman" w:hAnsi="Times New Roman" w:eastAsia="Times New Roman"/>
+          <w:b/>
+          <w:i w:val="0"/>
+          <w:sz w:val="27"/>
+        </w:rPr>
+        <w:t>Discussion</w:t>
+      </w:r>
+    </w:p>
+    <w:p>
+      <w:pPr>
+        <w:spacing w:after="160" w:before="0" w:line="240" w:lineRule="auto"/>
+        <w:ind w:firstLine="0"/>
+        <w:jc w:val="left"/>
+      </w:pPr>
+      <w:r>
+        <w:rPr>
+          <w:rFonts w:ascii="Times New Roman" w:hAnsi="Times New Roman" w:eastAsia="Times New Roman"/>
+          <w:b w:val="0"/>
+          <w:i w:val="0"/>
+          <w:sz w:val="23"/>
+        </w:rPr>
+        <w:t>The observed first-hospitalisation trajectory comprises a decline before 2020, a further fall in 2020 and recovery towards 2019 counts by 2023. Placing these features in one series changes the descriptive comparison: the pandemic-era trough followed a substantial earlier reduction, and the subsequent increase approached the late pre-pandemic level. A comparison against the average of all preceding years would mix those changes with the earlier trend. The annual summaries locate the change in recorded burden, but do not estimate the additional effect of the pandemic.</w:t>
+      </w:r>
+    </w:p>
+    <w:p>
+      <w:pPr>
+        <w:spacing w:after="160" w:before="0" w:line="240" w:lineRule="auto"/>
+        <w:ind w:firstLine="0"/>
+        <w:jc w:val="left"/>
+      </w:pPr>
+      <w:r>
+        <w:rPr>
+          <w:rFonts w:ascii="Times New Roman" w:hAnsi="Times New Roman" w:eastAsia="Times New Roman"/>
+          <w:b w:val="0"/>
+          <w:i w:val="0"/>
+          <w:sz w:val="23"/>
+        </w:rPr>
+        <w:t>The endpoint makes clinical interpretation particularly difficult. A first counted stay follows a diagnosis record, but its admission cause is unavailable. Its frequency depends on diagnosis recording, hospital contact and the people still eligible to contribute a first stay. The schematic in Supplementary Fig. S1 distinguishes those processes. It expresses plausible pathways, not effects estimated here. The early maximum does not prove a first-in-window recording artefact, and the later rebound does not rule out a changing eligible population. A changing count alone cannot determine which observation process changed.</w:t>
+      </w:r>
+    </w:p>
+    <w:p>
+      <w:pPr>
+        <w:spacing w:after="160" w:before="0" w:line="240" w:lineRule="auto"/>
+        <w:ind w:firstLine="0"/>
+        <w:jc w:val="left"/>
+      </w:pPr>
+      <w:r>
+        <w:rPr>
+          <w:rFonts w:ascii="Times New Roman" w:hAnsi="Times New Roman" w:eastAsia="Times New Roman"/>
+          <w:b w:val="0"/>
+          <w:i w:val="0"/>
+          <w:sz w:val="23"/>
+        </w:rPr>
+        <w:t>Care disruption provides a plausible explanation for part of the 2020 fall. Local studies found reduced hospitalisation or emergency attendance alongside higher mortality [1,2]. Closely matched diabetes and hypertension studies examined cardiovascular outcomes together with healthcare use and mortality [3,4]; Hu and colleagues also reported blood-pressure control below pre-pandemic levels among measured patients [4]. These observations challenge a general interpretation of fewer recorded events as improved cardiovascular health. Their estimates cannot be transferred to this series because the endpoint and population contributing events differ.</w:t>
+      </w:r>
+    </w:p>
+    <w:p>
+      <w:pPr>
+        <w:spacing w:after="160" w:before="0" w:line="240" w:lineRule="auto"/>
+        <w:ind w:firstLine="0"/>
+        <w:jc w:val="left"/>
+      </w:pPr>
+      <w:r>
+        <w:rPr>
+          <w:rFonts w:ascii="Times New Roman" w:hAnsi="Times New Roman" w:eastAsia="Times New Roman"/>
+          <w:b w:val="0"/>
+          <w:i w:val="0"/>
+          <w:sz w:val="23"/>
+        </w:rPr>
+        <w:t>Clinical measurements in other settings likewise provide no consistent physiological explanation. Retained diabetes outpatients in Taiwan showed lower HbA1c and fasting glucose after restrictions [6], whereas a Tokyo diabetes cohort showed small adverse changes in glycaemia and lipids [7]. A Hong Kong primary-care study found no evidence of an overall adjusted improvement in HbA1c or blood pressure [8]. Its sampling windows were February–March 2020 and February–March 2021, despite group labels referring to 2019 and 2020; it was neither a clean pre-pandemic comparison nor an individual longitudinal assessment. A small Hong Kong follow-up of COVID-19 survivors with acute dysglycaemia found worsening glycaemic status [9]. These studies preserve both favourable and adverse findings, but attendance, treatment and measurement timing restrict their interpretation.</w:t>
+      </w:r>
+    </w:p>
+    <w:p>
+      <w:pPr>
+        <w:spacing w:after="160" w:before="0" w:line="240" w:lineRule="auto"/>
+        <w:ind w:firstLine="0"/>
+        <w:jc w:val="left"/>
+      </w:pPr>
+      <w:r>
+        <w:rPr>
+          <w:rFonts w:ascii="Times New Roman" w:hAnsi="Times New Roman" w:eastAsia="Times New Roman"/>
+          <w:b w:val="0"/>
+          <w:i w:val="0"/>
+          <w:sz w:val="23"/>
+        </w:rPr>
+        <w:t>Respiratory infection and prevention remain contextual explanations. Hong Kong interventions coincided with reduced influenza transmission in early 2020 [10]. Influenza has been associated with acute myocardial infarction [11], and community influenza-like illness activity with HF hospitalisation [12]. Reduced winter respiratory triggers could therefore affect a cold-day association without changing the direct response to cold. Infection was not measured in this population, and the cited outcomes differ from the supplied first post-diagnosis stay. Vaccinated people with recorded SARS-CoV-2 infection in Hong Kong subsequently had lower observed cardiovascular event risk than unvaccinated infected people [13]. That observational comparison does not establish population-wide baseline improvement, and vaccination cannot account for the 2020 dip that preceded it.</w:t>
+      </w:r>
+    </w:p>
+    <w:p>
+      <w:pPr>
+        <w:spacing w:after="160" w:before="0" w:line="240" w:lineRule="auto"/>
+        <w:ind w:firstLine="0"/>
+        <w:jc w:val="left"/>
+      </w:pPr>
+      <w:r>
+        <w:rPr>
+          <w:rFonts w:ascii="Times New Roman" w:hAnsi="Times New Roman" w:eastAsia="Times New Roman"/>
+          <w:b w:val="0"/>
+          <w:i w:val="0"/>
+          <w:sz w:val="23"/>
+        </w:rPr>
+        <w:t>The continuity-of-care study by Yau and colleagues illustrates both the value and the limits of linked clinical evidence [5]. Patients attended repeatedly and remained alive and free of the study outcomes at a June 2022 landmark. Reduced continuity was associated with later CHD, HF and kidney failure; results for stroke and all-cause mortality were less conclusive. Those findings concern a selected population and a different endpoint. Conditioning on continued attendance, survival or infection status can change who contributes to an analysis. Better measurements among retained patients do not establish better health in everyone originally eligible.</w:t>
+      </w:r>
+    </w:p>
+    <w:p>
+      <w:pPr>
+        <w:spacing w:after="160" w:before="0" w:line="240" w:lineRule="auto"/>
+        <w:ind w:firstLine="0"/>
+        <w:jc w:val="left"/>
+      </w:pPr>
+      <w:r>
+        <w:rPr>
+          <w:rFonts w:ascii="Times New Roman" w:hAnsi="Times New Roman" w:eastAsia="Times New Roman"/>
+          <w:b w:val="0"/>
+          <w:i w:val="0"/>
+          <w:sz w:val="23"/>
+        </w:rPr>
+        <w:t>The weather findings have a similarly bounded role. Adding later years changed coefficients, but also changed exposure support and calendar control. A utilisation or recording change correlated with weather after adjustment could alter a fitted slope without changing physiological susceptibility. Conversely, a stable slope would not establish stable susceptibility. The full-window family, calendar checks and covariance comparisons show how sensitive the associated interpretations are. None supplies a formal period-difference test or a decomposition of the annual burden. Non-rejection after multiplicity adjustment is therefore not evidence that weather was irrelevant.</w:t>
+      </w:r>
+    </w:p>
+    <w:p>
+      <w:pPr>
+        <w:spacing w:after="160" w:before="0" w:line="240" w:lineRule="auto"/>
+        <w:ind w:firstLine="0"/>
+        <w:jc w:val="left"/>
+      </w:pPr>
+      <w:r>
+        <w:rPr>
+          <w:rFonts w:ascii="Times New Roman" w:hAnsi="Times New Roman" w:eastAsia="Times New Roman"/>
+          <w:b w:val="0"/>
+          <w:i w:val="0"/>
+          <w:sz w:val="23"/>
+        </w:rPr>
+        <w:t>Several limitations determine what this analysis can support. Cause-coded events, validated first-event rules, eligible person-time and linked deaths were unavailable; counts cannot be interpreted as disease-specific incidence. Clinical and treatment measurements were absent. Monthly aggregation obscures daily timing, while calendar modelling cannot separate all secular changes in diagnosis, care and recording. The thermal analyses were exploratory, the sensitivity models had no joint multiplicity adjustment, and the nominal uncertainty constructions were not certified by finite-sample calibration. These limitations constrain the contribution to description and model criticism of this particular recorded series.</w:t>
+      </w:r>
+    </w:p>
+    <w:p>
+      <w:pPr>
+        <w:spacing w:after="160" w:before="0" w:line="240" w:lineRule="auto"/>
+        <w:ind w:firstLine="0"/>
+        <w:jc w:val="left"/>
+      </w:pPr>
+      <w:r>
+        <w:rPr>
+          <w:rFonts w:ascii="Times New Roman" w:hAnsi="Times New Roman" w:eastAsia="Times New Roman"/>
+          <w:b w:val="0"/>
+          <w:i w:val="0"/>
+          <w:sz w:val="23"/>
+        </w:rPr>
+        <w:t>The data show a pandemic-era trough within a longer history of changing first-hospitalisation counts. They leave physiological change, care disruption, respiratory co-exposure and altered ascertainment unresolved, with several explanations able to coexist. The distinction between recorded stays and clinical incidence remains essential when interpreting lower hospital use during a health-system disruption.</w:t>
       </w:r>
     </w:p>
     <w:p>
@@ -321,7 +752,7 @@
           <w:i w:val="0"/>
           <w:sz w:val="23"/>
         </w:rPr>
-        <w:t>Design and outcome definition</w:t>
+        <w:t>Design and recorded endpoint</w:t>
       </w:r>
     </w:p>
     <w:p>
@@ -337,7 +768,7 @@
           <w:i w:val="0"/>
           <w:sz w:val="23"/>
         </w:rPr>
-        <w:t>This ecological time-series study covered January 2013 to December 2023. The Hospital Authority transfer comprised one territory-month series for CHD and one for HF, each with 132 months. The supplied definition was the first recorded hospitalisation after a person's first diagnosis record for the relevant cardiovascular disease among patients diagnosed with type 2 diabetes and/or hypertension during 2013–2023. CHD and HF were analysed separately; their counts were not combined into a composite outcome.</w:t>
+        <w:t>This ecological time-series study covered January 2013–December 2023. The Hospital Authority transfer supplied one territory-month series for CHD and one for HF, each containing 132 months. The supplied population comprised people diagnosed with type 2 diabetes and/or hypertension during 2013–2023. For each cardiovascular diagnosis, the counted event was the first recorded hospitalisation after the person's first relevant diagnosis record. CHD and HF were analysed separately; no composite outcome or unique cross-outcome patient total was constructed.</w:t>
       </w:r>
     </w:p>
     <w:p>
@@ -353,7 +784,7 @@
           <w:i w:val="0"/>
           <w:sz w:val="23"/>
         </w:rPr>
-        <w:t>Admission cause was not recorded. The events therefore cannot be interpreted as admissions principally for CHD, HF, acute myocardial infarction or acute coronary syndrome. The transfer did not establish whether the diagnosis episode itself counted as the first hospitalisation or whether a later stay was required. It also did not provide the diagnostic code list, look-back period, washout, entry and exit dates, or separate inpatient, emergency and day-procedure classifications. We retained the supplied first-hospitalisation label without assuming these details. The diagnosis interval does not establish a closed cohort or a monotonically declining population at risk.</w:t>
+        <w:t>The transfer did not record admission cause. The events were therefore not defined as stays principally for CHD, HF, acute myocardial infarction or acute coronary syndrome. The receipt did not establish whether the diagnosis admission itself qualified or a later stay was required. It also did not supply diagnostic code lists, diagnosis setting, look-back/washout, deduplication, inpatient versus day-procedure or emergency classification, or cohort entry and exit rules. The source extraction query was unavailable for verification. We retained the supplied first-hospitalisation definition and did not infer first-ever disease, a closed cohort or a necessarily declining risk set from the diagnosis interval.</w:t>
       </w:r>
     </w:p>
     <w:p>
@@ -369,67 +800,7 @@
           <w:i w:val="0"/>
           <w:sz w:val="23"/>
         </w:rPr>
-        <w:t>Age and sex strata, laboratory measurements, medication records, infection and vaccination histories, and person-time at risk were unavailable. This study therefore estimated recorded burden and ecological count associations, rather than individual disease incidence or physiological change.</w:t>
-      </w:r>
-    </w:p>
-    <w:p>
-      <w:pPr>
-        <w:keepNext/>
-        <w:keepLines/>
-        <w:spacing w:after="120" w:before="0" w:line="240" w:lineRule="auto"/>
-        <w:ind w:firstLine="0"/>
-        <w:jc w:val="left"/>
-      </w:pPr>
-      <w:r>
-        <w:rPr>
-          <w:rFonts w:ascii="Times New Roman" w:hAnsi="Times New Roman" w:eastAsia="Times New Roman"/>
-          <w:b w:val="0"/>
-          <w:i/>
-          <w:sz w:val="21"/>
-        </w:rPr>
-        <w:t>Figure 1. Observation processes underlying the recorded outcome. Conceptual diagram of how disease, diagnosis recording, care contact and extraction rules can affect a first counted stay. Arrows denote plausible pathways, not effects identified by this study. The counted stay is not validated as an admission principally for CHD or HF. Eligible person-time, clinical measurements and linked deaths were not supplied; no numerical cohort flow is inferred.</w:t>
-      </w:r>
-    </w:p>
-    <w:p>
-      <w:pPr>
-        <w:keepLines/>
-        <w:spacing w:after="160" w:before="0" w:line="240" w:lineRule="auto"/>
-        <w:ind w:firstLine="0"/>
-        <w:jc w:val="center"/>
-      </w:pPr>
-      <w:r>
-        <w:drawing>
-          <wp:inline xmlns:a="http://schemas.openxmlformats.org/drawingml/2006/main" xmlns:pic="http://schemas.openxmlformats.org/drawingml/2006/picture">
-            <wp:extent cx="5577840" cy="2853842"/>
-            <wp:docPr id="1" name="Picture 1"/>
-            <wp:cNvGraphicFramePr>
-              <a:graphicFrameLocks noChangeAspect="1"/>
-            </wp:cNvGraphicFramePr>
-            <a:graphic>
-              <a:graphicData uri="http://schemas.openxmlformats.org/drawingml/2006/picture">
-                <pic:pic>
-                  <pic:nvPicPr>
-                    <pic:cNvPr id="0" name="figure_observation_process_20261002.png"/>
-                    <pic:cNvPicPr/>
-                  </pic:nvPicPr>
-                  <pic:blipFill>
-                    <a:blip r:embed="rId11"/>
-                    <a:stretch>
-                      <a:fillRect/>
-                    </a:stretch>
-                  </pic:blipFill>
-                  <pic:spPr>
-                    <a:xfrm>
-                      <a:off x="0" y="0"/>
-                      <a:ext cx="5577840" cy="2853842"/>
-                    </a:xfrm>
-                    <a:prstGeom prst="rect"/>
-                  </pic:spPr>
-                </pic:pic>
-              </a:graphicData>
-            </a:graphic>
-          </wp:inline>
-        </w:drawing>
+        <w:t>Eligible person-time, linked death/exit information, age and sex strata, laboratory measurements, medication records and infection/vaccination histories were unavailable. The analytical unit was a monthly count, not an individual patient. The event totals describe recorded burden in the supplied construction; the same person could contribute to the separate CHD and HF series, with cross-outcome overlap unknown.</w:t>
       </w:r>
     </w:p>
     <w:p>
@@ -448,7 +819,7 @@
           <w:i w:val="0"/>
           <w:sz w:val="23"/>
         </w:rPr>
-        <w:t>Weather data</w:t>
+        <w:t>Environmental measurements</w:t>
       </w:r>
     </w:p>
     <w:p>
@@ -676,7 +1047,23 @@
           <w:i w:val="0"/>
           <w:sz w:val="23"/>
         </w:rPr>
-        <w:t>For the modelled official-day variables, each monthly exposure was the sum of daily threshold indicators. The five-day reporting scale did not require consecutive days. Continuous temperature measures were monthly means; rainfall, where assembled, was a monthly total. Thus averaging applies to continuous mean variables, not to threshold-day counts or rainfall totals. Pollutant and influenza series were available in the wider project but were not included in the baseline models reported here. No physiological measurements were inferred from environmental series.</w:t>
+        <w:t>For modelled official-day variables, each monthly exposure was the sum of daily threshold indicators. The five-day reporting scale did not require consecutive days. Continuous temperature measures were monthly means and rainfall, where assembled, was a monthly total. Averaging therefore applies to continuous mean variables, rather than threshold-day counts or rainfall totals. The reported baseline panel comprised mean temperature, mean daily maximum temperature, mean daily minimum temperature, hot nights, very hot days and cold days. The wider project's pollutant and influenza series were not included in these baseline models. Environmental data were not used as a substitute for clinical measurements.</w:t>
+      </w:r>
+    </w:p>
+    <w:p>
+      <w:pPr>
+        <w:spacing w:after="160" w:before="0" w:line="240" w:lineRule="auto"/>
+        <w:ind w:firstLine="0"/>
+        <w:jc w:val="left"/>
+      </w:pPr>
+      <w:r>
+        <w:rPr>
+          <w:rFonts w:ascii="Times New Roman" w:hAnsi="Times New Roman" w:eastAsia="Times New Roman"/>
+          <w:b w:val="0"/>
+          <w:i w:val="0"/>
+          <w:sz w:val="23"/>
+        </w:rPr>
+        <w:t>Daily Hong Kong HF admissions and unplanned emergency admissions have been studied in relation to meteorological exposures [14,15]. Those studies provided thermal context, but their temporal resolution and cause-coded or care-setting definitions differed from this monthly first-hospitalisation construction. We did not interpret the monthly coefficients as daily triggering effects, duration thresholds or heatwave excess mortality.</w:t>
       </w:r>
     </w:p>
     <w:p>
@@ -711,7 +1098,7 @@
           <w:i w:val="0"/>
           <w:sz w:val="23"/>
         </w:rPr>
-        <w:t>We summarised annual first-hospitalisation totals and monthly means for three disjoint periods: 2013–2019, 2020–2022 and 2023. The latter was described separately to show the end-of-series trajectory; it was not treated as an unexposed control period. Annual percentage differences relative to 2019 were arithmetic comparisons, without trend adjustment or a causal interpretation. We did not use the average of all pre-2020 years as a counterfactual for 2020 because counts were already declining over that interval.</w:t>
+        <w:t>We summarised the annual counts and monthly means for three disjoint periods: 2013–2019, 2020–2022 and 2023. The final year was presented separately to show the end-of-series trajectory; it was not an unexposed control period. Annual percentage differences were calculated relative to 2019 from the recorded totals. No eligible-population standardisation, trend-adjusted counterfactual or uncertainty interval was assigned to those descriptive arithmetic comparisons. General-population denominators in older project summaries were omitted because they do not define the eligible first-event population.</w:t>
       </w:r>
     </w:p>
     <w:p>
@@ -730,7 +1117,7 @@
           <w:i w:val="0"/>
           <w:sz w:val="23"/>
         </w:rPr>
-        <w:t>Thermal models and estimands</w:t>
+        <w:t>Weather models and reporting units</w:t>
       </w:r>
     </w:p>
     <w:p>
@@ -746,24 +1133,126 @@
           <w:i w:val="0"/>
           <w:sz w:val="23"/>
         </w:rPr>
-        <w:t>For each outcome, we fitted a separate negative-binomial regression for monthly mean temperature, mean daily maximum temperature, mean daily minimum temperature, hot nights, very hot days and cold days. The model was:</w:t>
+        <w:t>For each outcome, a separate negative-binomial model was fitted for each of the six exposures. The log mean monthly count included the log number of days in the month as an offset, calendar-month indicators and a natural cubic spline of calendar time with four degrees of freedom. January was the reference calendar month. Each model contained one exposure, rather than a joint temperature/extreme-day panel.</w:t>
       </w:r>
     </w:p>
     <w:p>
       <w:pPr>
         <w:keepNext/>
+        <w:jc w:val="center"/>
+      </w:pPr>
+      <m:oMath>
+        <m:r>
+          <m:t>log E(</m:t>
+        </m:r>
+        <m:sSub>
+          <m:e>
+            <m:r>
+              <m:t>Y</m:t>
+            </m:r>
+          </m:e>
+          <m:sub>
+            <m:r>
+              <m:t>t</m:t>
+            </m:r>
+          </m:sub>
+        </m:sSub>
+        <m:r>
+          <m:t>) = log(</m:t>
+        </m:r>
+        <m:sSub>
+          <m:e>
+            <m:r>
+              <m:t>d</m:t>
+            </m:r>
+          </m:e>
+          <m:sub>
+            <m:r>
+              <m:t>t</m:t>
+            </m:r>
+          </m:sub>
+        </m:sSub>
+        <m:r>
+          <m:t>) + α + β</m:t>
+        </m:r>
+        <m:sSub>
+          <m:e>
+            <m:r>
+              <m:t>X</m:t>
+            </m:r>
+          </m:e>
+          <m:sub>
+            <m:r>
+              <m:t>t</m:t>
+            </m:r>
+          </m:sub>
+        </m:sSub>
+        <m:r>
+          <m:t> + </m:t>
+        </m:r>
+        <m:sSubSup>
+          <m:e>
+            <m:r>
+              <m:t>Σ</m:t>
+            </m:r>
+          </m:e>
+          <m:sub>
+            <m:r>
+              <m:t>m = 2</m:t>
+            </m:r>
+          </m:sub>
+          <m:sup>
+            <m:r>
+              <m:t>12</m:t>
+            </m:r>
+          </m:sup>
+        </m:sSubSup>
+        <m:sSub>
+          <m:e>
+            <m:r>
+              <m:t>γ</m:t>
+            </m:r>
+          </m:e>
+          <m:sub>
+            <m:r>
+              <m:t>m</m:t>
+            </m:r>
+          </m:sub>
+        </m:sSub>
+        <m:r>
+          <m:t> I(</m:t>
+        </m:r>
+        <m:sSub>
+          <m:e>
+            <m:r>
+              <m:t>month</m:t>
+            </m:r>
+          </m:e>
+          <m:sub>
+            <m:r>
+              <m:t>t</m:t>
+            </m:r>
+          </m:sub>
+        </m:sSub>
+        <m:r>
+          <m:t> = m) + s(t; 4 df).   (1)</m:t>
+        </m:r>
+      </m:oMath>
+    </w:p>
+    <w:p>
+      <w:pPr>
         <w:spacing w:after="160" w:before="0" w:line="240" w:lineRule="auto"/>
         <w:ind w:firstLine="0"/>
-        <w:jc w:val="center"/>
+        <w:jc w:val="left"/>
       </w:pPr>
       <w:r>
         <w:rPr>
           <w:rFonts w:ascii="Times New Roman" w:hAnsi="Times New Roman" w:eastAsia="Times New Roman"/>
           <w:b w:val="0"/>
           <w:i w:val="0"/>
-          <w:sz w:val="22"/>
+          <w:sz w:val="23"/>
         </w:rPr>
-        <w:t>log E(Yₜ) = log(dₜ) + α + βXₜ + Σₘ₌₂¹² γₘ I(monthₜ = m) + s(t; 4 df).  (1)</w:t>
+        <w:t>Here Yₜ is the monthly first-hospitalisation count, dₜ is days in that month, Xₜ is one exposure, and s(t; 4 df) represents the time spline. Exponentiated exposure coefficients were reported per 1°C for continuous measures and per five additional official days. The days offset controls calendar duration; it does not supply the eligible person-time denominator needed for incidence rates. Coefficients are conditional count ratios for the supplied ecological series.</w:t>
       </w:r>
     </w:p>
     <w:p>
@@ -779,23 +1268,7 @@
           <w:i w:val="0"/>
           <w:sz w:val="23"/>
         </w:rPr>
-        <w:t>Here Yₜ is the monthly first-hospitalisation count, dₜ is the number of days in that month, Xₜ is one weather exposure, and s(t; 4 df) is a natural cubic spline of calendar time with four degrees of freedom. January was the reference calendar month. We reported exp(β) per 1°C for continuous temperature or per five additional official days. The offset accounts for month length. It does not supply the eligible person-time denominator needed for incidence rates. General-population counts are not a substitute for that denominator.</w:t>
-      </w:r>
-    </w:p>
-    <w:p>
-      <w:pPr>
-        <w:spacing w:after="160" w:before="0" w:line="240" w:lineRule="auto"/>
-        <w:ind w:firstLine="0"/>
-        <w:jc w:val="left"/>
-      </w:pPr>
-      <w:r>
-        <w:rPr>
-          <w:rFonts w:ascii="Times New Roman" w:hAnsi="Times New Roman" w:eastAsia="Times New Roman"/>
-          <w:b w:val="0"/>
-          <w:i w:val="0"/>
-          <w:sz w:val="23"/>
-        </w:rPr>
-        <w:t>We refitted the specification on January 2013–December 2019. These 84 months are contained within the full 132 months. The natural spline basis, including its knots and boundaries, was recalculated on the subset. Consequently, the two fitted coefficients differ in both sample and calendar control. Their difference is not an estimated pre/post effect. Neither overlap of confidence intervals nor a change in whether an interval contains one constitutes a test of such a difference. No 2020–2023-only model or exposure-by-period interaction was available.</w:t>
+        <w:t>The same specification was refitted on January 2013–December 2019. The natural spline's knots and boundary basis were reconstructed on those 84 months. The nested and full fits consequently differ in observations, exposure support and temporal basis. Their coefficients were retained as analysis-window sensitivities, not subtracted to estimate a period effect. No 2020–2023-only model or exposure-by-period interaction was available. Interval overlap and a change in whether an interval contains one were not tests of a window difference.</w:t>
       </w:r>
     </w:p>
     <w:p>
@@ -830,7 +1303,7 @@
           <w:i w:val="0"/>
           <w:sz w:val="23"/>
         </w:rPr>
-        <w:t>We reported model-based, HC1 and Newey–West confidence intervals with lags of three and six months [5]. Newey–West calculations used no prewhitening and included the finite-sample adjustment. Lag-six intervals were the common display convention across the panel. Benjamini–Hochberg adjustment covered the twelve full-window lag-six Wald p-values [6]. Nested fits and other sensitivity models were outside that multiplicity family and remained exploratory.</w:t>
+        <w:t>Confidence intervals were reported from the model covariance, HC1 covariance and Newey–West covariance with three- and six-month lags [16]. The Newey–West calculations used no prewhitening and applied the finite-sample adjustment. Lag-six intervals were the common display convention. Benjamini–Hochberg adjustment covered the twelve full-window lag-six Wald p-values [17]. That family included both outcomes and all six exposures. Other covariance constructions, nested fits and calendar sensitivities remained exploratory and outside that adjusted family.</w:t>
       </w:r>
     </w:p>
     <w:p>
@@ -846,7 +1319,23 @@
           <w:i w:val="0"/>
           <w:sz w:val="23"/>
         </w:rPr>
-        <w:t>Calendar sensitivity replaced the four-degree-of-freedom spline with three, six or eight degrees of freedom or year indicators, omitted the first twelve or twenty-four months, or added full-sample COVID-phase intercepts. The five intercept periods ended in January 2020, December 2021, April 2022 and December 2022, with the last beginning in January 2023. These adjustments were not independent period estimates. Pearson residual autocorrelation and Ljung–Box statistics were examined as model diagnostics. We did not select a calendar or uncertainty specification because its interval excluded one. Analyses used R, MASS negative-binomial regression, natural splines and sandwich covariance estimators.</w:t>
+        <w:t>Existing calendar checks replaced the four-degree-of-freedom time spline with three, six or eight degrees of freedom or year indicators; omitted the first twelve or twenty-four months; or added COVID-phase intercepts in the full series. The five intercept periods ended in January 2020, December 2021, April 2022 and December 2022, with the last beginning in January 2023. These intercepts did not form a separately fitted later-era series. Calendar and omission alternatives were reported together rather than selected according to interval exclusion.</w:t>
+      </w:r>
+    </w:p>
+    <w:p>
+      <w:pPr>
+        <w:spacing w:after="160" w:before="0" w:line="240" w:lineRule="auto"/>
+        <w:ind w:firstLine="0"/>
+        <w:jc w:val="left"/>
+      </w:pPr>
+      <w:r>
+        <w:rPr>
+          <w:rFonts w:ascii="Times New Roman" w:hAnsi="Times New Roman" w:eastAsia="Times New Roman"/>
+          <w:b w:val="0"/>
+          <w:i w:val="0"/>
+          <w:sz w:val="23"/>
+        </w:rPr>
+        <w:t>The displayed model-criticism examples were HF cold days and CHD hot nights, which had been discussed in the preceding exploratory analysis. Their selection for display did not establish a new inferential family. All official-day calendar results and all baseline uncertainty constructions were retained in the supplement. Released diagnostics comprised convergence, negative-binomial dispersion parameter, Pearson dispersion, residual autocorrelation and Ljung–Box statistics. Residual statistics were not treated as a substitute for score-based covariance assessment or simulation calibration. Analyses used R, MASS negative-binomial regression, natural splines and sandwich covariance estimators.</w:t>
       </w:r>
     </w:p>
     <w:p>
@@ -865,26 +1354,7 @@
           <w:i w:val="0"/>
           <w:sz w:val="27"/>
         </w:rPr>
-        <w:t>Results</w:t>
-      </w:r>
-    </w:p>
-    <w:p>
-      <w:pPr>
-        <w:pStyle w:val="Heading2"/>
-        <w:keepNext/>
-        <w:keepLines/>
-        <w:spacing w:after="120" w:before="160" w:line="240" w:lineRule="auto"/>
-        <w:ind w:firstLine="0"/>
-        <w:jc w:val="left"/>
-      </w:pPr>
-      <w:r>
-        <w:rPr>
-          <w:rFonts w:ascii="Times New Roman" w:hAnsi="Times New Roman" w:eastAsia="Times New Roman"/>
-          <w:b/>
-          <w:i w:val="0"/>
-          <w:sz w:val="23"/>
-        </w:rPr>
-        <w:t>Recorded counts before and during the pandemic</w:t>
+        <w:t>Data availability</w:t>
       </w:r>
     </w:p>
     <w:p>
@@ -900,2405 +1370,7 @@
           <w:i w:val="0"/>
           <w:sz w:val="23"/>
         </w:rPr>
-        <w:t>The series contained 156,156 first recorded hospitalisations after CHD diagnosis and 29,681 after HF diagnosis. Annual counts fell from 23,830 to 12,396 for CHD and from 4,336 to 2,344 for HF between 2013 and 2019 (Table 1). A substantial decline therefore preceded the pandemic.</w:t>
-      </w:r>
-    </w:p>
-    <w:p>
-      <w:pPr>
-        <w:spacing w:after="160" w:before="0" w:line="240" w:lineRule="auto"/>
-        <w:ind w:firstLine="0"/>
-        <w:jc w:val="left"/>
-      </w:pPr>
-      <w:r>
-        <w:rPr>
-          <w:rFonts w:ascii="Times New Roman" w:hAnsi="Times New Roman" w:eastAsia="Times New Roman"/>
-          <w:b w:val="0"/>
-          <w:i w:val="0"/>
-          <w:sz w:val="23"/>
-        </w:rPr>
-        <w:t>Counts fell further in 2020, to 10,237 for CHD and 1,964 for HF. These totals were 17.4% and 16.2% below 2019. Both series rose in 2021, fell in 2022 and rose again in 2023. By 2023, CHD and HF totals were 12,323 and 2,296, respectively: 0.6% and 2.0% below 2019. Counts returned towards the late pre-pandemic level rather than the much higher 2013 level (Figure 2).</w:t>
-      </w:r>
-    </w:p>
-    <w:p>
-      <w:pPr>
-        <w:keepNext/>
-        <w:keepLines/>
-        <w:spacing w:after="120" w:before="0" w:line="240" w:lineRule="auto"/>
-        <w:ind w:firstLine="0"/>
-        <w:jc w:val="left"/>
-      </w:pPr>
-      <w:r>
-        <w:rPr>
-          <w:rFonts w:ascii="Times New Roman" w:hAnsi="Times New Roman" w:eastAsia="Times New Roman"/>
-          <w:b w:val="0"/>
-          <w:i/>
-          <w:sz w:val="21"/>
-        </w:rPr>
-        <w:t>Table 1. Annual recorded first hospitalisation counts. Each event is a first recorded hospitalisation after the relevant diagnosis in the supplied type 2 diabetes and/or hypertension population. Admission cause was unavailable. These are counts, not incidence rates.</w:t>
-      </w:r>
-    </w:p>
-    <w:tbl>
-      <w:tblPr>
-        <w:tblStyle w:val="TableGrid"/>
-        <w:tblLayout w:type="fixed"/>
-        <w:tblLook w:firstColumn="1" w:firstRow="1" w:lastColumn="0" w:lastRow="0" w:noHBand="0" w:noVBand="1" w:val="04A0"/>
-        <w:tblW w:w="5000" w:type="pct"/>
-        <w:tblLayout w:type="fixed"/>
-        <w:tblBorders>
-          <w:top w:val="single" w:sz="4" w:color="D9D9D9"/>
-          <w:left w:val="single" w:sz="4" w:color="D9D9D9"/>
-          <w:bottom w:val="single" w:sz="4" w:color="D9D9D9"/>
-          <w:right w:val="single" w:sz="4" w:color="D9D9D9"/>
-          <w:insideH w:val="single" w:sz="4" w:color="D9D9D9"/>
-          <w:insideV w:val="single" w:sz="4" w:color="D9D9D9"/>
-        </w:tblBorders>
-      </w:tblPr>
-      <w:tblGrid>
-        <w:gridCol w:w="1007"/>
-        <w:gridCol w:w="3888"/>
-        <w:gridCol w:w="3888"/>
-      </w:tblGrid>
-      <w:tr>
-        <w:trPr>
-          <w:cantSplit/>
-          <w:tblHeader/>
-        </w:trPr>
-        <w:tc>
-          <w:tcPr>
-            <w:tcW w:type="dxa" w:w="1008"/>
-            <w:tcMar>
-              <w:top w:w="40" w:type="dxa"/>
-              <w:left w:w="55" w:type="dxa"/>
-              <w:bottom w:w="40" w:type="dxa"/>
-              <w:right w:w="55" w:type="dxa"/>
-            </w:tcMar>
-          </w:tcPr>
-          <w:p>
-            <w:pPr>
-              <w:keepNext/>
-              <w:keepLines/>
-              <w:spacing w:after="20" w:before="20" w:line="240" w:lineRule="auto"/>
-              <w:ind w:firstLine="0"/>
-              <w:jc w:val="left"/>
-            </w:pPr>
-            <w:r/>
-            <w:r>
-              <w:rPr>
-                <w:rFonts w:ascii="Times New Roman" w:hAnsi="Times New Roman" w:eastAsia="Times New Roman"/>
-                <w:b/>
-                <w:i w:val="0"/>
-                <w:sz w:val="19"/>
-              </w:rPr>
-              <w:t>Year</w:t>
-            </w:r>
-          </w:p>
-        </w:tc>
-        <w:tc>
-          <w:tcPr>
-            <w:tcW w:type="dxa" w:w="3888"/>
-            <w:tcMar>
-              <w:top w:w="40" w:type="dxa"/>
-              <w:left w:w="55" w:type="dxa"/>
-              <w:bottom w:w="40" w:type="dxa"/>
-              <w:right w:w="55" w:type="dxa"/>
-            </w:tcMar>
-          </w:tcPr>
-          <w:p>
-            <w:pPr>
-              <w:keepNext/>
-              <w:keepLines/>
-              <w:spacing w:after="20" w:before="20" w:line="240" w:lineRule="auto"/>
-              <w:ind w:firstLine="0"/>
-              <w:jc w:val="left"/>
-            </w:pPr>
-            <w:r/>
-            <w:r>
-              <w:rPr>
-                <w:rFonts w:ascii="Times New Roman" w:hAnsi="Times New Roman" w:eastAsia="Times New Roman"/>
-                <w:b/>
-                <w:i w:val="0"/>
-                <w:sz w:val="19"/>
-              </w:rPr>
-              <w:t>CHD first hospitalisations</w:t>
-            </w:r>
-          </w:p>
-        </w:tc>
-        <w:tc>
-          <w:tcPr>
-            <w:tcW w:type="dxa" w:w="3888"/>
-            <w:tcMar>
-              <w:top w:w="40" w:type="dxa"/>
-              <w:left w:w="55" w:type="dxa"/>
-              <w:bottom w:w="40" w:type="dxa"/>
-              <w:right w:w="55" w:type="dxa"/>
-            </w:tcMar>
-          </w:tcPr>
-          <w:p>
-            <w:pPr>
-              <w:keepNext/>
-              <w:keepLines/>
-              <w:spacing w:after="20" w:before="20" w:line="240" w:lineRule="auto"/>
-              <w:ind w:firstLine="0"/>
-              <w:jc w:val="left"/>
-            </w:pPr>
-            <w:r/>
-            <w:r>
-              <w:rPr>
-                <w:rFonts w:ascii="Times New Roman" w:hAnsi="Times New Roman" w:eastAsia="Times New Roman"/>
-                <w:b/>
-                <w:i w:val="0"/>
-                <w:sz w:val="19"/>
-              </w:rPr>
-              <w:t>HF first hospitalisations</w:t>
-            </w:r>
-          </w:p>
-        </w:tc>
-      </w:tr>
-      <w:tr>
-        <w:trPr>
-          <w:cantSplit/>
-        </w:trPr>
-        <w:tc>
-          <w:tcPr>
-            <w:tcW w:type="dxa" w:w="1008"/>
-            <w:tcMar>
-              <w:top w:w="40" w:type="dxa"/>
-              <w:left w:w="55" w:type="dxa"/>
-              <w:bottom w:w="40" w:type="dxa"/>
-              <w:right w:w="55" w:type="dxa"/>
-            </w:tcMar>
-          </w:tcPr>
-          <w:p>
-            <w:pPr>
-              <w:keepNext/>
-              <w:keepLines/>
-              <w:spacing w:after="20" w:before="20" w:line="240" w:lineRule="auto"/>
-              <w:ind w:firstLine="0"/>
-              <w:jc w:val="left"/>
-            </w:pPr>
-            <w:r/>
-            <w:r>
-              <w:rPr>
-                <w:rFonts w:ascii="Times New Roman" w:hAnsi="Times New Roman" w:eastAsia="Times New Roman"/>
-                <w:b w:val="0"/>
-                <w:i w:val="0"/>
-                <w:sz w:val="19"/>
-              </w:rPr>
-              <w:t>2013</w:t>
-            </w:r>
-          </w:p>
-        </w:tc>
-        <w:tc>
-          <w:tcPr>
-            <w:tcW w:type="dxa" w:w="3888"/>
-            <w:tcMar>
-              <w:top w:w="40" w:type="dxa"/>
-              <w:left w:w="55" w:type="dxa"/>
-              <w:bottom w:w="40" w:type="dxa"/>
-              <w:right w:w="55" w:type="dxa"/>
-            </w:tcMar>
-          </w:tcPr>
-          <w:p>
-            <w:pPr>
-              <w:keepNext/>
-              <w:keepLines/>
-              <w:spacing w:after="20" w:before="20" w:line="240" w:lineRule="auto"/>
-              <w:ind w:firstLine="0"/>
-              <w:jc w:val="left"/>
-            </w:pPr>
-            <w:r/>
-            <w:r>
-              <w:rPr>
-                <w:rFonts w:ascii="Times New Roman" w:hAnsi="Times New Roman" w:eastAsia="Times New Roman"/>
-                <w:b w:val="0"/>
-                <w:i w:val="0"/>
-                <w:sz w:val="19"/>
-              </w:rPr>
-              <w:t>23,830</w:t>
-            </w:r>
-          </w:p>
-        </w:tc>
-        <w:tc>
-          <w:tcPr>
-            <w:tcW w:type="dxa" w:w="3888"/>
-            <w:tcMar>
-              <w:top w:w="40" w:type="dxa"/>
-              <w:left w:w="55" w:type="dxa"/>
-              <w:bottom w:w="40" w:type="dxa"/>
-              <w:right w:w="55" w:type="dxa"/>
-            </w:tcMar>
-          </w:tcPr>
-          <w:p>
-            <w:pPr>
-              <w:keepNext/>
-              <w:keepLines/>
-              <w:spacing w:after="20" w:before="20" w:line="240" w:lineRule="auto"/>
-              <w:ind w:firstLine="0"/>
-              <w:jc w:val="left"/>
-            </w:pPr>
-            <w:r/>
-            <w:r>
-              <w:rPr>
-                <w:rFonts w:ascii="Times New Roman" w:hAnsi="Times New Roman" w:eastAsia="Times New Roman"/>
-                <w:b w:val="0"/>
-                <w:i w:val="0"/>
-                <w:sz w:val="19"/>
-              </w:rPr>
-              <w:t>4,336</w:t>
-            </w:r>
-          </w:p>
-        </w:tc>
-      </w:tr>
-      <w:tr>
-        <w:trPr>
-          <w:cantSplit/>
-        </w:trPr>
-        <w:tc>
-          <w:tcPr>
-            <w:tcW w:type="dxa" w:w="1008"/>
-            <w:tcMar>
-              <w:top w:w="40" w:type="dxa"/>
-              <w:left w:w="55" w:type="dxa"/>
-              <w:bottom w:w="40" w:type="dxa"/>
-              <w:right w:w="55" w:type="dxa"/>
-            </w:tcMar>
-          </w:tcPr>
-          <w:p>
-            <w:pPr>
-              <w:keepNext/>
-              <w:keepLines/>
-              <w:spacing w:after="20" w:before="20" w:line="240" w:lineRule="auto"/>
-              <w:ind w:firstLine="0"/>
-              <w:jc w:val="left"/>
-            </w:pPr>
-            <w:r/>
-            <w:r>
-              <w:rPr>
-                <w:rFonts w:ascii="Times New Roman" w:hAnsi="Times New Roman" w:eastAsia="Times New Roman"/>
-                <w:b w:val="0"/>
-                <w:i w:val="0"/>
-                <w:sz w:val="19"/>
-              </w:rPr>
-              <w:t>2014</w:t>
-            </w:r>
-          </w:p>
-        </w:tc>
-        <w:tc>
-          <w:tcPr>
-            <w:tcW w:type="dxa" w:w="3888"/>
-            <w:tcMar>
-              <w:top w:w="40" w:type="dxa"/>
-              <w:left w:w="55" w:type="dxa"/>
-              <w:bottom w:w="40" w:type="dxa"/>
-              <w:right w:w="55" w:type="dxa"/>
-            </w:tcMar>
-          </w:tcPr>
-          <w:p>
-            <w:pPr>
-              <w:keepNext/>
-              <w:keepLines/>
-              <w:spacing w:after="20" w:before="20" w:line="240" w:lineRule="auto"/>
-              <w:ind w:firstLine="0"/>
-              <w:jc w:val="left"/>
-            </w:pPr>
-            <w:r/>
-            <w:r>
-              <w:rPr>
-                <w:rFonts w:ascii="Times New Roman" w:hAnsi="Times New Roman" w:eastAsia="Times New Roman"/>
-                <w:b w:val="0"/>
-                <w:i w:val="0"/>
-                <w:sz w:val="19"/>
-              </w:rPr>
-              <w:t>17,760</w:t>
-            </w:r>
-          </w:p>
-        </w:tc>
-        <w:tc>
-          <w:tcPr>
-            <w:tcW w:type="dxa" w:w="3888"/>
-            <w:tcMar>
-              <w:top w:w="40" w:type="dxa"/>
-              <w:left w:w="55" w:type="dxa"/>
-              <w:bottom w:w="40" w:type="dxa"/>
-              <w:right w:w="55" w:type="dxa"/>
-            </w:tcMar>
-          </w:tcPr>
-          <w:p>
-            <w:pPr>
-              <w:keepNext/>
-              <w:keepLines/>
-              <w:spacing w:after="20" w:before="20" w:line="240" w:lineRule="auto"/>
-              <w:ind w:firstLine="0"/>
-              <w:jc w:val="left"/>
-            </w:pPr>
-            <w:r/>
-            <w:r>
-              <w:rPr>
-                <w:rFonts w:ascii="Times New Roman" w:hAnsi="Times New Roman" w:eastAsia="Times New Roman"/>
-                <w:b w:val="0"/>
-                <w:i w:val="0"/>
-                <w:sz w:val="19"/>
-              </w:rPr>
-              <w:t>3,675</w:t>
-            </w:r>
-          </w:p>
-        </w:tc>
-      </w:tr>
-      <w:tr>
-        <w:trPr>
-          <w:cantSplit/>
-        </w:trPr>
-        <w:tc>
-          <w:tcPr>
-            <w:tcW w:type="dxa" w:w="1008"/>
-            <w:tcMar>
-              <w:top w:w="40" w:type="dxa"/>
-              <w:left w:w="55" w:type="dxa"/>
-              <w:bottom w:w="40" w:type="dxa"/>
-              <w:right w:w="55" w:type="dxa"/>
-            </w:tcMar>
-          </w:tcPr>
-          <w:p>
-            <w:pPr>
-              <w:keepNext/>
-              <w:keepLines/>
-              <w:spacing w:after="20" w:before="20" w:line="240" w:lineRule="auto"/>
-              <w:ind w:firstLine="0"/>
-              <w:jc w:val="left"/>
-            </w:pPr>
-            <w:r/>
-            <w:r>
-              <w:rPr>
-                <w:rFonts w:ascii="Times New Roman" w:hAnsi="Times New Roman" w:eastAsia="Times New Roman"/>
-                <w:b w:val="0"/>
-                <w:i w:val="0"/>
-                <w:sz w:val="19"/>
-              </w:rPr>
-              <w:t>2015</w:t>
-            </w:r>
-          </w:p>
-        </w:tc>
-        <w:tc>
-          <w:tcPr>
-            <w:tcW w:type="dxa" w:w="3888"/>
-            <w:tcMar>
-              <w:top w:w="40" w:type="dxa"/>
-              <w:left w:w="55" w:type="dxa"/>
-              <w:bottom w:w="40" w:type="dxa"/>
-              <w:right w:w="55" w:type="dxa"/>
-            </w:tcMar>
-          </w:tcPr>
-          <w:p>
-            <w:pPr>
-              <w:keepNext/>
-              <w:keepLines/>
-              <w:spacing w:after="20" w:before="20" w:line="240" w:lineRule="auto"/>
-              <w:ind w:firstLine="0"/>
-              <w:jc w:val="left"/>
-            </w:pPr>
-            <w:r/>
-            <w:r>
-              <w:rPr>
-                <w:rFonts w:ascii="Times New Roman" w:hAnsi="Times New Roman" w:eastAsia="Times New Roman"/>
-                <w:b w:val="0"/>
-                <w:i w:val="0"/>
-                <w:sz w:val="19"/>
-              </w:rPr>
-              <w:t>15,411</w:t>
-            </w:r>
-          </w:p>
-        </w:tc>
-        <w:tc>
-          <w:tcPr>
-            <w:tcW w:type="dxa" w:w="3888"/>
-            <w:tcMar>
-              <w:top w:w="40" w:type="dxa"/>
-              <w:left w:w="55" w:type="dxa"/>
-              <w:bottom w:w="40" w:type="dxa"/>
-              <w:right w:w="55" w:type="dxa"/>
-            </w:tcMar>
-          </w:tcPr>
-          <w:p>
-            <w:pPr>
-              <w:keepNext/>
-              <w:keepLines/>
-              <w:spacing w:after="20" w:before="20" w:line="240" w:lineRule="auto"/>
-              <w:ind w:firstLine="0"/>
-              <w:jc w:val="left"/>
-            </w:pPr>
-            <w:r/>
-            <w:r>
-              <w:rPr>
-                <w:rFonts w:ascii="Times New Roman" w:hAnsi="Times New Roman" w:eastAsia="Times New Roman"/>
-                <w:b w:val="0"/>
-                <w:i w:val="0"/>
-                <w:sz w:val="19"/>
-              </w:rPr>
-              <w:t>2,934</w:t>
-            </w:r>
-          </w:p>
-        </w:tc>
-      </w:tr>
-      <w:tr>
-        <w:trPr>
-          <w:cantSplit/>
-        </w:trPr>
-        <w:tc>
-          <w:tcPr>
-            <w:tcW w:type="dxa" w:w="1008"/>
-            <w:tcMar>
-              <w:top w:w="40" w:type="dxa"/>
-              <w:left w:w="55" w:type="dxa"/>
-              <w:bottom w:w="40" w:type="dxa"/>
-              <w:right w:w="55" w:type="dxa"/>
-            </w:tcMar>
-          </w:tcPr>
-          <w:p>
-            <w:pPr>
-              <w:keepNext/>
-              <w:keepLines/>
-              <w:spacing w:after="20" w:before="20" w:line="240" w:lineRule="auto"/>
-              <w:ind w:firstLine="0"/>
-              <w:jc w:val="left"/>
-            </w:pPr>
-            <w:r/>
-            <w:r>
-              <w:rPr>
-                <w:rFonts w:ascii="Times New Roman" w:hAnsi="Times New Roman" w:eastAsia="Times New Roman"/>
-                <w:b w:val="0"/>
-                <w:i w:val="0"/>
-                <w:sz w:val="19"/>
-              </w:rPr>
-              <w:t>2016</w:t>
-            </w:r>
-          </w:p>
-        </w:tc>
-        <w:tc>
-          <w:tcPr>
-            <w:tcW w:type="dxa" w:w="3888"/>
-            <w:tcMar>
-              <w:top w:w="40" w:type="dxa"/>
-              <w:left w:w="55" w:type="dxa"/>
-              <w:bottom w:w="40" w:type="dxa"/>
-              <w:right w:w="55" w:type="dxa"/>
-            </w:tcMar>
-          </w:tcPr>
-          <w:p>
-            <w:pPr>
-              <w:keepNext/>
-              <w:keepLines/>
-              <w:spacing w:after="20" w:before="20" w:line="240" w:lineRule="auto"/>
-              <w:ind w:firstLine="0"/>
-              <w:jc w:val="left"/>
-            </w:pPr>
-            <w:r/>
-            <w:r>
-              <w:rPr>
-                <w:rFonts w:ascii="Times New Roman" w:hAnsi="Times New Roman" w:eastAsia="Times New Roman"/>
-                <w:b w:val="0"/>
-                <w:i w:val="0"/>
-                <w:sz w:val="19"/>
-              </w:rPr>
-              <w:t>14,510</w:t>
-            </w:r>
-          </w:p>
-        </w:tc>
-        <w:tc>
-          <w:tcPr>
-            <w:tcW w:type="dxa" w:w="3888"/>
-            <w:tcMar>
-              <w:top w:w="40" w:type="dxa"/>
-              <w:left w:w="55" w:type="dxa"/>
-              <w:bottom w:w="40" w:type="dxa"/>
-              <w:right w:w="55" w:type="dxa"/>
-            </w:tcMar>
-          </w:tcPr>
-          <w:p>
-            <w:pPr>
-              <w:keepNext/>
-              <w:keepLines/>
-              <w:spacing w:after="20" w:before="20" w:line="240" w:lineRule="auto"/>
-              <w:ind w:firstLine="0"/>
-              <w:jc w:val="left"/>
-            </w:pPr>
-            <w:r/>
-            <w:r>
-              <w:rPr>
-                <w:rFonts w:ascii="Times New Roman" w:hAnsi="Times New Roman" w:eastAsia="Times New Roman"/>
-                <w:b w:val="0"/>
-                <w:i w:val="0"/>
-                <w:sz w:val="19"/>
-              </w:rPr>
-              <w:t>2,734</w:t>
-            </w:r>
-          </w:p>
-        </w:tc>
-      </w:tr>
-      <w:tr>
-        <w:trPr>
-          <w:cantSplit/>
-        </w:trPr>
-        <w:tc>
-          <w:tcPr>
-            <w:tcW w:type="dxa" w:w="1008"/>
-            <w:tcMar>
-              <w:top w:w="40" w:type="dxa"/>
-              <w:left w:w="55" w:type="dxa"/>
-              <w:bottom w:w="40" w:type="dxa"/>
-              <w:right w:w="55" w:type="dxa"/>
-            </w:tcMar>
-          </w:tcPr>
-          <w:p>
-            <w:pPr>
-              <w:keepNext/>
-              <w:keepLines/>
-              <w:spacing w:after="20" w:before="20" w:line="240" w:lineRule="auto"/>
-              <w:ind w:firstLine="0"/>
-              <w:jc w:val="left"/>
-            </w:pPr>
-            <w:r/>
-            <w:r>
-              <w:rPr>
-                <w:rFonts w:ascii="Times New Roman" w:hAnsi="Times New Roman" w:eastAsia="Times New Roman"/>
-                <w:b w:val="0"/>
-                <w:i w:val="0"/>
-                <w:sz w:val="19"/>
-              </w:rPr>
-              <w:t>2017</w:t>
-            </w:r>
-          </w:p>
-        </w:tc>
-        <w:tc>
-          <w:tcPr>
-            <w:tcW w:type="dxa" w:w="3888"/>
-            <w:tcMar>
-              <w:top w:w="40" w:type="dxa"/>
-              <w:left w:w="55" w:type="dxa"/>
-              <w:bottom w:w="40" w:type="dxa"/>
-              <w:right w:w="55" w:type="dxa"/>
-            </w:tcMar>
-          </w:tcPr>
-          <w:p>
-            <w:pPr>
-              <w:keepNext/>
-              <w:keepLines/>
-              <w:spacing w:after="20" w:before="20" w:line="240" w:lineRule="auto"/>
-              <w:ind w:firstLine="0"/>
-              <w:jc w:val="left"/>
-            </w:pPr>
-            <w:r/>
-            <w:r>
-              <w:rPr>
-                <w:rFonts w:ascii="Times New Roman" w:hAnsi="Times New Roman" w:eastAsia="Times New Roman"/>
-                <w:b w:val="0"/>
-                <w:i w:val="0"/>
-                <w:sz w:val="19"/>
-              </w:rPr>
-              <w:t>13,962</w:t>
-            </w:r>
-          </w:p>
-        </w:tc>
-        <w:tc>
-          <w:tcPr>
-            <w:tcW w:type="dxa" w:w="3888"/>
-            <w:tcMar>
-              <w:top w:w="40" w:type="dxa"/>
-              <w:left w:w="55" w:type="dxa"/>
-              <w:bottom w:w="40" w:type="dxa"/>
-              <w:right w:w="55" w:type="dxa"/>
-            </w:tcMar>
-          </w:tcPr>
-          <w:p>
-            <w:pPr>
-              <w:keepNext/>
-              <w:keepLines/>
-              <w:spacing w:after="20" w:before="20" w:line="240" w:lineRule="auto"/>
-              <w:ind w:firstLine="0"/>
-              <w:jc w:val="left"/>
-            </w:pPr>
-            <w:r/>
-            <w:r>
-              <w:rPr>
-                <w:rFonts w:ascii="Times New Roman" w:hAnsi="Times New Roman" w:eastAsia="Times New Roman"/>
-                <w:b w:val="0"/>
-                <w:i w:val="0"/>
-                <w:sz w:val="19"/>
-              </w:rPr>
-              <w:t>2,620</w:t>
-            </w:r>
-          </w:p>
-        </w:tc>
-      </w:tr>
-      <w:tr>
-        <w:trPr>
-          <w:cantSplit/>
-        </w:trPr>
-        <w:tc>
-          <w:tcPr>
-            <w:tcW w:type="dxa" w:w="1008"/>
-            <w:tcMar>
-              <w:top w:w="40" w:type="dxa"/>
-              <w:left w:w="55" w:type="dxa"/>
-              <w:bottom w:w="40" w:type="dxa"/>
-              <w:right w:w="55" w:type="dxa"/>
-            </w:tcMar>
-          </w:tcPr>
-          <w:p>
-            <w:pPr>
-              <w:keepNext/>
-              <w:keepLines/>
-              <w:spacing w:after="20" w:before="20" w:line="240" w:lineRule="auto"/>
-              <w:ind w:firstLine="0"/>
-              <w:jc w:val="left"/>
-            </w:pPr>
-            <w:r/>
-            <w:r>
-              <w:rPr>
-                <w:rFonts w:ascii="Times New Roman" w:hAnsi="Times New Roman" w:eastAsia="Times New Roman"/>
-                <w:b w:val="0"/>
-                <w:i w:val="0"/>
-                <w:sz w:val="19"/>
-              </w:rPr>
-              <w:t>2018</w:t>
-            </w:r>
-          </w:p>
-        </w:tc>
-        <w:tc>
-          <w:tcPr>
-            <w:tcW w:type="dxa" w:w="3888"/>
-            <w:tcMar>
-              <w:top w:w="40" w:type="dxa"/>
-              <w:left w:w="55" w:type="dxa"/>
-              <w:bottom w:w="40" w:type="dxa"/>
-              <w:right w:w="55" w:type="dxa"/>
-            </w:tcMar>
-          </w:tcPr>
-          <w:p>
-            <w:pPr>
-              <w:keepNext/>
-              <w:keepLines/>
-              <w:spacing w:after="20" w:before="20" w:line="240" w:lineRule="auto"/>
-              <w:ind w:firstLine="0"/>
-              <w:jc w:val="left"/>
-            </w:pPr>
-            <w:r/>
-            <w:r>
-              <w:rPr>
-                <w:rFonts w:ascii="Times New Roman" w:hAnsi="Times New Roman" w:eastAsia="Times New Roman"/>
-                <w:b w:val="0"/>
-                <w:i w:val="0"/>
-                <w:sz w:val="19"/>
-              </w:rPr>
-              <w:t>12,616</w:t>
-            </w:r>
-          </w:p>
-        </w:tc>
-        <w:tc>
-          <w:tcPr>
-            <w:tcW w:type="dxa" w:w="3888"/>
-            <w:tcMar>
-              <w:top w:w="40" w:type="dxa"/>
-              <w:left w:w="55" w:type="dxa"/>
-              <w:bottom w:w="40" w:type="dxa"/>
-              <w:right w:w="55" w:type="dxa"/>
-            </w:tcMar>
-          </w:tcPr>
-          <w:p>
-            <w:pPr>
-              <w:keepNext/>
-              <w:keepLines/>
-              <w:spacing w:after="20" w:before="20" w:line="240" w:lineRule="auto"/>
-              <w:ind w:firstLine="0"/>
-              <w:jc w:val="left"/>
-            </w:pPr>
-            <w:r/>
-            <w:r>
-              <w:rPr>
-                <w:rFonts w:ascii="Times New Roman" w:hAnsi="Times New Roman" w:eastAsia="Times New Roman"/>
-                <w:b w:val="0"/>
-                <w:i w:val="0"/>
-                <w:sz w:val="19"/>
-              </w:rPr>
-              <w:t>2,527</w:t>
-            </w:r>
-          </w:p>
-        </w:tc>
-      </w:tr>
-      <w:tr>
-        <w:trPr>
-          <w:cantSplit/>
-        </w:trPr>
-        <w:tc>
-          <w:tcPr>
-            <w:tcW w:type="dxa" w:w="1008"/>
-            <w:tcMar>
-              <w:top w:w="40" w:type="dxa"/>
-              <w:left w:w="55" w:type="dxa"/>
-              <w:bottom w:w="40" w:type="dxa"/>
-              <w:right w:w="55" w:type="dxa"/>
-            </w:tcMar>
-          </w:tcPr>
-          <w:p>
-            <w:pPr>
-              <w:keepNext/>
-              <w:keepLines/>
-              <w:spacing w:after="20" w:before="20" w:line="240" w:lineRule="auto"/>
-              <w:ind w:firstLine="0"/>
-              <w:jc w:val="left"/>
-            </w:pPr>
-            <w:r/>
-            <w:r>
-              <w:rPr>
-                <w:rFonts w:ascii="Times New Roman" w:hAnsi="Times New Roman" w:eastAsia="Times New Roman"/>
-                <w:b w:val="0"/>
-                <w:i w:val="0"/>
-                <w:sz w:val="19"/>
-              </w:rPr>
-              <w:t>2019</w:t>
-            </w:r>
-          </w:p>
-        </w:tc>
-        <w:tc>
-          <w:tcPr>
-            <w:tcW w:type="dxa" w:w="3888"/>
-            <w:tcMar>
-              <w:top w:w="40" w:type="dxa"/>
-              <w:left w:w="55" w:type="dxa"/>
-              <w:bottom w:w="40" w:type="dxa"/>
-              <w:right w:w="55" w:type="dxa"/>
-            </w:tcMar>
-          </w:tcPr>
-          <w:p>
-            <w:pPr>
-              <w:keepNext/>
-              <w:keepLines/>
-              <w:spacing w:after="20" w:before="20" w:line="240" w:lineRule="auto"/>
-              <w:ind w:firstLine="0"/>
-              <w:jc w:val="left"/>
-            </w:pPr>
-            <w:r/>
-            <w:r>
-              <w:rPr>
-                <w:rFonts w:ascii="Times New Roman" w:hAnsi="Times New Roman" w:eastAsia="Times New Roman"/>
-                <w:b w:val="0"/>
-                <w:i w:val="0"/>
-                <w:sz w:val="19"/>
-              </w:rPr>
-              <w:t>12,396</w:t>
-            </w:r>
-          </w:p>
-        </w:tc>
-        <w:tc>
-          <w:tcPr>
-            <w:tcW w:type="dxa" w:w="3888"/>
-            <w:tcMar>
-              <w:top w:w="40" w:type="dxa"/>
-              <w:left w:w="55" w:type="dxa"/>
-              <w:bottom w:w="40" w:type="dxa"/>
-              <w:right w:w="55" w:type="dxa"/>
-            </w:tcMar>
-          </w:tcPr>
-          <w:p>
-            <w:pPr>
-              <w:keepNext/>
-              <w:keepLines/>
-              <w:spacing w:after="20" w:before="20" w:line="240" w:lineRule="auto"/>
-              <w:ind w:firstLine="0"/>
-              <w:jc w:val="left"/>
-            </w:pPr>
-            <w:r/>
-            <w:r>
-              <w:rPr>
-                <w:rFonts w:ascii="Times New Roman" w:hAnsi="Times New Roman" w:eastAsia="Times New Roman"/>
-                <w:b w:val="0"/>
-                <w:i w:val="0"/>
-                <w:sz w:val="19"/>
-              </w:rPr>
-              <w:t>2,344</w:t>
-            </w:r>
-          </w:p>
-        </w:tc>
-      </w:tr>
-      <w:tr>
-        <w:trPr>
-          <w:cantSplit/>
-        </w:trPr>
-        <w:tc>
-          <w:tcPr>
-            <w:tcW w:type="dxa" w:w="1008"/>
-            <w:tcMar>
-              <w:top w:w="40" w:type="dxa"/>
-              <w:left w:w="55" w:type="dxa"/>
-              <w:bottom w:w="40" w:type="dxa"/>
-              <w:right w:w="55" w:type="dxa"/>
-            </w:tcMar>
-          </w:tcPr>
-          <w:p>
-            <w:pPr>
-              <w:keepNext/>
-              <w:keepLines/>
-              <w:spacing w:after="20" w:before="20" w:line="240" w:lineRule="auto"/>
-              <w:ind w:firstLine="0"/>
-              <w:jc w:val="left"/>
-            </w:pPr>
-            <w:r/>
-            <w:r>
-              <w:rPr>
-                <w:rFonts w:ascii="Times New Roman" w:hAnsi="Times New Roman" w:eastAsia="Times New Roman"/>
-                <w:b w:val="0"/>
-                <w:i w:val="0"/>
-                <w:sz w:val="19"/>
-              </w:rPr>
-              <w:t>2020</w:t>
-            </w:r>
-          </w:p>
-        </w:tc>
-        <w:tc>
-          <w:tcPr>
-            <w:tcW w:type="dxa" w:w="3888"/>
-            <w:tcMar>
-              <w:top w:w="40" w:type="dxa"/>
-              <w:left w:w="55" w:type="dxa"/>
-              <w:bottom w:w="40" w:type="dxa"/>
-              <w:right w:w="55" w:type="dxa"/>
-            </w:tcMar>
-          </w:tcPr>
-          <w:p>
-            <w:pPr>
-              <w:keepNext/>
-              <w:keepLines/>
-              <w:spacing w:after="20" w:before="20" w:line="240" w:lineRule="auto"/>
-              <w:ind w:firstLine="0"/>
-              <w:jc w:val="left"/>
-            </w:pPr>
-            <w:r/>
-            <w:r>
-              <w:rPr>
-                <w:rFonts w:ascii="Times New Roman" w:hAnsi="Times New Roman" w:eastAsia="Times New Roman"/>
-                <w:b w:val="0"/>
-                <w:i w:val="0"/>
-                <w:sz w:val="19"/>
-              </w:rPr>
-              <w:t>10,237</w:t>
-            </w:r>
-          </w:p>
-        </w:tc>
-        <w:tc>
-          <w:tcPr>
-            <w:tcW w:type="dxa" w:w="3888"/>
-            <w:tcMar>
-              <w:top w:w="40" w:type="dxa"/>
-              <w:left w:w="55" w:type="dxa"/>
-              <w:bottom w:w="40" w:type="dxa"/>
-              <w:right w:w="55" w:type="dxa"/>
-            </w:tcMar>
-          </w:tcPr>
-          <w:p>
-            <w:pPr>
-              <w:keepNext/>
-              <w:keepLines/>
-              <w:spacing w:after="20" w:before="20" w:line="240" w:lineRule="auto"/>
-              <w:ind w:firstLine="0"/>
-              <w:jc w:val="left"/>
-            </w:pPr>
-            <w:r/>
-            <w:r>
-              <w:rPr>
-                <w:rFonts w:ascii="Times New Roman" w:hAnsi="Times New Roman" w:eastAsia="Times New Roman"/>
-                <w:b w:val="0"/>
-                <w:i w:val="0"/>
-                <w:sz w:val="19"/>
-              </w:rPr>
-              <w:t>1,964</w:t>
-            </w:r>
-          </w:p>
-        </w:tc>
-      </w:tr>
-      <w:tr>
-        <w:trPr>
-          <w:cantSplit/>
-        </w:trPr>
-        <w:tc>
-          <w:tcPr>
-            <w:tcW w:type="dxa" w:w="1008"/>
-            <w:tcMar>
-              <w:top w:w="40" w:type="dxa"/>
-              <w:left w:w="55" w:type="dxa"/>
-              <w:bottom w:w="40" w:type="dxa"/>
-              <w:right w:w="55" w:type="dxa"/>
-            </w:tcMar>
-          </w:tcPr>
-          <w:p>
-            <w:pPr>
-              <w:keepNext/>
-              <w:keepLines/>
-              <w:spacing w:after="20" w:before="20" w:line="240" w:lineRule="auto"/>
-              <w:ind w:firstLine="0"/>
-              <w:jc w:val="left"/>
-            </w:pPr>
-            <w:r/>
-            <w:r>
-              <w:rPr>
-                <w:rFonts w:ascii="Times New Roman" w:hAnsi="Times New Roman" w:eastAsia="Times New Roman"/>
-                <w:b w:val="0"/>
-                <w:i w:val="0"/>
-                <w:sz w:val="19"/>
-              </w:rPr>
-              <w:t>2021</w:t>
-            </w:r>
-          </w:p>
-        </w:tc>
-        <w:tc>
-          <w:tcPr>
-            <w:tcW w:type="dxa" w:w="3888"/>
-            <w:tcMar>
-              <w:top w:w="40" w:type="dxa"/>
-              <w:left w:w="55" w:type="dxa"/>
-              <w:bottom w:w="40" w:type="dxa"/>
-              <w:right w:w="55" w:type="dxa"/>
-            </w:tcMar>
-          </w:tcPr>
-          <w:p>
-            <w:pPr>
-              <w:keepNext/>
-              <w:keepLines/>
-              <w:spacing w:after="20" w:before="20" w:line="240" w:lineRule="auto"/>
-              <w:ind w:firstLine="0"/>
-              <w:jc w:val="left"/>
-            </w:pPr>
-            <w:r/>
-            <w:r>
-              <w:rPr>
-                <w:rFonts w:ascii="Times New Roman" w:hAnsi="Times New Roman" w:eastAsia="Times New Roman"/>
-                <w:b w:val="0"/>
-                <w:i w:val="0"/>
-                <w:sz w:val="19"/>
-              </w:rPr>
-              <w:t>12,035</w:t>
-            </w:r>
-          </w:p>
-        </w:tc>
-        <w:tc>
-          <w:tcPr>
-            <w:tcW w:type="dxa" w:w="3888"/>
-            <w:tcMar>
-              <w:top w:w="40" w:type="dxa"/>
-              <w:left w:w="55" w:type="dxa"/>
-              <w:bottom w:w="40" w:type="dxa"/>
-              <w:right w:w="55" w:type="dxa"/>
-            </w:tcMar>
-          </w:tcPr>
-          <w:p>
-            <w:pPr>
-              <w:keepNext/>
-              <w:keepLines/>
-              <w:spacing w:after="20" w:before="20" w:line="240" w:lineRule="auto"/>
-              <w:ind w:firstLine="0"/>
-              <w:jc w:val="left"/>
-            </w:pPr>
-            <w:r/>
-            <w:r>
-              <w:rPr>
-                <w:rFonts w:ascii="Times New Roman" w:hAnsi="Times New Roman" w:eastAsia="Times New Roman"/>
-                <w:b w:val="0"/>
-                <w:i w:val="0"/>
-                <w:sz w:val="19"/>
-              </w:rPr>
-              <w:t>2,275</w:t>
-            </w:r>
-          </w:p>
-        </w:tc>
-      </w:tr>
-      <w:tr>
-        <w:trPr>
-          <w:cantSplit/>
-        </w:trPr>
-        <w:tc>
-          <w:tcPr>
-            <w:tcW w:type="dxa" w:w="1008"/>
-            <w:tcMar>
-              <w:top w:w="40" w:type="dxa"/>
-              <w:left w:w="55" w:type="dxa"/>
-              <w:bottom w:w="40" w:type="dxa"/>
-              <w:right w:w="55" w:type="dxa"/>
-            </w:tcMar>
-          </w:tcPr>
-          <w:p>
-            <w:pPr>
-              <w:keepNext/>
-              <w:keepLines/>
-              <w:spacing w:after="20" w:before="20" w:line="240" w:lineRule="auto"/>
-              <w:ind w:firstLine="0"/>
-              <w:jc w:val="left"/>
-            </w:pPr>
-            <w:r/>
-            <w:r>
-              <w:rPr>
-                <w:rFonts w:ascii="Times New Roman" w:hAnsi="Times New Roman" w:eastAsia="Times New Roman"/>
-                <w:b w:val="0"/>
-                <w:i w:val="0"/>
-                <w:sz w:val="19"/>
-              </w:rPr>
-              <w:t>2022</w:t>
-            </w:r>
-          </w:p>
-        </w:tc>
-        <w:tc>
-          <w:tcPr>
-            <w:tcW w:type="dxa" w:w="3888"/>
-            <w:tcMar>
-              <w:top w:w="40" w:type="dxa"/>
-              <w:left w:w="55" w:type="dxa"/>
-              <w:bottom w:w="40" w:type="dxa"/>
-              <w:right w:w="55" w:type="dxa"/>
-            </w:tcMar>
-          </w:tcPr>
-          <w:p>
-            <w:pPr>
-              <w:keepNext/>
-              <w:keepLines/>
-              <w:spacing w:after="20" w:before="20" w:line="240" w:lineRule="auto"/>
-              <w:ind w:firstLine="0"/>
-              <w:jc w:val="left"/>
-            </w:pPr>
-            <w:r/>
-            <w:r>
-              <w:rPr>
-                <w:rFonts w:ascii="Times New Roman" w:hAnsi="Times New Roman" w:eastAsia="Times New Roman"/>
-                <w:b w:val="0"/>
-                <w:i w:val="0"/>
-                <w:sz w:val="19"/>
-              </w:rPr>
-              <w:t>11,076</w:t>
-            </w:r>
-          </w:p>
-        </w:tc>
-        <w:tc>
-          <w:tcPr>
-            <w:tcW w:type="dxa" w:w="3888"/>
-            <w:tcMar>
-              <w:top w:w="40" w:type="dxa"/>
-              <w:left w:w="55" w:type="dxa"/>
-              <w:bottom w:w="40" w:type="dxa"/>
-              <w:right w:w="55" w:type="dxa"/>
-            </w:tcMar>
-          </w:tcPr>
-          <w:p>
-            <w:pPr>
-              <w:keepNext/>
-              <w:keepLines/>
-              <w:spacing w:after="20" w:before="20" w:line="240" w:lineRule="auto"/>
-              <w:ind w:firstLine="0"/>
-              <w:jc w:val="left"/>
-            </w:pPr>
-            <w:r/>
-            <w:r>
-              <w:rPr>
-                <w:rFonts w:ascii="Times New Roman" w:hAnsi="Times New Roman" w:eastAsia="Times New Roman"/>
-                <w:b w:val="0"/>
-                <w:i w:val="0"/>
-                <w:sz w:val="19"/>
-              </w:rPr>
-              <w:t>1,976</w:t>
-            </w:r>
-          </w:p>
-        </w:tc>
-      </w:tr>
-      <w:tr>
-        <w:trPr>
-          <w:cantSplit/>
-        </w:trPr>
-        <w:tc>
-          <w:tcPr>
-            <w:tcW w:type="dxa" w:w="1008"/>
-            <w:tcMar>
-              <w:top w:w="40" w:type="dxa"/>
-              <w:left w:w="55" w:type="dxa"/>
-              <w:bottom w:w="40" w:type="dxa"/>
-              <w:right w:w="55" w:type="dxa"/>
-            </w:tcMar>
-          </w:tcPr>
-          <w:p>
-            <w:pPr>
-              <w:keepNext w:val="0"/>
-              <w:keepLines/>
-              <w:spacing w:after="20" w:before="20" w:line="240" w:lineRule="auto"/>
-              <w:ind w:firstLine="0"/>
-              <w:jc w:val="left"/>
-            </w:pPr>
-            <w:r/>
-            <w:r>
-              <w:rPr>
-                <w:rFonts w:ascii="Times New Roman" w:hAnsi="Times New Roman" w:eastAsia="Times New Roman"/>
-                <w:b w:val="0"/>
-                <w:i w:val="0"/>
-                <w:sz w:val="19"/>
-              </w:rPr>
-              <w:t>2023</w:t>
-            </w:r>
-          </w:p>
-        </w:tc>
-        <w:tc>
-          <w:tcPr>
-            <w:tcW w:type="dxa" w:w="3888"/>
-            <w:tcMar>
-              <w:top w:w="40" w:type="dxa"/>
-              <w:left w:w="55" w:type="dxa"/>
-              <w:bottom w:w="40" w:type="dxa"/>
-              <w:right w:w="55" w:type="dxa"/>
-            </w:tcMar>
-          </w:tcPr>
-          <w:p>
-            <w:pPr>
-              <w:keepNext w:val="0"/>
-              <w:keepLines/>
-              <w:spacing w:after="20" w:before="20" w:line="240" w:lineRule="auto"/>
-              <w:ind w:firstLine="0"/>
-              <w:jc w:val="left"/>
-            </w:pPr>
-            <w:r/>
-            <w:r>
-              <w:rPr>
-                <w:rFonts w:ascii="Times New Roman" w:hAnsi="Times New Roman" w:eastAsia="Times New Roman"/>
-                <w:b w:val="0"/>
-                <w:i w:val="0"/>
-                <w:sz w:val="19"/>
-              </w:rPr>
-              <w:t>12,323</w:t>
-            </w:r>
-          </w:p>
-        </w:tc>
-        <w:tc>
-          <w:tcPr>
-            <w:tcW w:type="dxa" w:w="3888"/>
-            <w:tcMar>
-              <w:top w:w="40" w:type="dxa"/>
-              <w:left w:w="55" w:type="dxa"/>
-              <w:bottom w:w="40" w:type="dxa"/>
-              <w:right w:w="55" w:type="dxa"/>
-            </w:tcMar>
-          </w:tcPr>
-          <w:p>
-            <w:pPr>
-              <w:keepNext w:val="0"/>
-              <w:keepLines/>
-              <w:spacing w:after="20" w:before="20" w:line="240" w:lineRule="auto"/>
-              <w:ind w:firstLine="0"/>
-              <w:jc w:val="left"/>
-            </w:pPr>
-            <w:r/>
-            <w:r>
-              <w:rPr>
-                <w:rFonts w:ascii="Times New Roman" w:hAnsi="Times New Roman" w:eastAsia="Times New Roman"/>
-                <w:b w:val="0"/>
-                <w:i w:val="0"/>
-                <w:sz w:val="19"/>
-              </w:rPr>
-              <w:t>2,296</w:t>
-            </w:r>
-          </w:p>
-        </w:tc>
-      </w:tr>
-    </w:tbl>
-    <w:p>
-      <w:pPr>
-        <w:spacing w:after="120" w:before="0" w:line="240" w:lineRule="auto"/>
-        <w:ind w:firstLine="0"/>
-        <w:jc w:val="left"/>
-      </w:pPr>
-      <w:r>
-        <w:rPr>
-          <w:rFonts w:ascii="Times New Roman" w:hAnsi="Times New Roman" w:eastAsia="Times New Roman"/>
-          <w:b w:val="0"/>
-          <w:i w:val="0"/>
-          <w:sz w:val="4"/>
-        </w:rPr>
-      </w:r>
-    </w:p>
-    <w:p>
-      <w:pPr>
-        <w:keepNext/>
-        <w:keepLines/>
-        <w:spacing w:after="120" w:before="0" w:line="240" w:lineRule="auto"/>
-        <w:ind w:firstLine="0"/>
-        <w:jc w:val="left"/>
-      </w:pPr>
-      <w:r>
-        <w:rPr>
-          <w:rFonts w:ascii="Times New Roman" w:hAnsi="Times New Roman" w:eastAsia="Times New Roman"/>
-          <w:b w:val="0"/>
-          <w:i/>
-          <w:sz w:val="21"/>
-        </w:rPr>
-        <w:t>Figure 2. Annual recorded first hospitalisation counts after CHD or HF diagnosis. Separate panels show annual counts on their own outcome scales. The shaded interval begins in 2020 and marks calendar years, not an estimated treatment effect. These are observed totals, without population or trend adjustment. Source: Hospital Authority aggregate annual summaries.</w:t>
-      </w:r>
-    </w:p>
-    <w:p>
-      <w:pPr>
-        <w:keepLines/>
-        <w:spacing w:after="160" w:before="0" w:line="240" w:lineRule="auto"/>
-        <w:ind w:firstLine="0"/>
-        <w:jc w:val="center"/>
-      </w:pPr>
-      <w:r>
-        <w:drawing>
-          <wp:inline xmlns:a="http://schemas.openxmlformats.org/drawingml/2006/main" xmlns:pic="http://schemas.openxmlformats.org/drawingml/2006/picture">
-            <wp:extent cx="5577840" cy="2256581"/>
-            <wp:docPr id="2" name="Picture 2"/>
-            <wp:cNvGraphicFramePr>
-              <a:graphicFrameLocks noChangeAspect="1"/>
-            </wp:cNvGraphicFramePr>
-            <a:graphic>
-              <a:graphicData uri="http://schemas.openxmlformats.org/drawingml/2006/picture">
-                <pic:pic>
-                  <pic:nvPicPr>
-                    <pic:cNvPr id="0" name="figure_annual_counts_20261002.png"/>
-                    <pic:cNvPicPr/>
-                  </pic:nvPicPr>
-                  <pic:blipFill>
-                    <a:blip r:embed="rId12"/>
-                    <a:stretch>
-                      <a:fillRect/>
-                    </a:stretch>
-                  </pic:blipFill>
-                  <pic:spPr>
-                    <a:xfrm>
-                      <a:off x="0" y="0"/>
-                      <a:ext cx="5577840" cy="2256581"/>
-                    </a:xfrm>
-                    <a:prstGeom prst="rect"/>
-                  </pic:spPr>
-                </pic:pic>
-              </a:graphicData>
-            </a:graphic>
-          </wp:inline>
-        </w:drawing>
-      </w:r>
-    </w:p>
-    <w:p>
-      <w:pPr>
-        <w:spacing w:after="160" w:before="0" w:line="240" w:lineRule="auto"/>
-        <w:ind w:firstLine="0"/>
-        <w:jc w:val="left"/>
-      </w:pPr>
-      <w:r>
-        <w:rPr>
-          <w:rFonts w:ascii="Times New Roman" w:hAnsi="Times New Roman" w:eastAsia="Times New Roman"/>
-          <w:b w:val="0"/>
-          <w:i w:val="0"/>
-          <w:sz w:val="23"/>
-        </w:rPr>
-        <w:t>Monthly means were 1,315.3 CHD events and 252.0 HF events in 2013–2019, 926.3 and 172.6 in 2020–2022, and 1,026.9 and 191.3 in 2023 (Supplementary Table S1). These are disjoint descriptive periods. Differences in their averages include the strong pre-existing decline and cannot be attributed to the pandemic.</w:t>
-      </w:r>
-    </w:p>
-    <w:p>
-      <w:pPr>
-        <w:pStyle w:val="Heading2"/>
-        <w:keepNext/>
-        <w:keepLines/>
-        <w:spacing w:after="120" w:before="160" w:line="240" w:lineRule="auto"/>
-        <w:ind w:firstLine="0"/>
-        <w:jc w:val="left"/>
-      </w:pPr>
-      <w:r>
-        <w:rPr>
-          <w:rFonts w:ascii="Times New Roman" w:hAnsi="Times New Roman" w:eastAsia="Times New Roman"/>
-          <w:b/>
-          <w:i w:val="0"/>
-          <w:sz w:val="23"/>
-        </w:rPr>
-        <w:t>Weather associations and analysis window</w:t>
-      </w:r>
-    </w:p>
-    <w:p>
-      <w:pPr>
-        <w:spacing w:after="160" w:before="0" w:line="240" w:lineRule="auto"/>
-        <w:ind w:firstLine="0"/>
-        <w:jc w:val="left"/>
-      </w:pPr>
-      <w:r>
-        <w:rPr>
-          <w:rFonts w:ascii="Times New Roman" w:hAnsi="Times New Roman" w:eastAsia="Times New Roman"/>
-          <w:b w:val="0"/>
-          <w:i w:val="0"/>
-          <w:sz w:val="23"/>
-        </w:rPr>
-        <w:t>Cold-day point estimates were lower in the full window than in the nested pre-2020 window (Table 2). For CHD, the count ratio per five additional cold days changed from 1.036 (95% CI 1.007–1.067) to 0.995 (0.949–1.043). For HF, it changed from 1.113 (1.053–1.176) to 1.073 (1.006–1.144). The full-window HF point estimate remained above one. Neither comparison establishes a protective cold effect or a reduction in susceptibility after 2019.</w:t>
-      </w:r>
-    </w:p>
-    <w:p>
-      <w:pPr>
-        <w:keepNext/>
-        <w:keepLines/>
-        <w:spacing w:after="120" w:before="0" w:line="240" w:lineRule="auto"/>
-        <w:ind w:firstLine="0"/>
-        <w:jc w:val="left"/>
-      </w:pPr>
-      <w:r>
-        <w:rPr>
-          <w:rFonts w:ascii="Times New Roman" w:hAnsi="Times New Roman" w:eastAsia="Times New Roman"/>
-          <w:b w:val="0"/>
-          <w:i/>
-          <w:sz w:val="21"/>
-        </w:rPr>
-        <w:t>Table 2. Official day count associations in nested and full windows. Count ratios per five additional days, with Newey–West lag-six 95% confidence intervals. The pre-2020 window is contained within the full window; these columns are not independent pre/post estimates.</w:t>
-      </w:r>
-    </w:p>
-    <w:tbl>
-      <w:tblPr>
-        <w:tblStyle w:val="TableGrid"/>
-        <w:tblLayout w:type="fixed"/>
-        <w:tblLook w:firstColumn="1" w:firstRow="1" w:lastColumn="0" w:lastRow="0" w:noHBand="0" w:noVBand="1" w:val="04A0"/>
-        <w:tblW w:w="5000" w:type="pct"/>
-        <w:tblLayout w:type="fixed"/>
-        <w:tblBorders>
-          <w:top w:val="single" w:sz="4" w:color="D9D9D9"/>
-          <w:left w:val="single" w:sz="4" w:color="D9D9D9"/>
-          <w:bottom w:val="single" w:sz="4" w:color="D9D9D9"/>
-          <w:right w:val="single" w:sz="4" w:color="D9D9D9"/>
-          <w:insideH w:val="single" w:sz="4" w:color="D9D9D9"/>
-          <w:insideV w:val="single" w:sz="4" w:color="D9D9D9"/>
-        </w:tblBorders>
-      </w:tblPr>
-      <w:tblGrid>
-        <w:gridCol w:w="936"/>
-        <w:gridCol w:w="2304"/>
-        <w:gridCol w:w="2772"/>
-        <w:gridCol w:w="2772"/>
-      </w:tblGrid>
-      <w:tr>
-        <w:trPr>
-          <w:cantSplit/>
-          <w:tblHeader/>
-        </w:trPr>
-        <w:tc>
-          <w:tcPr>
-            <w:tcW w:type="dxa" w:w="936"/>
-            <w:tcMar>
-              <w:top w:w="40" w:type="dxa"/>
-              <w:left w:w="55" w:type="dxa"/>
-              <w:bottom w:w="40" w:type="dxa"/>
-              <w:right w:w="55" w:type="dxa"/>
-            </w:tcMar>
-          </w:tcPr>
-          <w:p>
-            <w:pPr>
-              <w:keepNext/>
-              <w:keepLines/>
-              <w:spacing w:after="20" w:before="20" w:line="240" w:lineRule="auto"/>
-              <w:ind w:firstLine="0"/>
-              <w:jc w:val="left"/>
-            </w:pPr>
-            <w:r/>
-            <w:r>
-              <w:rPr>
-                <w:rFonts w:ascii="Times New Roman" w:hAnsi="Times New Roman" w:eastAsia="Times New Roman"/>
-                <w:b/>
-                <w:i w:val="0"/>
-                <w:sz w:val="19"/>
-              </w:rPr>
-              <w:t>Outcome</w:t>
-            </w:r>
-          </w:p>
-        </w:tc>
-        <w:tc>
-          <w:tcPr>
-            <w:tcW w:type="dxa" w:w="2304"/>
-            <w:tcMar>
-              <w:top w:w="40" w:type="dxa"/>
-              <w:left w:w="55" w:type="dxa"/>
-              <w:bottom w:w="40" w:type="dxa"/>
-              <w:right w:w="55" w:type="dxa"/>
-            </w:tcMar>
-          </w:tcPr>
-          <w:p>
-            <w:pPr>
-              <w:keepNext/>
-              <w:keepLines/>
-              <w:spacing w:after="20" w:before="20" w:line="240" w:lineRule="auto"/>
-              <w:ind w:firstLine="0"/>
-              <w:jc w:val="left"/>
-            </w:pPr>
-            <w:r/>
-            <w:r>
-              <w:rPr>
-                <w:rFonts w:ascii="Times New Roman" w:hAnsi="Times New Roman" w:eastAsia="Times New Roman"/>
-                <w:b/>
-                <w:i w:val="0"/>
-                <w:sz w:val="19"/>
-              </w:rPr>
-              <w:t>Exposure</w:t>
-            </w:r>
-          </w:p>
-        </w:tc>
-        <w:tc>
-          <w:tcPr>
-            <w:tcW w:type="dxa" w:w="2772"/>
-            <w:tcMar>
-              <w:top w:w="40" w:type="dxa"/>
-              <w:left w:w="55" w:type="dxa"/>
-              <w:bottom w:w="40" w:type="dxa"/>
-              <w:right w:w="55" w:type="dxa"/>
-            </w:tcMar>
-          </w:tcPr>
-          <w:p>
-            <w:pPr>
-              <w:keepNext/>
-              <w:keepLines/>
-              <w:spacing w:after="20" w:before="20" w:line="240" w:lineRule="auto"/>
-              <w:ind w:firstLine="0"/>
-              <w:jc w:val="left"/>
-            </w:pPr>
-            <w:r/>
-            <w:r>
-              <w:rPr>
-                <w:rFonts w:ascii="Times New Roman" w:hAnsi="Times New Roman" w:eastAsia="Times New Roman"/>
-                <w:b/>
-                <w:i w:val="0"/>
-                <w:sz w:val="19"/>
-              </w:rPr>
-              <w:t>Pre 2020 84 months</w:t>
-            </w:r>
-          </w:p>
-        </w:tc>
-        <w:tc>
-          <w:tcPr>
-            <w:tcW w:type="dxa" w:w="2772"/>
-            <w:tcMar>
-              <w:top w:w="40" w:type="dxa"/>
-              <w:left w:w="55" w:type="dxa"/>
-              <w:bottom w:w="40" w:type="dxa"/>
-              <w:right w:w="55" w:type="dxa"/>
-            </w:tcMar>
-          </w:tcPr>
-          <w:p>
-            <w:pPr>
-              <w:keepNext/>
-              <w:keepLines/>
-              <w:spacing w:after="20" w:before="20" w:line="240" w:lineRule="auto"/>
-              <w:ind w:firstLine="0"/>
-              <w:jc w:val="left"/>
-            </w:pPr>
-            <w:r/>
-            <w:r>
-              <w:rPr>
-                <w:rFonts w:ascii="Times New Roman" w:hAnsi="Times New Roman" w:eastAsia="Times New Roman"/>
-                <w:b/>
-                <w:i w:val="0"/>
-                <w:sz w:val="19"/>
-              </w:rPr>
-              <w:t>Full 132 months</w:t>
-            </w:r>
-          </w:p>
-        </w:tc>
-      </w:tr>
-      <w:tr>
-        <w:trPr>
-          <w:cantSplit/>
-        </w:trPr>
-        <w:tc>
-          <w:tcPr>
-            <w:tcW w:type="dxa" w:w="936"/>
-            <w:tcMar>
-              <w:top w:w="40" w:type="dxa"/>
-              <w:left w:w="55" w:type="dxa"/>
-              <w:bottom w:w="40" w:type="dxa"/>
-              <w:right w:w="55" w:type="dxa"/>
-            </w:tcMar>
-          </w:tcPr>
-          <w:p>
-            <w:pPr>
-              <w:keepNext/>
-              <w:keepLines/>
-              <w:spacing w:after="20" w:before="20" w:line="240" w:lineRule="auto"/>
-              <w:ind w:firstLine="0"/>
-              <w:jc w:val="left"/>
-            </w:pPr>
-            <w:r/>
-            <w:r>
-              <w:rPr>
-                <w:rFonts w:ascii="Times New Roman" w:hAnsi="Times New Roman" w:eastAsia="Times New Roman"/>
-                <w:b w:val="0"/>
-                <w:i w:val="0"/>
-                <w:sz w:val="19"/>
-              </w:rPr>
-              <w:t>CHD</w:t>
-            </w:r>
-          </w:p>
-        </w:tc>
-        <w:tc>
-          <w:tcPr>
-            <w:tcW w:type="dxa" w:w="2304"/>
-            <w:tcMar>
-              <w:top w:w="40" w:type="dxa"/>
-              <w:left w:w="55" w:type="dxa"/>
-              <w:bottom w:w="40" w:type="dxa"/>
-              <w:right w:w="55" w:type="dxa"/>
-            </w:tcMar>
-          </w:tcPr>
-          <w:p>
-            <w:pPr>
-              <w:keepNext/>
-              <w:keepLines/>
-              <w:spacing w:after="20" w:before="20" w:line="240" w:lineRule="auto"/>
-              <w:ind w:firstLine="0"/>
-              <w:jc w:val="left"/>
-            </w:pPr>
-            <w:r/>
-            <w:r>
-              <w:rPr>
-                <w:rFonts w:ascii="Times New Roman" w:hAnsi="Times New Roman" w:eastAsia="Times New Roman"/>
-                <w:b w:val="0"/>
-                <w:i w:val="0"/>
-                <w:sz w:val="19"/>
-              </w:rPr>
-              <w:t>Hot nights / 5 days</w:t>
-            </w:r>
-          </w:p>
-        </w:tc>
-        <w:tc>
-          <w:tcPr>
-            <w:tcW w:type="dxa" w:w="2772"/>
-            <w:tcMar>
-              <w:top w:w="40" w:type="dxa"/>
-              <w:left w:w="55" w:type="dxa"/>
-              <w:bottom w:w="40" w:type="dxa"/>
-              <w:right w:w="55" w:type="dxa"/>
-            </w:tcMar>
-          </w:tcPr>
-          <w:p>
-            <w:pPr>
-              <w:keepNext/>
-              <w:keepLines/>
-              <w:spacing w:after="20" w:before="20" w:line="240" w:lineRule="auto"/>
-              <w:ind w:firstLine="0"/>
-              <w:jc w:val="left"/>
-            </w:pPr>
-            <w:r/>
-            <w:r>
-              <w:rPr>
-                <w:rFonts w:ascii="Times New Roman" w:hAnsi="Times New Roman" w:eastAsia="Times New Roman"/>
-                <w:b w:val="0"/>
-                <w:i w:val="0"/>
-                <w:sz w:val="19"/>
-              </w:rPr>
-              <w:t>1.011 (0.991–1.032)</w:t>
-            </w:r>
-          </w:p>
-        </w:tc>
-        <w:tc>
-          <w:tcPr>
-            <w:tcW w:type="dxa" w:w="2772"/>
-            <w:tcMar>
-              <w:top w:w="40" w:type="dxa"/>
-              <w:left w:w="55" w:type="dxa"/>
-              <w:bottom w:w="40" w:type="dxa"/>
-              <w:right w:w="55" w:type="dxa"/>
-            </w:tcMar>
-          </w:tcPr>
-          <w:p>
-            <w:pPr>
-              <w:keepNext/>
-              <w:keepLines/>
-              <w:spacing w:after="20" w:before="20" w:line="240" w:lineRule="auto"/>
-              <w:ind w:firstLine="0"/>
-              <w:jc w:val="left"/>
-            </w:pPr>
-            <w:r/>
-            <w:r>
-              <w:rPr>
-                <w:rFonts w:ascii="Times New Roman" w:hAnsi="Times New Roman" w:eastAsia="Times New Roman"/>
-                <w:b w:val="0"/>
-                <w:i w:val="0"/>
-                <w:sz w:val="19"/>
-              </w:rPr>
-              <w:t>1.022 (1.002–1.042)</w:t>
-            </w:r>
-          </w:p>
-        </w:tc>
-      </w:tr>
-      <w:tr>
-        <w:trPr>
-          <w:cantSplit/>
-        </w:trPr>
-        <w:tc>
-          <w:tcPr>
-            <w:tcW w:type="dxa" w:w="936"/>
-            <w:tcMar>
-              <w:top w:w="40" w:type="dxa"/>
-              <w:left w:w="55" w:type="dxa"/>
-              <w:bottom w:w="40" w:type="dxa"/>
-              <w:right w:w="55" w:type="dxa"/>
-            </w:tcMar>
-          </w:tcPr>
-          <w:p>
-            <w:pPr>
-              <w:keepNext/>
-              <w:keepLines/>
-              <w:spacing w:after="20" w:before="20" w:line="240" w:lineRule="auto"/>
-              <w:ind w:firstLine="0"/>
-              <w:jc w:val="left"/>
-            </w:pPr>
-            <w:r/>
-            <w:r>
-              <w:rPr>
-                <w:rFonts w:ascii="Times New Roman" w:hAnsi="Times New Roman" w:eastAsia="Times New Roman"/>
-                <w:b w:val="0"/>
-                <w:i w:val="0"/>
-                <w:sz w:val="19"/>
-              </w:rPr>
-              <w:t>CHD</w:t>
-            </w:r>
-          </w:p>
-        </w:tc>
-        <w:tc>
-          <w:tcPr>
-            <w:tcW w:type="dxa" w:w="2304"/>
-            <w:tcMar>
-              <w:top w:w="40" w:type="dxa"/>
-              <w:left w:w="55" w:type="dxa"/>
-              <w:bottom w:w="40" w:type="dxa"/>
-              <w:right w:w="55" w:type="dxa"/>
-            </w:tcMar>
-          </w:tcPr>
-          <w:p>
-            <w:pPr>
-              <w:keepNext/>
-              <w:keepLines/>
-              <w:spacing w:after="20" w:before="20" w:line="240" w:lineRule="auto"/>
-              <w:ind w:firstLine="0"/>
-              <w:jc w:val="left"/>
-            </w:pPr>
-            <w:r/>
-            <w:r>
-              <w:rPr>
-                <w:rFonts w:ascii="Times New Roman" w:hAnsi="Times New Roman" w:eastAsia="Times New Roman"/>
-                <w:b w:val="0"/>
-                <w:i w:val="0"/>
-                <w:sz w:val="19"/>
-              </w:rPr>
-              <w:t>Very hot days / 5 days</w:t>
-            </w:r>
-          </w:p>
-        </w:tc>
-        <w:tc>
-          <w:tcPr>
-            <w:tcW w:type="dxa" w:w="2772"/>
-            <w:tcMar>
-              <w:top w:w="40" w:type="dxa"/>
-              <w:left w:w="55" w:type="dxa"/>
-              <w:bottom w:w="40" w:type="dxa"/>
-              <w:right w:w="55" w:type="dxa"/>
-            </w:tcMar>
-          </w:tcPr>
-          <w:p>
-            <w:pPr>
-              <w:keepNext/>
-              <w:keepLines/>
-              <w:spacing w:after="20" w:before="20" w:line="240" w:lineRule="auto"/>
-              <w:ind w:firstLine="0"/>
-              <w:jc w:val="left"/>
-            </w:pPr>
-            <w:r/>
-            <w:r>
-              <w:rPr>
-                <w:rFonts w:ascii="Times New Roman" w:hAnsi="Times New Roman" w:eastAsia="Times New Roman"/>
-                <w:b w:val="0"/>
-                <w:i w:val="0"/>
-                <w:sz w:val="19"/>
-              </w:rPr>
-              <w:t>0.997 (0.982–1.012)</w:t>
-            </w:r>
-          </w:p>
-        </w:tc>
-        <w:tc>
-          <w:tcPr>
-            <w:tcW w:type="dxa" w:w="2772"/>
-            <w:tcMar>
-              <w:top w:w="40" w:type="dxa"/>
-              <w:left w:w="55" w:type="dxa"/>
-              <w:bottom w:w="40" w:type="dxa"/>
-              <w:right w:w="55" w:type="dxa"/>
-            </w:tcMar>
-          </w:tcPr>
-          <w:p>
-            <w:pPr>
-              <w:keepNext/>
-              <w:keepLines/>
-              <w:spacing w:after="20" w:before="20" w:line="240" w:lineRule="auto"/>
-              <w:ind w:firstLine="0"/>
-              <w:jc w:val="left"/>
-            </w:pPr>
-            <w:r/>
-            <w:r>
-              <w:rPr>
-                <w:rFonts w:ascii="Times New Roman" w:hAnsi="Times New Roman" w:eastAsia="Times New Roman"/>
-                <w:b w:val="0"/>
-                <w:i w:val="0"/>
-                <w:sz w:val="19"/>
-              </w:rPr>
-              <w:t>0.999 (0.974–1.025)</w:t>
-            </w:r>
-          </w:p>
-        </w:tc>
-      </w:tr>
-      <w:tr>
-        <w:trPr>
-          <w:cantSplit/>
-        </w:trPr>
-        <w:tc>
-          <w:tcPr>
-            <w:tcW w:type="dxa" w:w="936"/>
-            <w:tcMar>
-              <w:top w:w="40" w:type="dxa"/>
-              <w:left w:w="55" w:type="dxa"/>
-              <w:bottom w:w="40" w:type="dxa"/>
-              <w:right w:w="55" w:type="dxa"/>
-            </w:tcMar>
-          </w:tcPr>
-          <w:p>
-            <w:pPr>
-              <w:keepNext/>
-              <w:keepLines/>
-              <w:spacing w:after="20" w:before="20" w:line="240" w:lineRule="auto"/>
-              <w:ind w:firstLine="0"/>
-              <w:jc w:val="left"/>
-            </w:pPr>
-            <w:r/>
-            <w:r>
-              <w:rPr>
-                <w:rFonts w:ascii="Times New Roman" w:hAnsi="Times New Roman" w:eastAsia="Times New Roman"/>
-                <w:b w:val="0"/>
-                <w:i w:val="0"/>
-                <w:sz w:val="19"/>
-              </w:rPr>
-              <w:t>CHD</w:t>
-            </w:r>
-          </w:p>
-        </w:tc>
-        <w:tc>
-          <w:tcPr>
-            <w:tcW w:type="dxa" w:w="2304"/>
-            <w:tcMar>
-              <w:top w:w="40" w:type="dxa"/>
-              <w:left w:w="55" w:type="dxa"/>
-              <w:bottom w:w="40" w:type="dxa"/>
-              <w:right w:w="55" w:type="dxa"/>
-            </w:tcMar>
-          </w:tcPr>
-          <w:p>
-            <w:pPr>
-              <w:keepNext/>
-              <w:keepLines/>
-              <w:spacing w:after="20" w:before="20" w:line="240" w:lineRule="auto"/>
-              <w:ind w:firstLine="0"/>
-              <w:jc w:val="left"/>
-            </w:pPr>
-            <w:r/>
-            <w:r>
-              <w:rPr>
-                <w:rFonts w:ascii="Times New Roman" w:hAnsi="Times New Roman" w:eastAsia="Times New Roman"/>
-                <w:b w:val="0"/>
-                <w:i w:val="0"/>
-                <w:sz w:val="19"/>
-              </w:rPr>
-              <w:t>Cold days / 5 days</w:t>
-            </w:r>
-          </w:p>
-        </w:tc>
-        <w:tc>
-          <w:tcPr>
-            <w:tcW w:type="dxa" w:w="2772"/>
-            <w:tcMar>
-              <w:top w:w="40" w:type="dxa"/>
-              <w:left w:w="55" w:type="dxa"/>
-              <w:bottom w:w="40" w:type="dxa"/>
-              <w:right w:w="55" w:type="dxa"/>
-            </w:tcMar>
-          </w:tcPr>
-          <w:p>
-            <w:pPr>
-              <w:keepNext/>
-              <w:keepLines/>
-              <w:spacing w:after="20" w:before="20" w:line="240" w:lineRule="auto"/>
-              <w:ind w:firstLine="0"/>
-              <w:jc w:val="left"/>
-            </w:pPr>
-            <w:r/>
-            <w:r>
-              <w:rPr>
-                <w:rFonts w:ascii="Times New Roman" w:hAnsi="Times New Roman" w:eastAsia="Times New Roman"/>
-                <w:b w:val="0"/>
-                <w:i w:val="0"/>
-                <w:sz w:val="19"/>
-              </w:rPr>
-              <w:t>1.036 (1.007–1.067)</w:t>
-            </w:r>
-          </w:p>
-        </w:tc>
-        <w:tc>
-          <w:tcPr>
-            <w:tcW w:type="dxa" w:w="2772"/>
-            <w:tcMar>
-              <w:top w:w="40" w:type="dxa"/>
-              <w:left w:w="55" w:type="dxa"/>
-              <w:bottom w:w="40" w:type="dxa"/>
-              <w:right w:w="55" w:type="dxa"/>
-            </w:tcMar>
-          </w:tcPr>
-          <w:p>
-            <w:pPr>
-              <w:keepNext/>
-              <w:keepLines/>
-              <w:spacing w:after="20" w:before="20" w:line="240" w:lineRule="auto"/>
-              <w:ind w:firstLine="0"/>
-              <w:jc w:val="left"/>
-            </w:pPr>
-            <w:r/>
-            <w:r>
-              <w:rPr>
-                <w:rFonts w:ascii="Times New Roman" w:hAnsi="Times New Roman" w:eastAsia="Times New Roman"/>
-                <w:b w:val="0"/>
-                <w:i w:val="0"/>
-                <w:sz w:val="19"/>
-              </w:rPr>
-              <w:t>0.995 (0.949–1.043)</w:t>
-            </w:r>
-          </w:p>
-        </w:tc>
-      </w:tr>
-      <w:tr>
-        <w:trPr>
-          <w:cantSplit/>
-        </w:trPr>
-        <w:tc>
-          <w:tcPr>
-            <w:tcW w:type="dxa" w:w="936"/>
-            <w:tcMar>
-              <w:top w:w="40" w:type="dxa"/>
-              <w:left w:w="55" w:type="dxa"/>
-              <w:bottom w:w="40" w:type="dxa"/>
-              <w:right w:w="55" w:type="dxa"/>
-            </w:tcMar>
-          </w:tcPr>
-          <w:p>
-            <w:pPr>
-              <w:keepNext/>
-              <w:keepLines/>
-              <w:spacing w:after="20" w:before="20" w:line="240" w:lineRule="auto"/>
-              <w:ind w:firstLine="0"/>
-              <w:jc w:val="left"/>
-            </w:pPr>
-            <w:r/>
-            <w:r>
-              <w:rPr>
-                <w:rFonts w:ascii="Times New Roman" w:hAnsi="Times New Roman" w:eastAsia="Times New Roman"/>
-                <w:b w:val="0"/>
-                <w:i w:val="0"/>
-                <w:sz w:val="19"/>
-              </w:rPr>
-              <w:t>HF</w:t>
-            </w:r>
-          </w:p>
-        </w:tc>
-        <w:tc>
-          <w:tcPr>
-            <w:tcW w:type="dxa" w:w="2304"/>
-            <w:tcMar>
-              <w:top w:w="40" w:type="dxa"/>
-              <w:left w:w="55" w:type="dxa"/>
-              <w:bottom w:w="40" w:type="dxa"/>
-              <w:right w:w="55" w:type="dxa"/>
-            </w:tcMar>
-          </w:tcPr>
-          <w:p>
-            <w:pPr>
-              <w:keepNext/>
-              <w:keepLines/>
-              <w:spacing w:after="20" w:before="20" w:line="240" w:lineRule="auto"/>
-              <w:ind w:firstLine="0"/>
-              <w:jc w:val="left"/>
-            </w:pPr>
-            <w:r/>
-            <w:r>
-              <w:rPr>
-                <w:rFonts w:ascii="Times New Roman" w:hAnsi="Times New Roman" w:eastAsia="Times New Roman"/>
-                <w:b w:val="0"/>
-                <w:i w:val="0"/>
-                <w:sz w:val="19"/>
-              </w:rPr>
-              <w:t>Hot nights / 5 days</w:t>
-            </w:r>
-          </w:p>
-        </w:tc>
-        <w:tc>
-          <w:tcPr>
-            <w:tcW w:type="dxa" w:w="2772"/>
-            <w:tcMar>
-              <w:top w:w="40" w:type="dxa"/>
-              <w:left w:w="55" w:type="dxa"/>
-              <w:bottom w:w="40" w:type="dxa"/>
-              <w:right w:w="55" w:type="dxa"/>
-            </w:tcMar>
-          </w:tcPr>
-          <w:p>
-            <w:pPr>
-              <w:keepNext/>
-              <w:keepLines/>
-              <w:spacing w:after="20" w:before="20" w:line="240" w:lineRule="auto"/>
-              <w:ind w:firstLine="0"/>
-              <w:jc w:val="left"/>
-            </w:pPr>
-            <w:r/>
-            <w:r>
-              <w:rPr>
-                <w:rFonts w:ascii="Times New Roman" w:hAnsi="Times New Roman" w:eastAsia="Times New Roman"/>
-                <w:b w:val="0"/>
-                <w:i w:val="0"/>
-                <w:sz w:val="19"/>
-              </w:rPr>
-              <w:t>0.965 (0.937–0.994)</w:t>
-            </w:r>
-          </w:p>
-        </w:tc>
-        <w:tc>
-          <w:tcPr>
-            <w:tcW w:type="dxa" w:w="2772"/>
-            <w:tcMar>
-              <w:top w:w="40" w:type="dxa"/>
-              <w:left w:w="55" w:type="dxa"/>
-              <w:bottom w:w="40" w:type="dxa"/>
-              <w:right w:w="55" w:type="dxa"/>
-            </w:tcMar>
-          </w:tcPr>
-          <w:p>
-            <w:pPr>
-              <w:keepNext/>
-              <w:keepLines/>
-              <w:spacing w:after="20" w:before="20" w:line="240" w:lineRule="auto"/>
-              <w:ind w:firstLine="0"/>
-              <w:jc w:val="left"/>
-            </w:pPr>
-            <w:r/>
-            <w:r>
-              <w:rPr>
-                <w:rFonts w:ascii="Times New Roman" w:hAnsi="Times New Roman" w:eastAsia="Times New Roman"/>
-                <w:b w:val="0"/>
-                <w:i w:val="0"/>
-                <w:sz w:val="19"/>
-              </w:rPr>
-              <w:t>1.003 (0.976–1.031)</w:t>
-            </w:r>
-          </w:p>
-        </w:tc>
-      </w:tr>
-      <w:tr>
-        <w:trPr>
-          <w:cantSplit/>
-        </w:trPr>
-        <w:tc>
-          <w:tcPr>
-            <w:tcW w:type="dxa" w:w="936"/>
-            <w:tcMar>
-              <w:top w:w="40" w:type="dxa"/>
-              <w:left w:w="55" w:type="dxa"/>
-              <w:bottom w:w="40" w:type="dxa"/>
-              <w:right w:w="55" w:type="dxa"/>
-            </w:tcMar>
-          </w:tcPr>
-          <w:p>
-            <w:pPr>
-              <w:keepNext/>
-              <w:keepLines/>
-              <w:spacing w:after="20" w:before="20" w:line="240" w:lineRule="auto"/>
-              <w:ind w:firstLine="0"/>
-              <w:jc w:val="left"/>
-            </w:pPr>
-            <w:r/>
-            <w:r>
-              <w:rPr>
-                <w:rFonts w:ascii="Times New Roman" w:hAnsi="Times New Roman" w:eastAsia="Times New Roman"/>
-                <w:b w:val="0"/>
-                <w:i w:val="0"/>
-                <w:sz w:val="19"/>
-              </w:rPr>
-              <w:t>HF</w:t>
-            </w:r>
-          </w:p>
-        </w:tc>
-        <w:tc>
-          <w:tcPr>
-            <w:tcW w:type="dxa" w:w="2304"/>
-            <w:tcMar>
-              <w:top w:w="40" w:type="dxa"/>
-              <w:left w:w="55" w:type="dxa"/>
-              <w:bottom w:w="40" w:type="dxa"/>
-              <w:right w:w="55" w:type="dxa"/>
-            </w:tcMar>
-          </w:tcPr>
-          <w:p>
-            <w:pPr>
-              <w:keepNext/>
-              <w:keepLines/>
-              <w:spacing w:after="20" w:before="20" w:line="240" w:lineRule="auto"/>
-              <w:ind w:firstLine="0"/>
-              <w:jc w:val="left"/>
-            </w:pPr>
-            <w:r/>
-            <w:r>
-              <w:rPr>
-                <w:rFonts w:ascii="Times New Roman" w:hAnsi="Times New Roman" w:eastAsia="Times New Roman"/>
-                <w:b w:val="0"/>
-                <w:i w:val="0"/>
-                <w:sz w:val="19"/>
-              </w:rPr>
-              <w:t>Very hot days / 5 days</w:t>
-            </w:r>
-          </w:p>
-        </w:tc>
-        <w:tc>
-          <w:tcPr>
-            <w:tcW w:type="dxa" w:w="2772"/>
-            <w:tcMar>
-              <w:top w:w="40" w:type="dxa"/>
-              <w:left w:w="55" w:type="dxa"/>
-              <w:bottom w:w="40" w:type="dxa"/>
-              <w:right w:w="55" w:type="dxa"/>
-            </w:tcMar>
-          </w:tcPr>
-          <w:p>
-            <w:pPr>
-              <w:keepNext/>
-              <w:keepLines/>
-              <w:spacing w:after="20" w:before="20" w:line="240" w:lineRule="auto"/>
-              <w:ind w:firstLine="0"/>
-              <w:jc w:val="left"/>
-            </w:pPr>
-            <w:r/>
-            <w:r>
-              <w:rPr>
-                <w:rFonts w:ascii="Times New Roman" w:hAnsi="Times New Roman" w:eastAsia="Times New Roman"/>
-                <w:b w:val="0"/>
-                <w:i w:val="0"/>
-                <w:sz w:val="19"/>
-              </w:rPr>
-              <w:t>0.990 (0.960–1.021)</w:t>
-            </w:r>
-          </w:p>
-        </w:tc>
-        <w:tc>
-          <w:tcPr>
-            <w:tcW w:type="dxa" w:w="2772"/>
-            <w:tcMar>
-              <w:top w:w="40" w:type="dxa"/>
-              <w:left w:w="55" w:type="dxa"/>
-              <w:bottom w:w="40" w:type="dxa"/>
-              <w:right w:w="55" w:type="dxa"/>
-            </w:tcMar>
-          </w:tcPr>
-          <w:p>
-            <w:pPr>
-              <w:keepNext/>
-              <w:keepLines/>
-              <w:spacing w:after="20" w:before="20" w:line="240" w:lineRule="auto"/>
-              <w:ind w:firstLine="0"/>
-              <w:jc w:val="left"/>
-            </w:pPr>
-            <w:r/>
-            <w:r>
-              <w:rPr>
-                <w:rFonts w:ascii="Times New Roman" w:hAnsi="Times New Roman" w:eastAsia="Times New Roman"/>
-                <w:b w:val="0"/>
-                <w:i w:val="0"/>
-                <w:sz w:val="19"/>
-              </w:rPr>
-              <w:t>0.995 (0.963–1.028)</w:t>
-            </w:r>
-          </w:p>
-        </w:tc>
-      </w:tr>
-      <w:tr>
-        <w:trPr>
-          <w:cantSplit/>
-        </w:trPr>
-        <w:tc>
-          <w:tcPr>
-            <w:tcW w:type="dxa" w:w="936"/>
-            <w:tcMar>
-              <w:top w:w="40" w:type="dxa"/>
-              <w:left w:w="55" w:type="dxa"/>
-              <w:bottom w:w="40" w:type="dxa"/>
-              <w:right w:w="55" w:type="dxa"/>
-            </w:tcMar>
-          </w:tcPr>
-          <w:p>
-            <w:pPr>
-              <w:keepNext w:val="0"/>
-              <w:keepLines/>
-              <w:spacing w:after="20" w:before="20" w:line="240" w:lineRule="auto"/>
-              <w:ind w:firstLine="0"/>
-              <w:jc w:val="left"/>
-            </w:pPr>
-            <w:r/>
-            <w:r>
-              <w:rPr>
-                <w:rFonts w:ascii="Times New Roman" w:hAnsi="Times New Roman" w:eastAsia="Times New Roman"/>
-                <w:b w:val="0"/>
-                <w:i w:val="0"/>
-                <w:sz w:val="19"/>
-              </w:rPr>
-              <w:t>HF</w:t>
-            </w:r>
-          </w:p>
-        </w:tc>
-        <w:tc>
-          <w:tcPr>
-            <w:tcW w:type="dxa" w:w="2304"/>
-            <w:tcMar>
-              <w:top w:w="40" w:type="dxa"/>
-              <w:left w:w="55" w:type="dxa"/>
-              <w:bottom w:w="40" w:type="dxa"/>
-              <w:right w:w="55" w:type="dxa"/>
-            </w:tcMar>
-          </w:tcPr>
-          <w:p>
-            <w:pPr>
-              <w:keepNext w:val="0"/>
-              <w:keepLines/>
-              <w:spacing w:after="20" w:before="20" w:line="240" w:lineRule="auto"/>
-              <w:ind w:firstLine="0"/>
-              <w:jc w:val="left"/>
-            </w:pPr>
-            <w:r/>
-            <w:r>
-              <w:rPr>
-                <w:rFonts w:ascii="Times New Roman" w:hAnsi="Times New Roman" w:eastAsia="Times New Roman"/>
-                <w:b w:val="0"/>
-                <w:i w:val="0"/>
-                <w:sz w:val="19"/>
-              </w:rPr>
-              <w:t>Cold days / 5 days</w:t>
-            </w:r>
-          </w:p>
-        </w:tc>
-        <w:tc>
-          <w:tcPr>
-            <w:tcW w:type="dxa" w:w="2772"/>
-            <w:tcMar>
-              <w:top w:w="40" w:type="dxa"/>
-              <w:left w:w="55" w:type="dxa"/>
-              <w:bottom w:w="40" w:type="dxa"/>
-              <w:right w:w="55" w:type="dxa"/>
-            </w:tcMar>
-          </w:tcPr>
-          <w:p>
-            <w:pPr>
-              <w:keepNext w:val="0"/>
-              <w:keepLines/>
-              <w:spacing w:after="20" w:before="20" w:line="240" w:lineRule="auto"/>
-              <w:ind w:firstLine="0"/>
-              <w:jc w:val="left"/>
-            </w:pPr>
-            <w:r/>
-            <w:r>
-              <w:rPr>
-                <w:rFonts w:ascii="Times New Roman" w:hAnsi="Times New Roman" w:eastAsia="Times New Roman"/>
-                <w:b w:val="0"/>
-                <w:i w:val="0"/>
-                <w:sz w:val="19"/>
-              </w:rPr>
-              <w:t>1.113 (1.053–1.176)</w:t>
-            </w:r>
-          </w:p>
-        </w:tc>
-        <w:tc>
-          <w:tcPr>
-            <w:tcW w:type="dxa" w:w="2772"/>
-            <w:tcMar>
-              <w:top w:w="40" w:type="dxa"/>
-              <w:left w:w="55" w:type="dxa"/>
-              <w:bottom w:w="40" w:type="dxa"/>
-              <w:right w:w="55" w:type="dxa"/>
-            </w:tcMar>
-          </w:tcPr>
-          <w:p>
-            <w:pPr>
-              <w:keepNext w:val="0"/>
-              <w:keepLines/>
-              <w:spacing w:after="20" w:before="20" w:line="240" w:lineRule="auto"/>
-              <w:ind w:firstLine="0"/>
-              <w:jc w:val="left"/>
-            </w:pPr>
-            <w:r/>
-            <w:r>
-              <w:rPr>
-                <w:rFonts w:ascii="Times New Roman" w:hAnsi="Times New Roman" w:eastAsia="Times New Roman"/>
-                <w:b w:val="0"/>
-                <w:i w:val="0"/>
-                <w:sz w:val="19"/>
-              </w:rPr>
-              <w:t>1.073 (1.006–1.144)</w:t>
-            </w:r>
-          </w:p>
-        </w:tc>
-      </w:tr>
-    </w:tbl>
-    <w:p>
-      <w:pPr>
-        <w:spacing w:after="120" w:before="0" w:line="240" w:lineRule="auto"/>
-        <w:ind w:firstLine="0"/>
-        <w:jc w:val="left"/>
-      </w:pPr>
-      <w:r>
-        <w:rPr>
-          <w:rFonts w:ascii="Times New Roman" w:hAnsi="Times New Roman" w:eastAsia="Times New Roman"/>
-          <w:b w:val="0"/>
-          <w:i w:val="0"/>
-          <w:sz w:val="4"/>
-        </w:rPr>
-      </w:r>
-    </w:p>
-    <w:p>
-      <w:pPr>
-        <w:spacing w:after="160" w:before="0" w:line="240" w:lineRule="auto"/>
-        <w:ind w:firstLine="0"/>
-        <w:jc w:val="left"/>
-      </w:pPr>
-      <w:r>
-        <w:rPr>
-          <w:rFonts w:ascii="Times New Roman" w:hAnsi="Times New Roman" w:eastAsia="Times New Roman"/>
-          <w:b w:val="0"/>
-          <w:i w:val="0"/>
-          <w:sz w:val="23"/>
-        </w:rPr>
-        <w:t>Hot-night estimates increased in both outcomes when later years were included: from 1.011 to 1.022 for CHD and from 0.965 to 1.003 for HF. Very-hot-day estimates were close to one in both windows. The different exposure encodings also gave different associations. Monthly mean temperature was inversely associated with counts in the nested window for CHD, 0.980 (0.970–0.990), and HF, 0.945 (0.927–0.963), while cold-day counts were positively associated with both. Monthly mean temperature and threshold-day frequency do not estimate the same thermal contrast.</w:t>
-      </w:r>
-    </w:p>
-    <w:p>
-      <w:pPr>
-        <w:spacing w:after="160" w:before="0" w:line="240" w:lineRule="auto"/>
-        <w:ind w:firstLine="0"/>
-        <w:jc w:val="left"/>
-      </w:pPr>
-      <w:r>
-        <w:rPr>
-          <w:rFonts w:ascii="Times New Roman" w:hAnsi="Times New Roman" w:eastAsia="Times New Roman"/>
-          <w:b w:val="0"/>
-          <w:i w:val="0"/>
-          <w:sz w:val="23"/>
-        </w:rPr>
-        <w:t>The complete twelve-fit full-window panel is reported in Supplementary Table S2. The smallest adjusted q-value was 0.192; all twelve exceeded 0.19. The panel therefore does not support a multiplicity-protected thermal claim. It also does not establish the absence of a weather contribution to the count trajectory.</w:t>
-      </w:r>
-    </w:p>
-    <w:p>
-      <w:pPr>
-        <w:pStyle w:val="Heading2"/>
-        <w:keepNext/>
-        <w:keepLines/>
-        <w:spacing w:after="120" w:before="160" w:line="240" w:lineRule="auto"/>
-        <w:ind w:firstLine="0"/>
-        <w:jc w:val="left"/>
-      </w:pPr>
-      <w:r>
-        <w:rPr>
-          <w:rFonts w:ascii="Times New Roman" w:hAnsi="Times New Roman" w:eastAsia="Times New Roman"/>
-          <w:b/>
-          <w:i w:val="0"/>
-          <w:sz w:val="23"/>
-        </w:rPr>
-        <w:t>Dependence on calendar control and uncertainty</w:t>
-      </w:r>
-    </w:p>
-    <w:p>
-      <w:pPr>
-        <w:spacing w:after="160" w:before="0" w:line="240" w:lineRule="auto"/>
-        <w:ind w:firstLine="0"/>
-        <w:jc w:val="left"/>
-      </w:pPr>
-      <w:r>
-        <w:rPr>
-          <w:rFonts w:ascii="Times New Roman" w:hAnsi="Times New Roman" w:eastAsia="Times New Roman"/>
-          <w:b w:val="0"/>
-          <w:i w:val="0"/>
-          <w:sz w:val="23"/>
-        </w:rPr>
-        <w:t>The exploratory associations varied across calendar specifications (Supplementary Table S3). The full-window HF cold-day lag-six interval included one with an eight-degree-of-freedom spline, year indicators, or omission of the first twelve or twenty-four months. Adding COVID-phase intercepts gave a CHD hot-night ratio of 1.013 (0.994–1.033) and an HF cold-day ratio of 1.074 (1.006–1.145). This adjustment changed the calendar comparison but did not identify a pandemic effect or separate its mechanisms.</w:t>
-      </w:r>
-    </w:p>
-    <w:p>
-      <w:pPr>
-        <w:keepNext/>
-        <w:keepLines/>
-        <w:spacing w:after="120" w:before="0" w:line="240" w:lineRule="auto"/>
-        <w:ind w:firstLine="0"/>
-        <w:jc w:val="left"/>
-      </w:pPr>
-      <w:r>
-        <w:rPr>
-          <w:rFonts w:ascii="Times New Roman" w:hAnsi="Times New Roman" w:eastAsia="Times New Roman"/>
-          <w:b w:val="0"/>
-          <w:i/>
-          <w:sz w:val="21"/>
-        </w:rPr>
-        <w:t>Figure 3. Calendar specification sensitivity of selected exploratory associations. CHD hot-night and HF cold-day count ratios per five additional days, with Newey–West lag-six 95% confidence intervals. These previously discussed contrasts are displayed to reveal specification dependence; they were not selected as confirmatory findings. The complete official-day sensitivity panel is in Supplementary Table S3 and the complete baseline family in S2. Omission checks change the sample as well as the calendar fit. An interval crossing one is not a formal test of a difference between specifications.</w:t>
-      </w:r>
-    </w:p>
-    <w:p>
-      <w:pPr>
-        <w:keepLines/>
-        <w:spacing w:after="160" w:before="0" w:line="240" w:lineRule="auto"/>
-        <w:ind w:firstLine="0"/>
-        <w:jc w:val="center"/>
-      </w:pPr>
-      <w:r>
-        <w:drawing>
-          <wp:inline xmlns:a="http://schemas.openxmlformats.org/drawingml/2006/main" xmlns:pic="http://schemas.openxmlformats.org/drawingml/2006/picture">
-            <wp:extent cx="5577840" cy="2557866"/>
-            <wp:docPr id="3" name="Picture 3"/>
-            <wp:cNvGraphicFramePr>
-              <a:graphicFrameLocks noChangeAspect="1"/>
-            </wp:cNvGraphicFramePr>
-            <a:graphic>
-              <a:graphicData uri="http://schemas.openxmlformats.org/drawingml/2006/picture">
-                <pic:pic>
-                  <pic:nvPicPr>
-                    <pic:cNvPr id="0" name="figure_calendar_sensitivity_20261002.png"/>
-                    <pic:cNvPicPr/>
-                  </pic:nvPicPr>
-                  <pic:blipFill>
-                    <a:blip r:embed="rId13"/>
-                    <a:stretch>
-                      <a:fillRect/>
-                    </a:stretch>
-                  </pic:blipFill>
-                  <pic:spPr>
-                    <a:xfrm>
-                      <a:off x="0" y="0"/>
-                      <a:ext cx="5577840" cy="2557866"/>
-                    </a:xfrm>
-                    <a:prstGeom prst="rect"/>
-                  </pic:spPr>
-                </pic:pic>
-              </a:graphicData>
-            </a:graphic>
-          </wp:inline>
-        </w:drawing>
-      </w:r>
-    </w:p>
-    <w:p>
-      <w:pPr>
-        <w:spacing w:after="160" w:before="0" w:line="240" w:lineRule="auto"/>
-        <w:ind w:firstLine="0"/>
-        <w:jc w:val="left"/>
-      </w:pPr>
-      <w:r>
-        <w:rPr>
-          <w:rFonts w:ascii="Times New Roman" w:hAnsi="Times New Roman" w:eastAsia="Times New Roman"/>
-          <w:b w:val="0"/>
-          <w:i w:val="0"/>
-          <w:sz w:val="23"/>
-        </w:rPr>
-        <w:t>Uncertainty construction also affected interpretation (Supplementary Table S4). For full-window CHD hot nights, the model-based interval was 0.995–1.049 and the HC1 interval was 0.997–1.047, whereas the lag-six interval was 1.002–1.042. Pearson residual autocorrelation at lag one was 0.508 for that model. The lag-six interval being narrower does not itself show that the covariance estimate is invalid: a sandwich covariance depends on regression score autocovariances, not solely on residual autocorrelation. Residual dependence nevertheless warrants caution about finite-sample inference. Agreement among baseline HF cold-day uncertainty methods did not overcome its calendar sensitivity or multiplicity adjustment.</w:t>
+        <w:t>The aggregate descriptive and model summaries supporting the figures and tables are available in the Laidlaw Heat Project repository. Individual records and the underlying governed monthly hospitalisation files are not reproduced. Access to underlying health data is controlled by the data custodian. Environmental sources are the Hong Kong Observatory, Environmental Protection Department and Centre for Health Protection.</w:t>
       </w:r>
     </w:p>
     <w:p>
@@ -3317,7 +1389,7 @@
           <w:i w:val="0"/>
           <w:sz w:val="27"/>
         </w:rPr>
-        <w:t>Discussion</w:t>
+        <w:t>Code availability</w:t>
       </w:r>
     </w:p>
     <w:p>
@@ -3333,380 +1405,7 @@
           <w:i w:val="0"/>
           <w:sz w:val="23"/>
         </w:rPr>
-        <w:t>The count trajectory has three features: a substantial decline before 2020, a further fall in 2020, and recovery towards 2019 levels by 2023. The thermal analysis has a different result: estimated associations depended on the analysis window, exposure encoding and calendar control. Together, these observations motivate investigation of the pandemic-era change in recorded first events. They do not identify improved cardiovascular physiology.</w:t>
-      </w:r>
-    </w:p>
-    <w:p>
-      <w:pPr>
-        <w:pStyle w:val="Heading2"/>
-        <w:keepNext/>
-        <w:keepLines/>
-        <w:spacing w:after="120" w:before="160" w:line="240" w:lineRule="auto"/>
-        <w:ind w:firstLine="0"/>
-        <w:jc w:val="left"/>
-      </w:pPr>
-      <w:r>
-        <w:rPr>
-          <w:rFonts w:ascii="Times New Roman" w:hAnsi="Times New Roman" w:eastAsia="Times New Roman"/>
-          <w:b/>
-          <w:i w:val="0"/>
-          <w:sz w:val="23"/>
-        </w:rPr>
-        <w:t>Care use and first event ascertainment</w:t>
-      </w:r>
-    </w:p>
-    <w:p>
-      <w:pPr>
-        <w:spacing w:after="160" w:before="0" w:line="240" w:lineRule="auto"/>
-        <w:ind w:firstLine="0"/>
-        <w:jc w:val="left"/>
-      </w:pPr>
-      <w:r>
-        <w:rPr>
-          <w:rFonts w:ascii="Times New Roman" w:hAnsi="Times New Roman" w:eastAsia="Times New Roman"/>
-          <w:b w:val="0"/>
-          <w:i w:val="0"/>
-          <w:sz w:val="23"/>
-        </w:rPr>
-        <w:t>Care disruption is a plausible explanation for part of the 2020 dip. Hong Kong studies reported fewer hospitalisations or emergency visits alongside higher mortality [1,2]. The more closely matched diabetes and hypertension studies examined cardiovascular diagnosis rates alongside care use and mortality [15,16]. Hu and colleagues also reported blood-pressure control below pre-pandemic levels among measured patients [16]. These studies weaken a general interpretation of fewer recorded events as better cardiovascular health. They cannot explain this particular series by direct transfer of their effect estimates: our outcome is a first recorded stay after diagnosis, with neither validated admission cause nor eligible person-time.</w:t>
-      </w:r>
-    </w:p>
-    <w:p>
-      <w:pPr>
-        <w:spacing w:after="160" w:before="0" w:line="240" w:lineRule="auto"/>
-        <w:ind w:firstLine="0"/>
-        <w:jc w:val="left"/>
-      </w:pPr>
-      <w:r>
-        <w:rPr>
-          <w:rFonts w:ascii="Times New Roman" w:hAnsi="Times New Roman" w:eastAsia="Times New Roman"/>
-          <w:b w:val="0"/>
-          <w:i w:val="0"/>
-          <w:sz w:val="23"/>
-        </w:rPr>
-        <w:t>First-event ascertainment offers another explanation. Entry into the eligible population, diagnosis look-back, removal after a first recorded event, competing deaths and changes in service coding may all alter counts. The available metadata do not show which of these processes occurred. In particular, the early maximum does not prove an artefact of first-in-window recording, and the later rebound does not disprove a changing risk set. These possibilities require the extraction rules and eligible population by month, rather than another temperature specification.</w:t>
-      </w:r>
-    </w:p>
-    <w:p>
-      <w:pPr>
-        <w:pStyle w:val="Heading2"/>
-        <w:keepNext/>
-        <w:keepLines/>
-        <w:spacing w:after="120" w:before="160" w:line="240" w:lineRule="auto"/>
-        <w:ind w:firstLine="0"/>
-        <w:jc w:val="left"/>
-      </w:pPr>
-      <w:r>
-        <w:rPr>
-          <w:rFonts w:ascii="Times New Roman" w:hAnsi="Times New Roman" w:eastAsia="Times New Roman"/>
-          <w:b/>
-          <w:i w:val="0"/>
-          <w:sz w:val="23"/>
-        </w:rPr>
-        <w:t>Physiological change and competing explanations</w:t>
-      </w:r>
-    </w:p>
-    <w:p>
-      <w:pPr>
-        <w:spacing w:after="160" w:before="0" w:line="240" w:lineRule="auto"/>
-        <w:ind w:firstLine="0"/>
-        <w:jc w:val="left"/>
-      </w:pPr>
-      <w:r>
-        <w:rPr>
-          <w:rFonts w:ascii="Times New Roman" w:hAnsi="Times New Roman" w:eastAsia="Times New Roman"/>
-          <w:b w:val="0"/>
-          <w:i w:val="0"/>
-          <w:sz w:val="23"/>
-        </w:rPr>
-        <w:t>Evidence of metabolic improvement during pandemic restrictions is heterogeneous. Huang and colleagues observed lower HbA1c and fasting glucose after restrictions among retained diabetes outpatients in Taiwan [7]. A Tokyo diabetes cohort instead showed small adverse changes in glycaemia and lipids [8]. Both studies concerned patients who remained under observation, with potential changes in treatment, attendance and seasonal timing. Neither establishes a population-wide cardiovascular benefit in Hong Kong.</w:t>
-      </w:r>
-    </w:p>
-    <w:p>
-      <w:pPr>
-        <w:spacing w:after="160" w:before="0" w:line="240" w:lineRule="auto"/>
-        <w:ind w:firstLine="0"/>
-        <w:jc w:val="left"/>
-      </w:pPr>
-      <w:r>
-        <w:rPr>
-          <w:rFonts w:ascii="Times New Roman" w:hAnsi="Times New Roman" w:eastAsia="Times New Roman"/>
-          <w:b w:val="0"/>
-          <w:i w:val="0"/>
-          <w:sz w:val="23"/>
-        </w:rPr>
-        <w:t>A local primary-care study, by Wong and colleagues, found no evidence of an overall adjusted improvement in HbA1c or blood pressure among regular primary-care attenders with type 2 diabetes [9]. Its group labels referred to 2019 and 2020, but the actual sampling windows were February–March 2020 and February–March 2021. Its first window was already after the initial Hong Kong outbreak. It is therefore neither a clean pre-pandemic comparison nor an individual longitudinal assessment. A separate small Hong Kong follow-up of COVID-19 survivors with acute dysglycaemia found worsening rather than improved glycaemic status [10]. These findings weaken a broad metabolic-improvement explanation without excluding benefits in particular patient groups.</w:t>
-      </w:r>
-    </w:p>
-    <w:p>
-      <w:pPr>
-        <w:spacing w:after="160" w:before="0" w:line="240" w:lineRule="auto"/>
-        <w:ind w:firstLine="0"/>
-        <w:jc w:val="left"/>
-      </w:pPr>
-      <w:r>
-        <w:rPr>
-          <w:rFonts w:ascii="Times New Roman" w:hAnsi="Times New Roman" w:eastAsia="Times New Roman"/>
-          <w:b w:val="0"/>
-          <w:i w:val="0"/>
-          <w:sz w:val="23"/>
-        </w:rPr>
-        <w:t>Reduced respiratory infection is another candidate. Hong Kong non-pharmaceutical interventions coincided with reduced influenza transmission in early 2020 [11]. Laboratory-confirmed influenza has been associated with acute myocardial infarction in a self-controlled study [12], and community influenza-like illness activity with HF hospitalisation in the ARIC study [13]. A reduction in winter respiratory triggers could change observed cold-day associations without any reduction in the direct physiological effect of cold. This remains an untested explanation here: infection was not measured in the study population, and these external outcomes differ from the first recorded post-diagnosis stay.</w:t>
-      </w:r>
-    </w:p>
-    <w:p>
-      <w:pPr>
-        <w:spacing w:after="160" w:before="0" w:line="240" w:lineRule="auto"/>
-        <w:ind w:firstLine="0"/>
-        <w:jc w:val="left"/>
-      </w:pPr>
-      <w:r>
-        <w:rPr>
-          <w:rFonts w:ascii="Times New Roman" w:hAnsi="Times New Roman" w:eastAsia="Times New Roman"/>
-          <w:b w:val="0"/>
-          <w:i w:val="0"/>
-          <w:sz w:val="23"/>
-        </w:rPr>
-        <w:t>Vaccination and changes in prevention may have affected later years. Wan and colleagues reported lower acute and post-acute cardiovascular event risk among vaccinated than unvaccinated people with SARS-CoV-2 infection in Hong Kong [14]. That comparison concerns vaccination among infected people, with observational confounding and a different cardiovascular endpoint. It does not establish better baseline health in the whole eligible population, and it cannot explain a dip that preceded vaccination. Treatment, behaviour, infection, care use and recording may have operated simultaneously.</w:t>
-      </w:r>
-    </w:p>
-    <w:p>
-      <w:pPr>
-        <w:pStyle w:val="Heading2"/>
-        <w:keepNext/>
-        <w:keepLines/>
-        <w:spacing w:after="120" w:before="160" w:line="240" w:lineRule="auto"/>
-        <w:ind w:firstLine="0"/>
-        <w:jc w:val="left"/>
-      </w:pPr>
-      <w:r>
-        <w:rPr>
-          <w:rFonts w:ascii="Times New Roman" w:hAnsi="Times New Roman" w:eastAsia="Times New Roman"/>
-          <w:b/>
-          <w:i w:val="0"/>
-          <w:sz w:val="23"/>
-        </w:rPr>
-        <w:t>Clinical follow up and the scope of inference</w:t>
-      </w:r>
-    </w:p>
-    <w:p>
-      <w:pPr>
-        <w:spacing w:after="160" w:before="0" w:line="240" w:lineRule="auto"/>
-        <w:ind w:firstLine="0"/>
-        <w:jc w:val="left"/>
-      </w:pPr>
-      <w:r>
-        <w:rPr>
-          <w:rFonts w:ascii="Times New Roman" w:hAnsi="Times New Roman" w:eastAsia="Times New Roman"/>
-          <w:b w:val="0"/>
-          <w:i w:val="0"/>
-          <w:sz w:val="23"/>
-        </w:rPr>
-        <w:t>Yau and colleagues examined continuity of diabetes care in patients who attended repeatedly and remained alive and free of the study outcomes at a June 2022 landmark [17]. Their later follow-up associated reduced continuity with CHD, HF and kidney failure; results for stroke and all-cause mortality were less conclusive. Such a design supplies clinical and service information absent here, but it addresses a selected population and a different question. Selection on continued attendance, survival and future infection status can alter who contributes to an analysis. These choices require explicit interpretation rather than being treated as complete removal of confounding.</w:t>
-      </w:r>
-    </w:p>
-    <w:p>
-      <w:pPr>
-        <w:spacing w:after="160" w:before="0" w:line="240" w:lineRule="auto"/>
-        <w:ind w:firstLine="0"/>
-        <w:jc w:val="left"/>
-      </w:pPr>
-      <w:r>
-        <w:rPr>
-          <w:rFonts w:ascii="Times New Roman" w:hAnsi="Times New Roman" w:eastAsia="Times New Roman"/>
-          <w:b w:val="0"/>
-          <w:i w:val="0"/>
-          <w:sz w:val="23"/>
-        </w:rPr>
-        <w:t>A study that distinguishes health change from observation change would need to evaluate eligible populations, validated events, deaths, care contacts and testing together. Repeated measurements should be analysed alongside the probability and timing of measurement. The explanations can coexist: care disruption may delay diagnoses while changes in infection exposure or treatment alter disease risk. Neither a better biomarker profile in retained patients nor attenuation after adding a service-use covariate would alone identify the mechanism.</w:t>
-      </w:r>
-    </w:p>
-    <w:p>
-      <w:pPr>
-        <w:pStyle w:val="Heading2"/>
-        <w:keepNext/>
-        <w:keepLines/>
-        <w:spacing w:after="120" w:before="160" w:line="240" w:lineRule="auto"/>
-        <w:ind w:firstLine="0"/>
-        <w:jc w:val="left"/>
-      </w:pPr>
-      <w:r>
-        <w:rPr>
-          <w:rFonts w:ascii="Times New Roman" w:hAnsi="Times New Roman" w:eastAsia="Times New Roman"/>
-          <w:b/>
-          <w:i w:val="0"/>
-          <w:sz w:val="23"/>
-        </w:rPr>
-        <w:t>What the thermal models establish</w:t>
-      </w:r>
-    </w:p>
-    <w:p>
-      <w:pPr>
-        <w:spacing w:after="160" w:before="0" w:line="240" w:lineRule="auto"/>
-        <w:ind w:firstLine="0"/>
-        <w:jc w:val="left"/>
-      </w:pPr>
-      <w:r>
-        <w:rPr>
-          <w:rFonts w:ascii="Times New Roman" w:hAnsi="Times New Roman" w:eastAsia="Times New Roman"/>
-          <w:b w:val="0"/>
-          <w:i w:val="0"/>
-          <w:sz w:val="23"/>
-        </w:rPr>
-        <w:t>The nested fits show sensitivity to adding later years, not a change in a causal weather effect. Their samples overlap and their spline bases differ. A pandemic-era utilisation shock can change a fitted weather coefficient if its timing is associated with weather after calendar adjustment; a lower overall count does not predict attenuation in every model. Conversely, similar coefficients would not rule out changing susceptibility. The direction of coefficient movement alone cannot discriminate between these explanations.</w:t>
-      </w:r>
-    </w:p>
-    <w:p>
-      <w:pPr>
-        <w:spacing w:after="160" w:before="0" w:line="240" w:lineRule="auto"/>
-        <w:ind w:firstLine="0"/>
-        <w:jc w:val="left"/>
-      </w:pPr>
-      <w:r>
-        <w:rPr>
-          <w:rFonts w:ascii="Times New Roman" w:hAnsi="Times New Roman" w:eastAsia="Times New Roman"/>
-          <w:b w:val="0"/>
-          <w:i w:val="0"/>
-          <w:sz w:val="23"/>
-        </w:rPr>
-        <w:t>The thermal panel also cannot exclude weather as an explanation for the count trajectory. Such a claim would require an explicit decomposition or standardisation with a defined counterfactual, adequate exposure support and controlled confounding. Non-rejection after multiplicity adjustment supplies no such decomposition. Sparse official cold days and monthly aggregation further limit discrimination between cold itself, seasonal infection and care-use patterns.</w:t>
-      </w:r>
-    </w:p>
-    <w:p>
-      <w:pPr>
-        <w:pStyle w:val="Heading2"/>
-        <w:keepNext/>
-        <w:keepLines/>
-        <w:spacing w:after="120" w:before="160" w:line="240" w:lineRule="auto"/>
-        <w:ind w:firstLine="0"/>
-        <w:jc w:val="left"/>
-      </w:pPr>
-      <w:r>
-        <w:rPr>
-          <w:rFonts w:ascii="Times New Roman" w:hAnsi="Times New Roman" w:eastAsia="Times New Roman"/>
-          <w:b/>
-          <w:i w:val="0"/>
-          <w:sz w:val="23"/>
-        </w:rPr>
-        <w:t>Limitations and implications</w:t>
-      </w:r>
-    </w:p>
-    <w:p>
-      <w:pPr>
-        <w:spacing w:after="160" w:before="0" w:line="240" w:lineRule="auto"/>
-        <w:ind w:firstLine="0"/>
-        <w:jc w:val="left"/>
-      </w:pPr>
-      <w:r>
-        <w:rPr>
-          <w:rFonts w:ascii="Times New Roman" w:hAnsi="Times New Roman" w:eastAsia="Times New Roman"/>
-          <w:b w:val="0"/>
-          <w:i w:val="0"/>
-          <w:sz w:val="23"/>
-        </w:rPr>
-        <w:t>The main limitation is the event construction. Without recorded admission cause, eligible person-time or validated first-event rules, these counts cannot measure disease-specific incidence. Laboratory and medication data were absent, preventing direct assessment of physiological change. Monthly aggregation obscures daily timing, and secular trends may reflect changing diagnosis, treatment, eligibility and recording. The available thermal models did not include a separate later-era coefficient or an interaction, and exploratory sensitivity analyses did not receive joint multiplicity adjustment. Annual comparisons did not estimate a counterfactual pandemic effect.</w:t>
-      </w:r>
-    </w:p>
-    <w:p>
-      <w:pPr>
-        <w:spacing w:after="160" w:before="0" w:line="240" w:lineRule="auto"/>
-        <w:ind w:firstLine="0"/>
-        <w:jc w:val="left"/>
-      </w:pPr>
-      <w:r>
-        <w:rPr>
-          <w:rFonts w:ascii="Times New Roman" w:hAnsi="Times New Roman" w:eastAsia="Times New Roman"/>
-          <w:b w:val="0"/>
-          <w:i w:val="0"/>
-          <w:sz w:val="23"/>
-        </w:rPr>
-        <w:t>The incremental value of this analysis is its description and criticism of a particular first-hospitalisation series, rather than a new estimate of physiological benefit. The close prior studies mean that adding clinical covariates or later follow-up alone would not establish novelty. A stronger clinical contribution would require measurements and a design that distinguish explanations left unresolved by those studies.</w:t>
-      </w:r>
-    </w:p>
-    <w:p>
-      <w:pPr>
-        <w:spacing w:after="160" w:before="0" w:line="240" w:lineRule="auto"/>
-        <w:ind w:firstLine="0"/>
-        <w:jc w:val="left"/>
-      </w:pPr>
-      <w:r>
-        <w:rPr>
-          <w:rFonts w:ascii="Times New Roman" w:hAnsi="Times New Roman" w:eastAsia="Times New Roman"/>
-          <w:b w:val="0"/>
-          <w:i w:val="0"/>
-          <w:sz w:val="23"/>
-        </w:rPr>
-        <w:t>The next discriminating analysis should separate change in recorded burden from change in weather association. A common full-series model with exposure-by-period terms could estimate the latter, provided calendar structure and exposure support are handled consistently. Testing physiological explanations would additionally require repeated clinical measurements, treatment and attendance information, and explicit attention to who was tested. Lower values among tested attenders could reflect selection rather than improved health. Confirmation of event rules and denominators has priority over adding further speculative mechanisms.</w:t>
-      </w:r>
-    </w:p>
-    <w:p>
-      <w:pPr>
-        <w:pStyle w:val="Heading1"/>
-        <w:keepNext/>
-        <w:keepLines/>
-        <w:spacing w:after="120" w:before="240" w:line="240" w:lineRule="auto"/>
-        <w:ind w:firstLine="0"/>
-        <w:jc w:val="left"/>
-      </w:pPr>
-      <w:r>
-        <w:rPr>
-          <w:rFonts w:ascii="Times New Roman" w:hAnsi="Times New Roman" w:eastAsia="Times New Roman"/>
-          <w:b/>
-          <w:i w:val="0"/>
-          <w:sz w:val="27"/>
-        </w:rPr>
-        <w:t>Conclusion</w:t>
-      </w:r>
-    </w:p>
-    <w:p>
-      <w:pPr>
-        <w:spacing w:after="160" w:before="0" w:line="240" w:lineRule="auto"/>
-        <w:ind w:firstLine="0"/>
-        <w:jc w:val="left"/>
-      </w:pPr>
-      <w:r>
-        <w:rPr>
-          <w:rFonts w:ascii="Times New Roman" w:hAnsi="Times New Roman" w:eastAsia="Times New Roman"/>
-          <w:b w:val="0"/>
-          <w:i w:val="0"/>
-          <w:sz w:val="23"/>
-        </w:rPr>
-        <w:t>First recorded hospitalisation counts after CHD or HF diagnosis declined before 2020, dipped further in 2020 and recovered towards 2019 levels by 2023. Lower cold-day coefficients in a full-window fit were an exploratory sensitivity finding, not evidence that cold became protective or of physiological improvement after COVID-19. The data support a study of recorded burden and its ascertainment. They leave physiological change, care disruption and respiratory co-exposure as competing explanations requiring different evidence.</w:t>
-      </w:r>
-    </w:p>
-    <w:p>
-      <w:pPr>
-        <w:pStyle w:val="Heading1"/>
-        <w:keepNext/>
-        <w:keepLines/>
-        <w:spacing w:after="120" w:before="240" w:line="240" w:lineRule="auto"/>
-        <w:ind w:firstLine="0"/>
-        <w:jc w:val="left"/>
-      </w:pPr>
-      <w:r>
-        <w:rPr>
-          <w:rFonts w:ascii="Times New Roman" w:hAnsi="Times New Roman" w:eastAsia="Times New Roman"/>
-          <w:b/>
-          <w:i w:val="0"/>
-          <w:sz w:val="27"/>
-        </w:rPr>
-        <w:t>Data and code availability</w:t>
-      </w:r>
-    </w:p>
-    <w:p>
-      <w:pPr>
-        <w:spacing w:after="160" w:before="0" w:line="240" w:lineRule="auto"/>
-        <w:ind w:firstLine="0"/>
-        <w:jc w:val="left"/>
-      </w:pPr>
-      <w:r>
-        <w:rPr>
-          <w:rFonts w:ascii="Times New Roman" w:hAnsi="Times New Roman" w:eastAsia="Times New Roman"/>
-          <w:b w:val="0"/>
-          <w:i w:val="0"/>
-          <w:sz w:val="23"/>
-        </w:rPr>
-        <w:t>Individual records and the underlying monthly hospitalisation files are not reproduced. Analysis code and aggregate descriptive and model summaries are available in the Laidlaw Heat Project repository at https://github.com/bobshenruililin/Laidlaw-Heat-Project. Environmental sources are the Hong Kong Observatory, Environmental Protection Department and Centre for Health Protection. The aggregate summaries permit verification of the reported tables; the underlying health data are governed by the data custodian.</w:t>
+        <w:t>The analysis and figure code is available at https://github.com/bobshenruililin/Laidlaw-Heat-Project. The completed analysis summaries are distinguished from prospective scripts that have not generated results for this article. Figure source tables retain the reported quantities and provenance needed to reproduce the displays from released summaries.</w:t>
       </w:r>
     </w:p>
     <w:p>
@@ -3773,7 +1472,7 @@
           <w:i w:val="0"/>
           <w:sz w:val="21"/>
         </w:rPr>
-        <w:t>3. Goggins WB, Chan EYY. A study of the short-term associations between hospital admissions and mortality from heart failure and meteorological variables in Hong Kong. Int J Cardiol. 2017;228:537–542. doi:10.1016/j.ijcard.2016.11.106</w:t>
+        <w:t>3. Youn HM, Hu Z, Park YS, et al. Indirect Impact of the COVID-19 Pandemic on All-Cause Mortality and Cardiovascular Disease Among People With Diabetes Mellitus From Korea and Hong Kong: An Interrupted Time Series Analysis. Health Sci Rep. 2025;8:e71291. doi:10.1002/hsr2.71291</w:t>
       </w:r>
     </w:p>
     <w:p>
@@ -3789,7 +1488,7 @@
           <w:i w:val="0"/>
           <w:sz w:val="21"/>
         </w:rPr>
-        <w:t>4. Guo YT, Chan KH, Qiu H, Wong ELY, Ho KF. The risk of hospitalization associated with hot nights and excess nighttime heat in a subtropical metropolis: a time-series study in Hong Kong, 2000–2019. Lancet Reg Health West Pac. 2024;51:101168. doi:10.1016/j.lanwpc.2024.101168</w:t>
+        <w:t>4. Hu Z, Yau YK, Quan J, et al. Indirect effect of the COVID-19 pandemic on cardiovascular diseases incidence, mortality, and healthcare use among patients with hypertension but without SARS-CoV-2 infection in Hong Kong: an interrupted time series analysis. Hypertens Res. 2025;48:2197–2208. doi:10.1038/s41440-025-02230-y</w:t>
       </w:r>
     </w:p>
     <w:p>
@@ -3805,7 +1504,7 @@
           <w:i w:val="0"/>
           <w:sz w:val="21"/>
         </w:rPr>
-        <w:t>5. Newey WK, West KD. A simple, positive semi-definite, heteroskedasticity and autocorrelation consistent covariance matrix. Econometrica. 1987;55:703–708. doi:10.2307/1913610</w:t>
+        <w:t>5. Yau YK, Li M, Quan J, et al. Association of Reduction in Continuity of Care During COVID-19 Pandemic With Cardiovascular Diseases, Kidney Failure and All-Cause Mortality for People With Diabetes: A Cohort Study in Hong Kong. Diabetes Obes Metab. 2026;28:8016–8024. doi:10.1111/dom.70984</w:t>
       </w:r>
     </w:p>
     <w:p>
@@ -3821,7 +1520,7 @@
           <w:i w:val="0"/>
           <w:sz w:val="21"/>
         </w:rPr>
-        <w:t>6. Benjamini Y, Hochberg Y. Controlling the false discovery rate: a practical and powerful approach to multiple testing. J R Stat Soc Series B. 1995;57:289–300. doi:10.1111/j.2517-6161.1995.tb02031.x</w:t>
+        <w:t>6. Huang H, Su HL, Huang CH, Lin YH. Retrospective Study on the Impact of COVID-19 Lockdown on Patients with Type 2 Diabetes in Northern Taiwan. Diabetes Metab Syndr Obes. 2023;16:2539–2547. doi:10.2147/DMSO.S422617</w:t>
       </w:r>
     </w:p>
     <w:p>
@@ -3837,7 +1536,7 @@
           <w:i w:val="0"/>
           <w:sz w:val="21"/>
         </w:rPr>
-        <w:t>7. Huang H, Su HL, Huang CH, Lin YH. Retrospective Study on the Impact of COVID-19 Lockdown on Patients with Type 2 Diabetes in Northern Taiwan. Diabetes Metab Syndr Obes. 2023;16:2539–2547. doi:10.2147/DMSO.S422617</w:t>
+        <w:t>7. Ohkuma K, Sawada M, Aihara M, et al. Impact of the COVID-19 pandemic on the glycemic control in people with diabetes mellitus: A retrospective cohort study. J Diabetes Investig. 2023;14:985–993. doi:10.1111/jdi.14021</w:t>
       </w:r>
     </w:p>
     <w:p>
@@ -3853,7 +1552,7 @@
           <w:i w:val="0"/>
           <w:sz w:val="21"/>
         </w:rPr>
-        <w:t>8. Ohkuma K, Sawada M, Aihara M, et al. Impact of the COVID-19 pandemic on the glycemic control in people with diabetes mellitus: A retrospective cohort study. J Diabetes Investig. 2023;14:985–993. doi:10.1111/jdi.14021</w:t>
+        <w:t>8. Wong CM, Lai KPL, Luk MHM, et al. Impact of COVID-19 pandemic on glycaemic and blood pressure control among patients with type 2 diabetes in primary care in Hong Kong. BMC Prim Care. 2025;26:182. doi:10.1186/s12875-025-02893-z</w:t>
       </w:r>
     </w:p>
     <w:p>
@@ -3869,7 +1568,7 @@
           <w:i w:val="0"/>
           <w:sz w:val="21"/>
         </w:rPr>
-        <w:t>9. Wong CM, Lai KPL, Luk MHM, et al. Impact of COVID-19 pandemic on glycaemic and blood pressure control among patients with type 2 diabetes in primary care in Hong Kong. BMC Prim Care. 2025;26:182. doi:10.1186/s12875-025-02893-z</w:t>
+        <w:t>9. Lui DTW, Lee CH, Wong Y, et al. A Prospective 1-Year Follow-up of Glycemic Status and C-Peptide Levels of COVID-19 Survivors with Dysglycemia in Acute COVID-19 Infection. Diabetes Metab J. 2024;48:763–770. doi:10.4093/dmj.2023.0175</w:t>
       </w:r>
     </w:p>
     <w:p>
@@ -3885,7 +1584,7 @@
           <w:i w:val="0"/>
           <w:sz w:val="21"/>
         </w:rPr>
-        <w:t>10. Lui DTW, Lee CH, Wong Y, et al. A Prospective 1-Year Follow-up of Glycemic Status and C-Peptide Levels of COVID-19 Survivors with Dysglycemia in Acute COVID-19 Infection. Diabetes Metab J. 2024;48:763–770. doi:10.4093/dmj.2023.0175</w:t>
+        <w:t>10. Cowling BJ, Ali ST, Ng TWY, et al. Impact assessment of non-pharmaceutical interventions against coronavirus disease 2019 and influenza in Hong Kong: an observational study. Lancet Public Health. 2020;5:e279–e288. doi:10.1016/S2468-2667(20)30090-6</w:t>
       </w:r>
     </w:p>
     <w:p>
@@ -3901,7 +1600,7 @@
           <w:i w:val="0"/>
           <w:sz w:val="21"/>
         </w:rPr>
-        <w:t>11. Cowling BJ, Ali ST, Ng TWY, et al. Impact assessment of non-pharmaceutical interventions against coronavirus disease 2019 and influenza in Hong Kong: an observational study. Lancet Public Health. 2020;5:e279–e288. doi:10.1016/S2468-2667(20)30090-6</w:t>
+        <w:t>11. Kwong JC, Schwartz KL, Campitelli MA, et al. Acute Myocardial Infarction after Laboratory-Confirmed Influenza Infection. N Engl J Med. 2018;378:345–353. doi:10.1056/NEJMoa1702090</w:t>
       </w:r>
     </w:p>
     <w:p>
@@ -3917,7 +1616,7 @@
           <w:i w:val="0"/>
           <w:sz w:val="21"/>
         </w:rPr>
-        <w:t>12. Kwong JC, Schwartz KL, Campitelli MA, et al. Acute Myocardial Infarction after Laboratory-Confirmed Influenza Infection. N Engl J Med. 2018;378:345–353. doi:10.1056/NEJMoa1702090</w:t>
+        <w:t>12. Kytömaa S, Hegde S, Claggett B, et al. Association of Influenza-like Illness Activity With Hospitalizations for Heart Failure: The Atherosclerosis Risk in Communities Study. JAMA Cardiol. 2019;4:363–369. doi:10.1001/jamacardio.2019.0549</w:t>
       </w:r>
     </w:p>
     <w:p>
@@ -3933,7 +1632,7 @@
           <w:i w:val="0"/>
           <w:sz w:val="21"/>
         </w:rPr>
-        <w:t>13. Kytömaa S, Hegde S, Claggett B, et al. Association of Influenza-like Illness Activity With Hospitalizations for Heart Failure: The Atherosclerosis Risk in Communities Study. JAMA Cardiol. 2019;4:363–369. doi:10.1001/jamacardio.2019.0549</w:t>
+        <w:t>13. Wan EYF, Mok AHY, Yan VKC, et al. Association between BNT162b2 and CoronaVac vaccination and risk of CVD and mortality after COVID-19 infection: A population-based cohort study. Cell Rep Med. 2023;4:101195. doi:10.1016/j.xcrm.2023.101195</w:t>
       </w:r>
     </w:p>
     <w:p>
@@ -3949,7 +1648,7 @@
           <w:i w:val="0"/>
           <w:sz w:val="21"/>
         </w:rPr>
-        <w:t>14. Wan EYF, Mok AHY, Yan VKC, et al. Association between BNT162b2 and CoronaVac vaccination and risk of CVD and mortality after COVID-19 infection: A population-based cohort study. Cell Rep Med. 2023;4:101195. doi:10.1016/j.xcrm.2023.101195</w:t>
+        <w:t>14. Goggins WB, Chan EYY. A study of the short-term associations between hospital admissions and mortality from heart failure and meteorological variables in Hong Kong. Int J Cardiol. 2017;228:537–542. doi:10.1016/j.ijcard.2016.11.106</w:t>
       </w:r>
     </w:p>
     <w:p>
@@ -3965,7 +1664,7 @@
           <w:i w:val="0"/>
           <w:sz w:val="21"/>
         </w:rPr>
-        <w:t>15. Youn HM, Hu Z, Park YS, et al. Indirect Impact of the COVID-19 Pandemic on All-Cause Mortality and Cardiovascular Disease Among People With Diabetes Mellitus From Korea and Hong Kong: An Interrupted Time Series Analysis. Health Sci Rep. 2025;8:e71291. doi:10.1002/hsr2.71291</w:t>
+        <w:t>15. Guo YT, Chan KH, Qiu H, Wong ELY, Ho KF. The risk of hospitalization associated with hot nights and excess nighttime heat in a subtropical metropolis: a time-series study in Hong Kong, 2000–2019. Lancet Reg Health West Pac. 2024;51:101168. doi:10.1016/j.lanwpc.2024.101168</w:t>
       </w:r>
     </w:p>
     <w:p>
@@ -3981,7 +1680,7 @@
           <w:i w:val="0"/>
           <w:sz w:val="21"/>
         </w:rPr>
-        <w:t>16. Hu Z, Yau YK, Quan J, et al. Indirect effect of the COVID-19 pandemic on cardiovascular diseases incidence, mortality, and healthcare use among patients with hypertension but without SARS-CoV-2 infection in Hong Kong: an interrupted time series analysis. Hypertens Res. 2025;48:2197–2208. doi:10.1038/s41440-025-02230-y</w:t>
+        <w:t>16. Newey WK, West KD. A simple, positive semi-definite, heteroskedasticity and autocorrelation consistent covariance matrix. Econometrica. 1987;55:703–708. doi:10.2307/1913610</w:t>
       </w:r>
     </w:p>
     <w:p>
@@ -3997,14 +1696,14 @@
           <w:i w:val="0"/>
           <w:sz w:val="21"/>
         </w:rPr>
-        <w:t>17. Yau YK, Li M, Quan J, et al. Association of Reduction in Continuity of Care During COVID-19 Pandemic With Cardiovascular Diseases, Kidney Failure and All-Cause Mortality for People With Diabetes: A Cohort Study in Hong Kong. Diabetes Obes Metab. 2026;28:8016–8024. doi:10.1111/dom.70984</w:t>
+        <w:t>17. Benjamini Y, Hochberg Y. Controlling the false discovery rate: a practical and powerful approach to multiple testing. J R Stat Soc Series B. 1995;57:289–300. doi:10.1111/j.2517-6161.1995.tb02031.x</w:t>
       </w:r>
     </w:p>
     <w:sectPr>
       <w:headerReference w:type="default" r:id="rId9"/>
       <w:footerReference w:type="default" r:id="rId10"/>
       <w:pgSz w:w="11906" w:h="16838"/>
-      <w:pgMar w:top="1440" w:right="1440" w:bottom="1440" w:left="1440" w:header="709" w:footer="709" w:gutter="0"/>
+      <w:pgMar w:top="1440" w:right="1080" w:bottom="1440" w:left="1080" w:header="709" w:footer="709" w:gutter="0"/>
       <w:cols w:space="720"/>
       <w:docGrid w:linePitch="360"/>
     </w:sectPr>

</xml_diff>

<commit_message>
Sharpen frozen manuscript argument and audit publication figures
</commit_message>
<xml_diff>
--- a/manuscript/covid_period/Heat_CVD_Manuscript_covid_period.docx
+++ b/manuscript/covid_period/Heat_CVD_Manuscript_covid_period.docx
@@ -15,7 +15,7 @@
           <w:i w:val="0"/>
           <w:sz w:val="32"/>
         </w:rPr>
-        <w:t>Recorded first hospitalisations after cardiovascular diagnosis before and during COVID in Hong Kong</w:t>
+        <w:t>Recorded first hospitalisations after cardiovascular diagnosis before and during COVID-19 in Hong Kong</w:t>
       </w:r>
     </w:p>
     <w:p>
@@ -75,7 +75,7 @@
           <w:i w:val="0"/>
           <w:sz w:val="23"/>
         </w:rPr>
-        <w:t>Fewer recorded hospitalisations during a health-system disruption may reflect changes in disease, care use or ascertainment. We examined first recorded hospitalisations after coronary heart disease (CHD) or heart failure (HF) diagnosis in Hong Kong among people diagnosed with type 2 diabetes and/or hypertension during 2013–2023. Two monthly series comprised 156,156 CHD-associated and 29,681 HF-associated stays. Admission cause and eligible person-time were unavailable. Annual counts declined before 2020, fell further in 2020 and recovered towards 2019 levels by 2023. Compared with 2019, CHD and HF counts were respectively 17.4% and 16.2% lower in 2020, and 0.6% and 2.0% lower in 2023. Twelve exploratory negative-binomial weather models used calendar-month, time-trend and month-length controls. All full-window lag-six false-discovery-adjusted q-values exceeded 0.19. Selected associations depended on calendar specification and uncertainty construction. Nested pre-2020 and full-series fits did not provide independent period comparisons. The recorded trajectory therefore places the 2020 fall within a preceding decline and subsequent recovery. These observations cannot distinguish physiological improvement from altered care or recording, and the weather models do not exclude a weather contribution. Interpretation of falling first-hospitalisation counts requires explicit event definitions and the eligible population contributing to them.</w:t>
+        <w:t>Interpreting a pandemic-era fall in hospitalisations requires understanding the trajectory that preceded it and the population contributing events. We examined first recorded hospitalisations after coronary heart disease (CHD) or heart failure (HF) diagnosis in Hong Kong among people diagnosed with type 2 diabetes and/or hypertension during 2013–2023. The two monthly series contained 156,156 CHD-associated and 29,681 HF-associated stays. Annual counts declined before 2020, fell further in 2020 and recovered towards 2019 levels by 2023. Compared with 2019, CHD and HF counts were respectively 17.4% and 16.2% lower in 2020, and 0.6% and 2.0% lower in 2023. Twelve exploratory negative-binomial models assessed weather associations with calendar and month-length controls. All twelve lag-six false-discovery-adjusted q-values exceeded 0.19; selected associations were sensitive to calendar specification and uncertainty construction. Overlapping analysis windows did not permit a direct period comparison. Admission cause and eligible person-time were unavailable, preventing interpretation as disease-specific incidence. The 2020 fall thus occurred within a longer decline, followed by recovery in recorded burden. These counts cannot distinguish physiological improvement from altered care or recording, and the weather models do not exclude a weather contribution. The preceding trajectory and event construction are essential to interpreting lower hospital use during a health-system disruption.</w:t>
       </w:r>
     </w:p>
     <w:p>
@@ -135,7 +135,7 @@
           <w:i w:val="0"/>
           <w:sz w:val="23"/>
         </w:rPr>
-        <w:t>Hospitalisation counts are often used to describe population health during a public health emergency. Their interpretation depends on whether disease occurrence, access to care and event recording remain comparable. Hong Kong studies reported fewer hospitalisations and emergency-department visits during COVID-19 alongside higher mortality [1,2]. A reduction in recorded hospital use can therefore coexist with worse outcomes. For first hospitalisations, the number of people eligible to contribute an event also matters: entry, prior diagnoses, earlier events and departures from observation can change the count without an equivalent change in individual risk.</w:t>
+        <w:t>Hospitalisation counts are often used to describe population health during a public health emergency. Their interpretation depends on whether disease occurrence, access to care and event recording remain comparable. Hong Kong studies reported fewer hospitalisations and emergency-department visits during COVID-19 alongside higher mortality [1,2]. A reduction in recorded hospital use can therefore coexist with worse outcomes. For first hospitalisations, the number of people eligible to contribute an event also matters. Entry, prior diagnoses, earlier events and departures from observation can change counts without equivalent changes in individual risk.</w:t>
       </w:r>
     </w:p>
     <w:p>
@@ -151,7 +151,7 @@
           <w:i w:val="0"/>
           <w:sz w:val="23"/>
         </w:rPr>
-        <w:t>Closely related studies have examined cardiovascular outcomes, mortality and healthcare use among people with diabetes in Hong Kong and Korea [3] and among Hong Kong patients with hypertension [4]. The hypertension study also assessed blood-pressure control. A subsequent Hong Kong cohort related reduced continuity of diabetes care to later cardiovascular and other outcomes [5]. These studies supply clinical or service information that a monthly count series does not contain. A longer series or a different recorded endpoint is not sufficient grounds for claiming a new explanation of the pandemic's cardiovascular effects.</w:t>
+        <w:t>Closely related studies have examined cardiovascular outcomes, mortality and healthcare use among people with diabetes in Hong Kong and Korea [3] and among Hong Kong patients with hypertension [4]. The hypertension study also assessed blood-pressure control. A subsequent Hong Kong cohort related reduced continuity of diabetes care to later cardiovascular and other outcomes [5]. These studies establish the need to consider clinical outcomes alongside service use. A complementary descriptive question concerns the longer trajectory: how did recorded first hospitalisations evolve through 2023 relative to the decline preceding 2020?</w:t>
       </w:r>
     </w:p>
     <w:p>
@@ -167,7 +167,7 @@
           <w:i w:val="0"/>
           <w:sz w:val="23"/>
         </w:rPr>
-        <w:t>We examined two territory-wide monthly series of first recorded hospitalisations after CHD or HF diagnosis among people diagnosed with type 2 diabetes and/or hypertension during 2013–2023. The descriptive objective was to locate the pandemic-era trajectory within the earlier pattern of recorded counts. An existing weather analysis suggested smaller cold-day coefficients when later years were included. We assessed that observation through the complete weather panel and its calendar and uncertainty sensitivities. The count trajectory is the empirical focus; the weather analyses establish how dependent the associated interpretations are on the fitted specification.</w:t>
+        <w:t>We examined two territory-wide monthly series of first recorded hospitalisations after CHD or HF diagnosis among people diagnosed with type 2 diabetes and/or hypertension during 2013–2023. We described annual counts and their relation to the late pre-pandemic level. A secondary question concerned the stability of weather associations previously interpreted as changing when later years were included. We examined the complete exploratory panel and its calendar and uncertainty sensitivities. These models assess the dependence of those associations on specification; they do not explain the annual trajectory.</w:t>
       </w:r>
     </w:p>
     <w:p>
@@ -253,7 +253,7 @@
           <w:i w:val="0"/>
           <w:sz w:val="23"/>
         </w:rPr>
-        <w:t>Monthly means were 1,315.3 CHD events and 252.0 HF events in 2013–2019, 926.3 and 172.6 in 2020–2022, and 1,026.9 and 191.3 in 2023 (Supplementary Table S2). These periods do not overlap, but their averages include the preceding decline. An average over the whole pre-2020 period is consequently not a counterfactual for what would have occurred in 2020 without the pandemic.</w:t>
+        <w:t>Disjoint period means are provided in Supplementary Table S2. The average over all pre-2020 years includes the preceding decline and is not a counterfactual for 2020 without the pandemic.</w:t>
       </w:r>
     </w:p>
     <w:p>
@@ -271,7 +271,7 @@
           <w:i/>
           <w:sz w:val="21"/>
         </w:rPr>
-        <w:t>Figure 1. Annual recorded first hospitalisations after cardiovascular diagnosis, 2013–2023. Stays after coronary heart disease (CHD) and heart failure (HF) diagnosis are shown separately on zero-origin count axes with different vertical scales. Each point is an observed annual total, without adjustment for eligible population or secular trend. Shading identifies 2020–2023 calendar years and does not denote an estimated treatment effect. Counts fell before 2020, reached a further trough in 2020 and approached 2019 totals by 2023. The endpoint is the first recorded hospitalisation after a relevant diagnosis, with admission cause unavailable. All 22 totals are retained in Supplementary Table S1.</w:t>
+        <w:t>Figure 1. Annual recorded first hospitalisations after cardiovascular diagnosis, 2013–2023. Stays after coronary heart disease (CHD) and heart failure (HF) diagnosis are shown separately on zero-origin count axes with different vertical scales. Each point is an observed annual total, without adjustment for eligible population or secular trend. Shading identifies 2020–2023 calendar years and does not denote an estimated treatment effect. The endpoint is the first recorded hospitalisation after a relevant diagnosis, with admission cause unavailable. All 22 totals are retained in Supplementary Table S1.</w:t>
       </w:r>
     </w:p>
     <w:p>
@@ -332,7 +332,7 @@
           <w:i w:val="0"/>
           <w:sz w:val="23"/>
         </w:rPr>
-        <w:t>The complete weather panel does not resolve the trajectory</w:t>
+        <w:t>Weather associations vary across exposures and analysis windows</w:t>
       </w:r>
     </w:p>
     <w:p>
@@ -348,7 +348,7 @@
           <w:i w:val="0"/>
           <w:sz w:val="23"/>
         </w:rPr>
-        <w:t>Full-window models gave small inverse point estimates for continuous temperature in both outcomes (Fig. 2; Supplementary Table S3). For example, the count ratio per 1°C higher monthly mean temperature was 0.993 (95% CI 0.976–1.010) for CHD and 0.974 (0.947–1.002) for HF. Official-day exposures gave a different pattern. Per five additional cold days, the CHD ratio was 0.995 (0.949–1.043) and the HF ratio was 1.073 (1.006–1.144). CHD hot nights gave a ratio of 1.022 (1.002–1.042). These are conditional ecological count associations, rather than changes in eligible-population incidence.</w:t>
+        <w:t>Full-window models gave small inverse point estimates for continuous temperature in both outcomes (Fig. 2; Supplementary Table S3). The count ratio per 1°C higher monthly mean temperature was 0.993 (95% confidence interval (CI) 0.976–1.010) for CHD. It was 0.974 (0.947–1.002) for HF. Official-day exposures gave a different pattern. Per five additional cold days, the CHD ratio was 0.995 (0.949–1.043) and the HF ratio was 1.073 (1.006–1.144). CHD hot nights gave a ratio of 1.022 (1.002–1.042). These are conditional ecological count associations, rather than changes in eligible-population incidence.</w:t>
       </w:r>
     </w:p>
     <w:p>
@@ -364,7 +364,7 @@
           <w:i w:val="0"/>
           <w:sz w:val="23"/>
         </w:rPr>
-        <w:t>The smallest Benjamini–Hochberg-adjusted q-value in the twelve-fit lag-six family was 0.192; all twelve exceeded 0.19. The complete family therefore supplies no multiplicity-protected thermal finding. This result does not establish equivalence to no association or exclude a weather contribution to the count trajectory. The continuous-temperature and official-day models also represent different exposure contrasts, so their numerical magnitudes cannot be compared as interchangeable measures of thermal response.</w:t>
+        <w:t>The smallest Benjamini–Hochberg-adjusted q-value in the twelve-fit lag-six family was 0.192; all twelve exceeded 0.19. No association met a 5% false-discovery threshold. This does not establish equivalence to no association or exclude a weather contribution to the count trajectory. The continuous-temperature and official-day models also represent different exposure contrasts, so their numerical magnitudes cannot be compared as interchangeable measures of thermal response.</w:t>
       </w:r>
     </w:p>
     <w:p>
@@ -380,7 +380,7 @@
           <w:i w:val="0"/>
           <w:sz w:val="23"/>
         </w:rPr>
-        <w:t>The pre-2020 fits were different again. Cold-day ratios were 1.036 (1.007–1.067) for CHD and 1.113 (1.053–1.176) for HF, compared with 0.995 and 1.073 in the full window. Nested monthly-mean-temperature ratios were 0.980 (0.970–0.990) and 0.945 (0.927–0.963), respectively. Complete official-day results appear in Supplementary Table S4 and Fig. S2. The 84 pre-2020 months are contained within the full 132 months, and the spline basis was reconstructed for each fit. Their difference is not an estimated pre/post effect. The smaller full-window cold-day coefficients are not evidence that cold became protective.</w:t>
+        <w:t>Pre-2020 cold-day ratios were 1.036 (1.007–1.067) for CHD and 1.113 (1.053–1.176) for HF, exceeding their full-window point estimates. The 84 pre-2020 months are contained within the full 132 months, and each fit used a reconstructed spline basis (Supplementary Table S4; Fig. S2). Their difference is not an estimated pre/post effect. The smaller full-window cold-day coefficients are not evidence that cold became protective.</w:t>
       </w:r>
     </w:p>
     <w:p>
@@ -398,7 +398,7 @@
           <w:i/>
           <w:sz w:val="21"/>
         </w:rPr>
-        <w:t>Figure 2. Complete full-window exploratory weather associations. All twelve coronary heart disease (CHD) and heart failure (HF) negative-binomial models for January 2013–December 2023 are displayed with Newey–West lag-six 95% confidence intervals. Continuous exposures are scaled per 1°C; official-day exposures are scaled per five additional days, without a consecutive-day requirement. Separate panels distinguish outcomes and reporting units. Every model uses calendar-month indicators, a four-degree-of-freedom natural time spline and a days-in-month offset. The reference line denotes a count ratio of one. BH q-values apply jointly to the twelve lag-six Wald tests; all exceed 0.19. Reported estimates, p-values and q-values are in Supplementary Table S3; full-precision values are retained in the source CSV. These are recorded-count associations, not cohort incidence ratios.</w:t>
+        <w:t>Figure 2. Complete full-window exploratory weather associations. All twelve coronary heart disease (CHD) and heart failure (HF) negative-binomial models for January 2013–December 2023 are displayed with nominal pointwise Newey–West lag-six 95% confidence intervals. Continuous exposures are scaled per 1°C; official-day exposures are scaled per five additional days, without a consecutive-day requirement. Separate panels distinguish outcomes and reporting units. Every model uses calendar-month indicators, a four-degree-of-freedom natural time spline and a days-in-month offset. The reference line denotes a count ratio of one. BH q-values apply jointly to the twelve two-sided lag-six Wald tests; all exceed 0.19. The intervals themselves are not multiplicity-adjusted. The full window spans 132 calendar months. Reported estimates, p-values and q-values are in Supplementary Table S3; full-precision values are retained in the source CSV. These are recorded-count associations, not cohort incidence ratios.</w:t>
       </w:r>
     </w:p>
     <w:p>
@@ -459,7 +459,7 @@
           <w:i w:val="0"/>
           <w:sz w:val="23"/>
         </w:rPr>
-        <w:t>Calendar control and covariance alter the interpretation</w:t>
+        <w:t>Calendar control and covariance affect magnitude and precision</w:t>
       </w:r>
     </w:p>
     <w:p>
@@ -475,7 +475,7 @@
           <w:i w:val="0"/>
           <w:sz w:val="23"/>
         </w:rPr>
-        <w:t>The full-window HF cold-day interval included one under an eight-degree-of-freedom spline, year indicators, or omission of the first twelve or twenty-four months (Fig. 3; Supplementary Table S5). Calendar adjustments therefore affected whether the interval excluded one. Omitting the first months also changed the observations contributing to the fit. COVID-phase intercepts gave a CHD hot-night ratio of 1.013 (0.994–1.033) and an HF cold-day ratio of 1.074 (1.006–1.145). Those intercepts were adjustments within the full series, rather than an independently estimated later period.</w:t>
+        <w:t>For HF cold days, the count ratio was 1.062 (0.994–1.135) with an eight-degree-of-freedom spline and 1.043 (0.965–1.127) after omitting the first twenty-four months. Both intervals included one (Fig. 3; Supplementary Table S5). These checks varied temporal control or the observations contributing to the fit. COVID-phase intercepts gave a CHD hot-night ratio of 1.013 (0.994–1.033) and an HF cold-day ratio of 1.074 (1.006–1.145). Those intercepts adjusted the full series; they did not define an independently fitted later period.</w:t>
       </w:r>
     </w:p>
     <w:p>
@@ -491,7 +491,7 @@
           <w:i w:val="0"/>
           <w:sz w:val="23"/>
         </w:rPr>
-        <w:t>Uncertainty construction changed the interpretation of CHD hot nights while leaving the fitted coefficient unchanged. Its model-based interval was 0.995–1.049 and its HC1 interval 0.997–1.047, whereas the lag-six interval was 1.002–1.042. Pearson residual autocorrelation at lag one was 0.508 for this model. A narrower HAC interval is not itself evidence of an invalid covariance estimate: the sandwich covariance depends on regression-score autocovariances, not residual autocorrelation alone. Residual dependence nevertheless limits confidence in nominal finite-sample uncertainty. Complete intervals and released diagnostics are retained in Supplementary Tables S6 and S7.</w:t>
+        <w:t>Uncertainty construction changed the interpretation of CHD hot nights while leaving the fitted coefficient unchanged. Its model-based interval was 0.995–1.049 and its heteroskedasticity-consistent (HC1) interval 0.997–1.047, whereas the lag-six interval was 1.002–1.042. Lag-one Pearson residual autocorrelation was 0.508. This does not require wider heteroskedasticity- and autocorrelation-consistent (HAC) intervals, because the covariance also depends on regression scores. Finite-sample interval coverage was not calibrated. Complete intervals and released diagnostics are retained in Supplementary Tables S6 and S7.</w:t>
       </w:r>
     </w:p>
     <w:p>
@@ -509,7 +509,7 @@
           <w:i/>
           <w:sz w:val="21"/>
         </w:rPr>
-        <w:t>Figure 3. Calendar and uncertainty criticism of two historically discussed associations. Heart failure (HF) cold-day and coronary heart disease (CHD) hot-night ratios are displayed per five official days. Baseline fits cover January 2013–December 2023. Upper panels retain the baseline and six fixed calendar/start-window checks with Newey–West lag-six 95% intervals. Lower panels retain the same baseline coefficient under model-based, HC1, lag-three and lag-six uncertainty constructions. These selected examples reveal specification dependence; they are not a new confirmatory family. Panel ranges differ, and interval overlap or crossing one is not a test of a difference between specifications. The complete calendar panel, including phase-intercept adjustment, and all 48 baseline intervals remain in Supplementary Tables S5 and S6.</w:t>
+        <w:t>Figure 3. Diagnostic examples of calendar and uncertainty sensitivity. Heart failure (HF) cold-day and coronary heart disease (CHD) hot-night ratios are displayed per five official days. Baseline fits cover January 2013–December 2023. Upper panels retain the baseline and six fixed calendar/start-window checks with nominal pointwise Newey–West lag-six 95% intervals. Windows span 132 months, or 120/108 months after the indicated omissions. Lower panels retain the same baseline coefficient under model-based, HC1, lag-three and lag-six uncertainty constructions. These selected examples reveal specification dependence; they are not a new confirmatory family. Panel ranges differ, and interval overlap or crossing one is not a test of a difference between specifications. The complete official-day calendar panel, including phase-intercept adjustment, and all 48 baseline intervals remain in Supplementary Tables S5 and S6.</w:t>
       </w:r>
     </w:p>
     <w:p>
@@ -586,7 +586,7 @@
           <w:i w:val="0"/>
           <w:sz w:val="23"/>
         </w:rPr>
-        <w:t>The observed first-hospitalisation trajectory comprises a decline before 2020, a further fall in 2020 and recovery towards 2019 counts by 2023. Placing these features in one series changes the descriptive comparison: the pandemic-era trough followed a substantial earlier reduction, and the subsequent increase approached the late pre-pandemic level. A comparison against the average of all preceding years would mix those changes with the earlier trend. The annual summaries locate the change in recorded burden, but do not estimate the additional effect of the pandemic.</w:t>
+        <w:t>The 2020 fall in recorded first hospitalisations occurred within a longer decline, followed by recovery towards 2019 counts. This temporal context changes the comparison relevant to interpreting the pandemic-era trough. A comparison with the average of all preceding years combines that trough with an earlier trend. The annual summaries establish the pattern of recorded burden, but do not estimate an additional pandemic effect or a change in cardiovascular health.</w:t>
       </w:r>
     </w:p>
     <w:p>
@@ -602,7 +602,7 @@
           <w:i w:val="0"/>
           <w:sz w:val="23"/>
         </w:rPr>
-        <w:t>The endpoint makes clinical interpretation particularly difficult. A first counted stay follows a diagnosis record, but its admission cause is unavailable. Its frequency depends on diagnosis recording, hospital contact and the people still eligible to contribute a first stay. The schematic in Supplementary Fig. S1 distinguishes those processes. It expresses plausible pathways, not effects estimated here. The early maximum does not prove a first-in-window recording artefact, and the later rebound does not rule out a changing eligible population. A changing count alone cannot determine which observation process changed.</w:t>
+        <w:t>The distinction follows from how an event enters the series. A counted stay requires a diagnosis record, hospital contact and eligibility to contribute a first event, with admission cause unavailable. Supplementary Fig. S1 separates these observation processes without assigning effects to them. The early maximum does not establish a first-in-window recording artefact, and the later rebound does not rule out changes in the eligible population. The clinical significance of the trajectory depends on whether the recorded event and the population contributing events remained comparable.</w:t>
       </w:r>
     </w:p>
     <w:p>
@@ -618,7 +618,7 @@
           <w:i w:val="0"/>
           <w:sz w:val="23"/>
         </w:rPr>
-        <w:t>Care disruption provides a plausible explanation for part of the 2020 fall. Local studies found reduced hospitalisation or emergency attendance alongside higher mortality [1,2]. Closely matched diabetes and hypertension studies examined cardiovascular outcomes together with healthcare use and mortality [3,4]; Hu and colleagues also reported blood-pressure control below pre-pandemic levels among measured patients [4]. These observations challenge a general interpretation of fewer recorded events as improved cardiovascular health. Their estimates cannot be transferred to this series because the endpoint and population contributing events differ.</w:t>
+        <w:t>Care disruption is consistent with local reports of reduced hospitalisation or emergency attendance alongside higher mortality [1,2]. Closely matched diabetes and hypertension studies examined cardiovascular outcomes together with healthcare use and mortality [3,4]. Hu and colleagues also reported blood-pressure control below pre-pandemic levels among measured patients [4]. These findings challenge an interpretation of fewer recorded events as generally improved health. Linked evidence also requires careful population definition. In Yau and colleagues' cohort, patients attended repeatedly and remained alive and outcome-free at a June 2022 landmark [5]. Reduced continuity of care was associated with later CHD, HF and kidney failure; results for stroke and all-cause mortality were less conclusive. These selected populations and endpoints differ from the supplied first post-diagnosis stay, so their estimates cannot be transferred directly.</w:t>
       </w:r>
     </w:p>
     <w:p>
@@ -634,7 +634,7 @@
           <w:i w:val="0"/>
           <w:sz w:val="23"/>
         </w:rPr>
-        <w:t>Clinical measurements in other settings likewise provide no consistent physiological explanation. Retained diabetes outpatients in Taiwan showed lower HbA1c and fasting glucose after restrictions [6], whereas a Tokyo diabetes cohort showed small adverse changes in glycaemia and lipids [7]. A Hong Kong primary-care study found no evidence of an overall adjusted improvement in HbA1c or blood pressure [8]. Its sampling windows were February–March 2020 and February–March 2021, despite group labels referring to 2019 and 2020; it was neither a clean pre-pandemic comparison nor an individual longitudinal assessment. A small Hong Kong follow-up of COVID-19 survivors with acute dysglycaemia found worsening glycaemic status [9]. These studies preserve both favourable and adverse findings, but attendance, treatment and measurement timing restrict their interpretation.</w:t>
+        <w:t>Clinical measurements elsewhere were discordant. Retained diabetes outpatients in Taiwan showed lower HbA1c and fasting glucose [6], whereas a Tokyo diabetes cohort showed small adverse changes in glycaemia and lipids [7]. A Hong Kong primary-care study found no overall adjusted improvement in HbA1c or blood pressure [8]. Its samples came from February–March 2020 and February–March 2021, rather than a clean pre-pandemic comparison or individual longitudinal assessment. Follow-up of Hong Kong COVID-19 survivors with acute dysglycaemia found worsening glycaemic status [9]. Attendance, treatment and measurement timing restrict what these findings imply about population health. Better measurements among retained patients cannot establish improvement in everyone originally eligible.</w:t>
       </w:r>
     </w:p>
     <w:p>
@@ -650,7 +650,7 @@
           <w:i w:val="0"/>
           <w:sz w:val="23"/>
         </w:rPr>
-        <w:t>Respiratory infection and prevention remain contextual explanations. Hong Kong interventions coincided with reduced influenza transmission in early 2020 [10]. Influenza has been associated with acute myocardial infarction [11], and community influenza-like illness activity with HF hospitalisation [12]. Reduced winter respiratory triggers could therefore affect a cold-day association without changing the direct response to cold. Infection was not measured in this population, and the cited outcomes differ from the supplied first post-diagnosis stay. Vaccinated people with recorded SARS-CoV-2 infection in Hong Kong subsequently had lower observed cardiovascular event risk than unvaccinated infected people [13]. That observational comparison does not establish population-wide baseline improvement, and vaccination cannot account for the 2020 dip that preceded it.</w:t>
+        <w:t>Respiratory exposure offers another possible influence on weather associations. Hong Kong interventions coincided with reduced influenza transmission in early 2020 [10]. Influenza has been associated with acute myocardial infarction [11], and community influenza-like illness activity with HF hospitalisation [12]. Fewer winter respiratory triggers could alter a cold-day association without changing the direct physiological response to cold. Neither infection nor these cause-specific outcomes were measured here. Lower observed cardiovascular risk among vaccinated than unvaccinated people with recorded SARS-CoV-2 infection also concerns a selected population [13]. It does not establish population-wide baseline improvement or explain the 2020 fall before vaccination.</w:t>
       </w:r>
     </w:p>
     <w:p>
@@ -666,7 +666,7 @@
           <w:i w:val="0"/>
           <w:sz w:val="23"/>
         </w:rPr>
-        <w:t>The continuity-of-care study by Yau and colleagues illustrates both the value and the limits of linked clinical evidence [5]. Patients attended repeatedly and remained alive and free of the study outcomes at a June 2022 landmark. Reduced continuity was associated with later CHD, HF and kidney failure; results for stroke and all-cause mortality were less conclusive. Those findings concern a selected population and a different endpoint. Conditioning on continued attendance, survival or infection status can change who contributes to an analysis. Better measurements among retained patients do not establish better health in everyone originally eligible.</w:t>
+        <w:t>The weather models do not discriminate these explanations. Adding later years changes exposure support and calendar control as well as the observations fitted. Care use or recording correlated with weather could alter an ecological slope without changing physiological susceptibility; a stable slope would not establish stable susceptibility either. The complete family and sensitivity checks bound interpretation of the fitted associations. They provide neither a formal period-difference test nor a weather decomposition of annual burden. Non-rejection after multiplicity adjustment therefore does not show that weather was irrelevant.</w:t>
       </w:r>
     </w:p>
     <w:p>
@@ -682,39 +682,7 @@
           <w:i w:val="0"/>
           <w:sz w:val="23"/>
         </w:rPr>
-        <w:t>The weather findings have a similarly bounded role. Adding later years changed coefficients, but also changed exposure support and calendar control. A utilisation or recording change correlated with weather after adjustment could alter a fitted slope without changing physiological susceptibility. Conversely, a stable slope would not establish stable susceptibility. The full-window family, calendar checks and covariance comparisons show how sensitive the associated interpretations are. None supplies a formal period-difference test or a decomposition of the annual burden. Non-rejection after multiplicity adjustment is therefore not evidence that weather was irrelevant.</w:t>
-      </w:r>
-    </w:p>
-    <w:p>
-      <w:pPr>
-        <w:spacing w:after="160" w:before="0" w:line="240" w:lineRule="auto"/>
-        <w:ind w:firstLine="0"/>
-        <w:jc w:val="left"/>
-      </w:pPr>
-      <w:r>
-        <w:rPr>
-          <w:rFonts w:ascii="Times New Roman" w:hAnsi="Times New Roman" w:eastAsia="Times New Roman"/>
-          <w:b w:val="0"/>
-          <w:i w:val="0"/>
-          <w:sz w:val="23"/>
-        </w:rPr>
-        <w:t>Several limitations determine what this analysis can support. Cause-coded events, validated first-event rules, eligible person-time and linked deaths were unavailable; counts cannot be interpreted as disease-specific incidence. Clinical and treatment measurements were absent. Monthly aggregation obscures daily timing, while calendar modelling cannot separate all secular changes in diagnosis, care and recording. The thermal analyses were exploratory, the sensitivity models had no joint multiplicity adjustment, and the nominal uncertainty constructions were not certified by finite-sample calibration. These limitations constrain the contribution to description and model criticism of this particular recorded series.</w:t>
-      </w:r>
-    </w:p>
-    <w:p>
-      <w:pPr>
-        <w:spacing w:after="160" w:before="0" w:line="240" w:lineRule="auto"/>
-        <w:ind w:firstLine="0"/>
-        <w:jc w:val="left"/>
-      </w:pPr>
-      <w:r>
-        <w:rPr>
-          <w:rFonts w:ascii="Times New Roman" w:hAnsi="Times New Roman" w:eastAsia="Times New Roman"/>
-          <w:b w:val="0"/>
-          <w:i w:val="0"/>
-          <w:sz w:val="23"/>
-        </w:rPr>
-        <w:t>The data show a pandemic-era trough within a longer history of changing first-hospitalisation counts. They leave physiological change, care disruption, respiratory co-exposure and altered ascertainment unresolved, with several explanations able to coexist. The distinction between recorded stays and clinical incidence remains essential when interpreting lower hospital use during a health-system disruption.</w:t>
+        <w:t>The principal limits concern measurement and identification. Without validated event rules, eligible person-time and linked deaths, the trajectory cannot be interpreted as disease-specific incidence. Absent clinical and treatment measurements leave physiological change unresolved. Monthly aggregation obscures daily timing, while calendar modelling cannot separate changes in diagnosis, care and recording. The weather analyses were exploratory, sensitivity models had no joint multiplicity adjustment, and nominal interval coverage was uncalibrated. What remains established is the recorded trajectory: a preceding decline, a 2020 trough and recovery towards the late pre-pandemic level. Its interpretation as improved health requires evidence this series does not contain.</w:t>
       </w:r>
     </w:p>
     <w:p>
@@ -800,7 +768,7 @@
           <w:i w:val="0"/>
           <w:sz w:val="23"/>
         </w:rPr>
-        <w:t>Eligible person-time, linked death/exit information, age and sex strata, laboratory measurements, medication records and infection/vaccination histories were unavailable. The analytical unit was a monthly count, not an individual patient. The event totals describe recorded burden in the supplied construction; the same person could contribute to the separate CHD and HF series, with cross-outcome overlap unknown.</w:t>
+        <w:t>Eligible person-time, linked death/exit information, age and sex strata, laboratory measurements, medication records and infection/vaccination histories were unavailable. The analytical unit was a monthly count, not an individual patient; successive months were not independent replicates. The event totals describe recorded burden in the supplied construction; the same person could contribute to the separate CHD and HF series, with cross-outcome overlap unknown.</w:t>
       </w:r>
     </w:p>
     <w:p>
@@ -1303,7 +1271,7 @@
           <w:i w:val="0"/>
           <w:sz w:val="23"/>
         </w:rPr>
-        <w:t>Confidence intervals were reported from the model covariance, HC1 covariance and Newey–West covariance with three- and six-month lags [16]. The Newey–West calculations used no prewhitening and applied the finite-sample adjustment. Lag-six intervals were the common display convention. Benjamini–Hochberg adjustment covered the twelve full-window lag-six Wald p-values [17]. That family included both outcomes and all six exposures. Other covariance constructions, nested fits and calendar sensitivities remained exploratory and outside that adjusted family.</w:t>
+        <w:t>Nominal pointwise 95% confidence intervals used a normal-reference Wald construction from the model covariance, HC1 covariance and Newey–West covariance with three- and six-month lags [16]. The Newey–West calculations used no prewhitening and applied the finite-sample adjustment. Lag-six intervals were the common display convention. Benjamini–Hochberg adjustment covered the twelve full-window two-sided lag-six Wald p-values for zero exposure coefficient [17]. It did not adjust interval endpoints. That family included both outcomes and all six exposures. Other covariance constructions, nested fits and calendar sensitivities remained exploratory and outside that adjusted family.</w:t>
       </w:r>
     </w:p>
     <w:p>
@@ -1335,7 +1303,7 @@
           <w:i w:val="0"/>
           <w:sz w:val="23"/>
         </w:rPr>
-        <w:t>The displayed model-criticism examples were HF cold days and CHD hot nights, which had been discussed in the preceding exploratory analysis. Their selection for display did not establish a new inferential family. All official-day calendar results and all baseline uncertainty constructions were retained in the supplement. Released diagnostics comprised convergence, negative-binomial dispersion parameter, Pearson dispersion, residual autocorrelation and Ljung–Box statistics. Residual statistics were not treated as a substitute for score-based covariance assessment or simulation calibration. Analyses used R, MASS negative-binomial regression, natural splines and sandwich covariance estimators.</w:t>
+        <w:t>The displayed model-criticism examples were HF cold days and CHD hot nights, which had been discussed in the preceding exploratory analysis. Their selection for display did not establish a new inferential family. All official-day calendar results and all baseline uncertainty constructions were retained in the supplement. Released diagnostics comprised convergence, negative-binomial dispersion parameter, Pearson dispersion, residual autocorrelation and Ljung–Box statistics. Residual statistics were not treated as a substitute for score-based covariance assessment or simulation calibration. Analyses used R, MASS negative-binomial regression, natural splines and sandwich covariance estimators. Released metadata record window lengths, rather than verified fitted-observation counts; complete-case handling and the original package versions were not independently documented.</w:t>
       </w:r>
     </w:p>
     <w:p>

</xml_diff>